<commit_message>
Dossiê: Caio compartilha a tela; grafia Marco Murino confirmada
Co-Authored-By: Claude Opus 5.5 <noreply@anthropic.com>
Claude-Session: https://claude.ai/code/session_01EsMNgjuF6bLvLuQZ87HmRr
</commit_message>
<xml_diff>
--- a/entregas/apresentacao-13-10/DF_Dossie_Interno_Apresentacao_Einstein.docx
+++ b/entregas/apresentacao-13-10/DF_Dossie_Interno_Apresentacao_Einstein.docx
@@ -808,7 +808,7 @@
                 <w:sz w:val="18"/>
                 <w:szCs w:val="18"/>
               </w:rPr>
-              <w:t xml:space="preserve">Denise Ferreira e Caio Gavioli conduzem juntos; Amanda Tigre, Marco Murino, Cláudia De Santi e André Ferreira da Silva de apoio às perguntas</w:t>
+              <w:t xml:space="preserve">Denise Ferreira e Caio Gavioli conduzem juntos (Caio compartilha a tela); Amanda Tigre, Marco Murino, Cláudia De Santi e André Ferreira da Silva de apoio às perguntas</w:t>
             </w:r>
           </w:p>
         </w:tc>
@@ -3399,7 +3399,7 @@
           <w:sz w:val="20"/>
           <w:szCs w:val="20"/>
         </w:rPr>
-        <w:t xml:space="preserve">Nome do gerente financeiro.</w:t>
+        <w:t xml:space="preserve">Nome do gerente financeiro: Marco Murino</w:t>
       </w:r>
       <w:r>
         <w:rPr>
@@ -3408,7 +3408,7 @@
           <w:sz w:val="20"/>
           <w:szCs w:val="20"/>
         </w:rPr>
-        <w:t xml:space="preserve"> As propostas enviadas grafaram "Marco Murilo"; o convite traz "Marco Murino". Confirmar e, se for o caso, corrigir no relatório executivo antes de enviar.</w:t>
+        <w:t xml:space="preserve"> (confirmado). As propostas técnicas de 01/10 grafaram "Murilo" — se surgir, corrigir verbalmente; o relatório executivo já está certo.</w:t>
       </w:r>
     </w:p>
     <w:p>
@@ -4990,11 +4990,22 @@
       <w:r>
         <w:rPr>
           <w:rFonts w:ascii="Calibri" w:cs="Calibri" w:eastAsia="Calibri" w:hAnsi="Calibri"/>
+          <w:b/>
+          <w:bCs/>
           <w:color w:val="1F2A37"/>
           <w:sz w:val="20"/>
           <w:szCs w:val="20"/>
         </w:rPr>
-        <w:t xml:space="preserve">Quem compartilha a tela: definir entre Denise e Caio; o outro acompanha as notas do apresentador em outra tela.</w:t>
+        <w:t xml:space="preserve">Caio compartilha a tela</w:t>
+      </w:r>
+      <w:r>
+        <w:rPr>
+          <w:rFonts w:ascii="Calibri" w:cs="Calibri" w:eastAsia="Calibri" w:hAnsi="Calibri"/>
+          <w:color w:val="1F2A37"/>
+          <w:sz w:val="20"/>
+          <w:szCs w:val="20"/>
+        </w:rPr>
+        <w:t xml:space="preserve"> e passa os slides; a Denise acompanha as notas do apresentador (PDF ou PowerPoint) em outra tela.</w:t>
       </w:r>
     </w:p>
     <w:p>

</xml_diff>

<commit_message>
Inclui seção 'Como a DF controla' na apresentação e oculta slides de apoio
Três slides novos (Boletim Diário, rotinas automáticas e relatórios
técnicos, sem citar clientes); relatório executivo e dossiê atualizados.

Co-Authored-By: Claude Opus 5.5 <noreply@anthropic.com>
Claude-Session: https://claude.ai/code/session_01EsMNgjuF6bLvLuQZ87HmRr
</commit_message>
<xml_diff>
--- a/entregas/apresentacao-13-10/DF_Dossie_Interno_Apresentacao_Einstein.docx
+++ b/entregas/apresentacao-13-10/DF_Dossie_Interno_Apresentacao_Einstein.docx
@@ -867,7 +867,7 @@
                 <w:sz w:val="18"/>
                 <w:szCs w:val="18"/>
               </w:rPr>
-              <w:t xml:space="preserve">Apresentação PowerPoint (20 slides, 18 de exposição + 2 de apoio); relatório executivo para enviar depois</w:t>
+              <w:t xml:space="preserve">Apresentação PowerPoint (23 slides: 21 de exposição + 2 de apoio ocultos, que só aparecem se você navegar até eles); relatório executivo para enviar depois</w:t>
             </w:r>
           </w:p>
         </w:tc>
@@ -1061,6 +1061,38 @@
     </w:p>
     <w:p>
       <w:pPr>
+        <w:pStyle w:val="ListParagraph"/>
+        <w:numPr>
+          <w:ilvl w:val="0"/>
+          <w:numId w:val="1"/>
+        </w:numPr>
+        <w:spacing w:after="110" w:line="290"/>
+        <w:ind w:left="360"/>
+        <w:jc w:val="both"/>
+      </w:pPr>
+      <w:r>
+        <w:rPr>
+          <w:rFonts w:ascii="Calibri" w:cs="Calibri" w:eastAsia="Calibri" w:hAnsi="Calibri"/>
+          <w:b/>
+          <w:bCs/>
+          <w:color w:val="1F2A37"/>
+          <w:sz w:val="20"/>
+          <w:szCs w:val="20"/>
+        </w:rPr>
+        <w:t xml:space="preserve">Controle com ferramentas próprias:</w:t>
+      </w:r>
+      <w:r>
+        <w:rPr>
+          <w:rFonts w:ascii="Calibri" w:cs="Calibri" w:eastAsia="Calibri" w:hAnsi="Calibri"/>
+          <w:color w:val="1F2A37"/>
+          <w:sz w:val="20"/>
+          <w:szCs w:val="20"/>
+        </w:rPr>
+        <w:t xml:space="preserve"> Boletim Diário, rotinas automáticas e relatórios técnicos — tudo em operação.</w:t>
+      </w:r>
+    </w:p>
+    <w:p>
+      <w:pPr>
         <w:pStyle w:val="Heading1"/>
         <w:keepNext/>
         <w:pBdr>
@@ -1093,10 +1125,10 @@
         </w:tblBorders>
       </w:tblPr>
       <w:tblGrid>
-        <w:gridCol w:w="1184"/>
-        <w:gridCol w:w="4911"/>
-        <w:gridCol w:w="1729"/>
-        <w:gridCol w:w="1526"/>
+        <w:gridCol w:w="889"/>
+        <w:gridCol w:w="6031"/>
+        <w:gridCol w:w="1289"/>
+        <w:gridCol w:w="1141"/>
       </w:tblGrid>
       <w:tr>
         <w:trPr>
@@ -1105,7 +1137,7 @@
         </w:trPr>
         <w:tc>
           <w:tcPr>
-            <w:tcW w:type="dxa" w:w="1184"/>
+            <w:tcW w:type="dxa" w:w="889"/>
             <w:shd w:fill="2F4162" w:val="clear"/>
             <w:tcMar>
               <w:top w:type="dxa" w:w="90"/>
@@ -1134,7 +1166,7 @@
         </w:tc>
         <w:tc>
           <w:tcPr>
-            <w:tcW w:type="dxa" w:w="4911"/>
+            <w:tcW w:type="dxa" w:w="6031"/>
             <w:shd w:fill="2F4162" w:val="clear"/>
             <w:tcMar>
               <w:top w:type="dxa" w:w="90"/>
@@ -1163,7 +1195,7 @@
         </w:tc>
         <w:tc>
           <w:tcPr>
-            <w:tcW w:type="dxa" w:w="1729"/>
+            <w:tcW w:type="dxa" w:w="1289"/>
             <w:shd w:fill="2F4162" w:val="clear"/>
             <w:tcMar>
               <w:top w:type="dxa" w:w="90"/>
@@ -1192,7 +1224,7 @@
         </w:tc>
         <w:tc>
           <w:tcPr>
-            <w:tcW w:type="dxa" w:w="1526"/>
+            <w:tcW w:type="dxa" w:w="1141"/>
             <w:shd w:fill="2F4162" w:val="clear"/>
             <w:tcMar>
               <w:top w:type="dxa" w:w="90"/>
@@ -1226,7 +1258,7 @@
         </w:trPr>
         <w:tc>
           <w:tcPr>
-            <w:tcW w:type="dxa" w:w="1184"/>
+            <w:tcW w:type="dxa" w:w="889"/>
             <w:shd w:fill="FFFFFF" w:val="clear"/>
             <w:tcMar>
               <w:top w:type="dxa" w:w="90"/>
@@ -1253,7 +1285,7 @@
         </w:tc>
         <w:tc>
           <w:tcPr>
-            <w:tcW w:type="dxa" w:w="4911"/>
+            <w:tcW w:type="dxa" w:w="6031"/>
             <w:shd w:fill="FFFFFF" w:val="clear"/>
             <w:tcMar>
               <w:top w:type="dxa" w:w="90"/>
@@ -1280,7 +1312,7 @@
         </w:tc>
         <w:tc>
           <w:tcPr>
-            <w:tcW w:type="dxa" w:w="1729"/>
+            <w:tcW w:type="dxa" w:w="1289"/>
             <w:shd w:fill="FFFFFF" w:val="clear"/>
             <w:tcMar>
               <w:top w:type="dxa" w:w="90"/>
@@ -1307,7 +1339,7 @@
         </w:tc>
         <w:tc>
           <w:tcPr>
-            <w:tcW w:type="dxa" w:w="1526"/>
+            <w:tcW w:type="dxa" w:w="1141"/>
             <w:shd w:fill="FFFFFF" w:val="clear"/>
             <w:tcMar>
               <w:top w:type="dxa" w:w="90"/>
@@ -1339,7 +1371,7 @@
         </w:trPr>
         <w:tc>
           <w:tcPr>
-            <w:tcW w:type="dxa" w:w="1184"/>
+            <w:tcW w:type="dxa" w:w="889"/>
             <w:shd w:fill="F5F5F5" w:val="clear"/>
             <w:tcMar>
               <w:top w:type="dxa" w:w="90"/>
@@ -1366,7 +1398,7 @@
         </w:tc>
         <w:tc>
           <w:tcPr>
-            <w:tcW w:type="dxa" w:w="4911"/>
+            <w:tcW w:type="dxa" w:w="6031"/>
             <w:shd w:fill="F5F5F5" w:val="clear"/>
             <w:tcMar>
               <w:top w:type="dxa" w:w="90"/>
@@ -1393,7 +1425,7 @@
         </w:tc>
         <w:tc>
           <w:tcPr>
-            <w:tcW w:type="dxa" w:w="1729"/>
+            <w:tcW w:type="dxa" w:w="1289"/>
             <w:shd w:fill="F5F5F5" w:val="clear"/>
             <w:tcMar>
               <w:top w:type="dxa" w:w="90"/>
@@ -1420,7 +1452,7 @@
         </w:tc>
         <w:tc>
           <w:tcPr>
-            <w:tcW w:type="dxa" w:w="1526"/>
+            <w:tcW w:type="dxa" w:w="1141"/>
             <w:shd w:fill="F5F5F5" w:val="clear"/>
             <w:tcMar>
               <w:top w:type="dxa" w:w="90"/>
@@ -1452,7 +1484,7 @@
         </w:trPr>
         <w:tc>
           <w:tcPr>
-            <w:tcW w:type="dxa" w:w="1184"/>
+            <w:tcW w:type="dxa" w:w="889"/>
             <w:shd w:fill="FFFFFF" w:val="clear"/>
             <w:tcMar>
               <w:top w:type="dxa" w:w="90"/>
@@ -1479,7 +1511,7 @@
         </w:tc>
         <w:tc>
           <w:tcPr>
-            <w:tcW w:type="dxa" w:w="4911"/>
+            <w:tcW w:type="dxa" w:w="6031"/>
             <w:shd w:fill="FFFFFF" w:val="clear"/>
             <w:tcMar>
               <w:top w:type="dxa" w:w="90"/>
@@ -1506,7 +1538,7 @@
         </w:tc>
         <w:tc>
           <w:tcPr>
-            <w:tcW w:type="dxa" w:w="1729"/>
+            <w:tcW w:type="dxa" w:w="1289"/>
             <w:shd w:fill="FFFFFF" w:val="clear"/>
             <w:tcMar>
               <w:top w:type="dxa" w:w="90"/>
@@ -1533,7 +1565,7 @@
         </w:tc>
         <w:tc>
           <w:tcPr>
-            <w:tcW w:type="dxa" w:w="1526"/>
+            <w:tcW w:type="dxa" w:w="1141"/>
             <w:shd w:fill="FFFFFF" w:val="clear"/>
             <w:tcMar>
               <w:top w:type="dxa" w:w="90"/>
@@ -1565,7 +1597,7 @@
         </w:trPr>
         <w:tc>
           <w:tcPr>
-            <w:tcW w:type="dxa" w:w="1184"/>
+            <w:tcW w:type="dxa" w:w="889"/>
             <w:shd w:fill="F5F5F5" w:val="clear"/>
             <w:tcMar>
               <w:top w:type="dxa" w:w="90"/>
@@ -1592,7 +1624,7 @@
         </w:tc>
         <w:tc>
           <w:tcPr>
-            <w:tcW w:type="dxa" w:w="4911"/>
+            <w:tcW w:type="dxa" w:w="6031"/>
             <w:shd w:fill="F5F5F5" w:val="clear"/>
             <w:tcMar>
               <w:top w:type="dxa" w:w="90"/>
@@ -1619,7 +1651,7 @@
         </w:tc>
         <w:tc>
           <w:tcPr>
-            <w:tcW w:type="dxa" w:w="1729"/>
+            <w:tcW w:type="dxa" w:w="1289"/>
             <w:shd w:fill="F5F5F5" w:val="clear"/>
             <w:tcMar>
               <w:top w:type="dxa" w:w="90"/>
@@ -1646,7 +1678,7 @@
         </w:tc>
         <w:tc>
           <w:tcPr>
-            <w:tcW w:type="dxa" w:w="1526"/>
+            <w:tcW w:type="dxa" w:w="1141"/>
             <w:shd w:fill="F5F5F5" w:val="clear"/>
             <w:tcMar>
               <w:top w:type="dxa" w:w="90"/>
@@ -1678,7 +1710,7 @@
         </w:trPr>
         <w:tc>
           <w:tcPr>
-            <w:tcW w:type="dxa" w:w="1184"/>
+            <w:tcW w:type="dxa" w:w="889"/>
             <w:shd w:fill="FFFFFF" w:val="clear"/>
             <w:tcMar>
               <w:top w:type="dxa" w:w="90"/>
@@ -1705,7 +1737,7 @@
         </w:tc>
         <w:tc>
           <w:tcPr>
-            <w:tcW w:type="dxa" w:w="4911"/>
+            <w:tcW w:type="dxa" w:w="6031"/>
             <w:shd w:fill="FFFFFF" w:val="clear"/>
             <w:tcMar>
               <w:top w:type="dxa" w:w="90"/>
@@ -1732,7 +1764,7 @@
         </w:tc>
         <w:tc>
           <w:tcPr>
-            <w:tcW w:type="dxa" w:w="1729"/>
+            <w:tcW w:type="dxa" w:w="1289"/>
             <w:shd w:fill="FFFFFF" w:val="clear"/>
             <w:tcMar>
               <w:top w:type="dxa" w:w="90"/>
@@ -1759,7 +1791,7 @@
         </w:tc>
         <w:tc>
           <w:tcPr>
-            <w:tcW w:type="dxa" w:w="1526"/>
+            <w:tcW w:type="dxa" w:w="1141"/>
             <w:shd w:fill="FFFFFF" w:val="clear"/>
             <w:tcMar>
               <w:top w:type="dxa" w:w="90"/>
@@ -1791,7 +1823,7 @@
         </w:trPr>
         <w:tc>
           <w:tcPr>
-            <w:tcW w:type="dxa" w:w="1184"/>
+            <w:tcW w:type="dxa" w:w="889"/>
             <w:shd w:fill="F5F5F5" w:val="clear"/>
             <w:tcMar>
               <w:top w:type="dxa" w:w="90"/>
@@ -1818,7 +1850,7 @@
         </w:tc>
         <w:tc>
           <w:tcPr>
-            <w:tcW w:type="dxa" w:w="4911"/>
+            <w:tcW w:type="dxa" w:w="6031"/>
             <w:shd w:fill="F5F5F5" w:val="clear"/>
             <w:tcMar>
               <w:top w:type="dxa" w:w="90"/>
@@ -1845,7 +1877,7 @@
         </w:tc>
         <w:tc>
           <w:tcPr>
-            <w:tcW w:type="dxa" w:w="1729"/>
+            <w:tcW w:type="dxa" w:w="1289"/>
             <w:shd w:fill="F5F5F5" w:val="clear"/>
             <w:tcMar>
               <w:top w:type="dxa" w:w="90"/>
@@ -1872,7 +1904,7 @@
         </w:tc>
         <w:tc>
           <w:tcPr>
-            <w:tcW w:type="dxa" w:w="1526"/>
+            <w:tcW w:type="dxa" w:w="1141"/>
             <w:shd w:fill="F5F5F5" w:val="clear"/>
             <w:tcMar>
               <w:top w:type="dxa" w:w="90"/>
@@ -1904,7 +1936,7 @@
         </w:trPr>
         <w:tc>
           <w:tcPr>
-            <w:tcW w:type="dxa" w:w="1184"/>
+            <w:tcW w:type="dxa" w:w="889"/>
             <w:shd w:fill="FFFFFF" w:val="clear"/>
             <w:tcMar>
               <w:top w:type="dxa" w:w="90"/>
@@ -1931,7 +1963,7 @@
         </w:tc>
         <w:tc>
           <w:tcPr>
-            <w:tcW w:type="dxa" w:w="4911"/>
+            <w:tcW w:type="dxa" w:w="6031"/>
             <w:shd w:fill="FFFFFF" w:val="clear"/>
             <w:tcMar>
               <w:top w:type="dxa" w:w="90"/>
@@ -1958,7 +1990,7 @@
         </w:tc>
         <w:tc>
           <w:tcPr>
-            <w:tcW w:type="dxa" w:w="1729"/>
+            <w:tcW w:type="dxa" w:w="1289"/>
             <w:shd w:fill="FFFFFF" w:val="clear"/>
             <w:tcMar>
               <w:top w:type="dxa" w:w="90"/>
@@ -1985,7 +2017,7 @@
         </w:tc>
         <w:tc>
           <w:tcPr>
-            <w:tcW w:type="dxa" w:w="1526"/>
+            <w:tcW w:type="dxa" w:w="1141"/>
             <w:shd w:fill="FFFFFF" w:val="clear"/>
             <w:tcMar>
               <w:top w:type="dxa" w:w="90"/>
@@ -2017,7 +2049,7 @@
         </w:trPr>
         <w:tc>
           <w:tcPr>
-            <w:tcW w:type="dxa" w:w="1184"/>
+            <w:tcW w:type="dxa" w:w="889"/>
             <w:shd w:fill="F5F5F5" w:val="clear"/>
             <w:tcMar>
               <w:top w:type="dxa" w:w="90"/>
@@ -2044,7 +2076,7 @@
         </w:tc>
         <w:tc>
           <w:tcPr>
-            <w:tcW w:type="dxa" w:w="4911"/>
+            <w:tcW w:type="dxa" w:w="6031"/>
             <w:shd w:fill="F5F5F5" w:val="clear"/>
             <w:tcMar>
               <w:top w:type="dxa" w:w="90"/>
@@ -2071,7 +2103,7 @@
         </w:tc>
         <w:tc>
           <w:tcPr>
-            <w:tcW w:type="dxa" w:w="1729"/>
+            <w:tcW w:type="dxa" w:w="1289"/>
             <w:shd w:fill="F5F5F5" w:val="clear"/>
             <w:tcMar>
               <w:top w:type="dxa" w:w="90"/>
@@ -2098,7 +2130,7 @@
         </w:tc>
         <w:tc>
           <w:tcPr>
-            <w:tcW w:type="dxa" w:w="1526"/>
+            <w:tcW w:type="dxa" w:w="1141"/>
             <w:shd w:fill="F5F5F5" w:val="clear"/>
             <w:tcMar>
               <w:top w:type="dxa" w:w="90"/>
@@ -2130,7 +2162,7 @@
         </w:trPr>
         <w:tc>
           <w:tcPr>
-            <w:tcW w:type="dxa" w:w="1184"/>
+            <w:tcW w:type="dxa" w:w="889"/>
             <w:shd w:fill="FFFFFF" w:val="clear"/>
             <w:tcMar>
               <w:top w:type="dxa" w:w="90"/>
@@ -2157,7 +2189,7 @@
         </w:tc>
         <w:tc>
           <w:tcPr>
-            <w:tcW w:type="dxa" w:w="4911"/>
+            <w:tcW w:type="dxa" w:w="6031"/>
             <w:shd w:fill="FFFFFF" w:val="clear"/>
             <w:tcMar>
               <w:top w:type="dxa" w:w="90"/>
@@ -2184,7 +2216,7 @@
         </w:tc>
         <w:tc>
           <w:tcPr>
-            <w:tcW w:type="dxa" w:w="1729"/>
+            <w:tcW w:type="dxa" w:w="1289"/>
             <w:shd w:fill="FFFFFF" w:val="clear"/>
             <w:tcMar>
               <w:top w:type="dxa" w:w="90"/>
@@ -2211,7 +2243,7 @@
         </w:tc>
         <w:tc>
           <w:tcPr>
-            <w:tcW w:type="dxa" w:w="1526"/>
+            <w:tcW w:type="dxa" w:w="1141"/>
             <w:shd w:fill="FFFFFF" w:val="clear"/>
             <w:tcMar>
               <w:top w:type="dxa" w:w="90"/>
@@ -2243,7 +2275,7 @@
         </w:trPr>
         <w:tc>
           <w:tcPr>
-            <w:tcW w:type="dxa" w:w="1184"/>
+            <w:tcW w:type="dxa" w:w="889"/>
             <w:shd w:fill="F5F5F5" w:val="clear"/>
             <w:tcMar>
               <w:top w:type="dxa" w:w="90"/>
@@ -2270,7 +2302,7 @@
         </w:tc>
         <w:tc>
           <w:tcPr>
-            <w:tcW w:type="dxa" w:w="4911"/>
+            <w:tcW w:type="dxa" w:w="6031"/>
             <w:shd w:fill="F5F5F5" w:val="clear"/>
             <w:tcMar>
               <w:top w:type="dxa" w:w="90"/>
@@ -2297,7 +2329,7 @@
         </w:tc>
         <w:tc>
           <w:tcPr>
-            <w:tcW w:type="dxa" w:w="1729"/>
+            <w:tcW w:type="dxa" w:w="1289"/>
             <w:shd w:fill="F5F5F5" w:val="clear"/>
             <w:tcMar>
               <w:top w:type="dxa" w:w="90"/>
@@ -2324,7 +2356,7 @@
         </w:tc>
         <w:tc>
           <w:tcPr>
-            <w:tcW w:type="dxa" w:w="1526"/>
+            <w:tcW w:type="dxa" w:w="1141"/>
             <w:shd w:fill="F5F5F5" w:val="clear"/>
             <w:tcMar>
               <w:top w:type="dxa" w:w="90"/>
@@ -2356,61 +2388,61 @@
         </w:trPr>
         <w:tc>
           <w:tcPr>
-            <w:tcW w:type="dxa" w:w="1184"/>
-            <w:shd w:fill="FFFFFF" w:val="clear"/>
-            <w:tcMar>
-              <w:top w:type="dxa" w:w="90"/>
-              <w:left w:type="dxa" w:w="140"/>
-              <w:bottom w:type="dxa" w:w="90"/>
-              <w:right w:type="dxa" w:w="140"/>
-            </w:tcMar>
-            <w:vAlign w:val="center"/>
-          </w:tcPr>
-          <w:p>
-            <w:pPr>
-              <w:spacing w:after="0" w:line="260"/>
-            </w:pPr>
-            <w:r>
-              <w:rPr>
-                <w:rFonts w:ascii="Calibri" w:cs="Calibri" w:eastAsia="Calibri" w:hAnsi="Calibri"/>
-                <w:color w:val="1F2A37"/>
-                <w:sz w:val="18"/>
-                <w:szCs w:val="18"/>
-              </w:rPr>
-              <w:t xml:space="preserve">15–16</w:t>
-            </w:r>
-          </w:p>
-        </w:tc>
-        <w:tc>
-          <w:tcPr>
-            <w:tcW w:type="dxa" w:w="4911"/>
-            <w:shd w:fill="FFFFFF" w:val="clear"/>
-            <w:tcMar>
-              <w:top w:type="dxa" w:w="90"/>
-              <w:left w:type="dxa" w:w="140"/>
-              <w:bottom w:type="dxa" w:w="90"/>
-              <w:right w:type="dxa" w:w="140"/>
-            </w:tcMar>
-            <w:vAlign w:val="center"/>
-          </w:tcPr>
-          <w:p>
-            <w:pPr>
-              <w:spacing w:after="0" w:line="260"/>
-            </w:pPr>
-            <w:r>
-              <w:rPr>
-                <w:rFonts w:ascii="Calibri" w:cs="Calibri" w:eastAsia="Calibri" w:hAnsi="Calibri"/>
-                <w:color w:val="1F2A37"/>
-                <w:sz w:val="18"/>
-                <w:szCs w:val="18"/>
-              </w:rPr>
-              <w:t xml:space="preserve">Continuidade e escopo</w:t>
-            </w:r>
-          </w:p>
-        </w:tc>
-        <w:tc>
-          <w:tcPr>
-            <w:tcW w:type="dxa" w:w="1729"/>
+            <w:tcW w:type="dxa" w:w="889"/>
+            <w:shd w:fill="FFFFFF" w:val="clear"/>
+            <w:tcMar>
+              <w:top w:type="dxa" w:w="90"/>
+              <w:left w:type="dxa" w:w="140"/>
+              <w:bottom w:type="dxa" w:w="90"/>
+              <w:right w:type="dxa" w:w="140"/>
+            </w:tcMar>
+            <w:vAlign w:val="center"/>
+          </w:tcPr>
+          <w:p>
+            <w:pPr>
+              <w:spacing w:after="0" w:line="260"/>
+            </w:pPr>
+            <w:r>
+              <w:rPr>
+                <w:rFonts w:ascii="Calibri" w:cs="Calibri" w:eastAsia="Calibri" w:hAnsi="Calibri"/>
+                <w:color w:val="1F2A37"/>
+                <w:sz w:val="18"/>
+                <w:szCs w:val="18"/>
+              </w:rPr>
+              <w:t xml:space="preserve">15</w:t>
+            </w:r>
+          </w:p>
+        </w:tc>
+        <w:tc>
+          <w:tcPr>
+            <w:tcW w:type="dxa" w:w="6031"/>
+            <w:shd w:fill="FFFFFF" w:val="clear"/>
+            <w:tcMar>
+              <w:top w:type="dxa" w:w="90"/>
+              <w:left w:type="dxa" w:w="140"/>
+              <w:bottom w:type="dxa" w:w="90"/>
+              <w:right w:type="dxa" w:w="140"/>
+            </w:tcMar>
+            <w:vAlign w:val="center"/>
+          </w:tcPr>
+          <w:p>
+            <w:pPr>
+              <w:spacing w:after="0" w:line="260"/>
+            </w:pPr>
+            <w:r>
+              <w:rPr>
+                <w:rFonts w:ascii="Calibri" w:cs="Calibri" w:eastAsia="Calibri" w:hAnsi="Calibri"/>
+                <w:color w:val="1F2A37"/>
+                <w:sz w:val="18"/>
+                <w:szCs w:val="18"/>
+              </w:rPr>
+              <w:t xml:space="preserve">Continuidade</w:t>
+            </w:r>
+          </w:p>
+        </w:tc>
+        <w:tc>
+          <w:tcPr>
+            <w:tcW w:type="dxa" w:w="1289"/>
             <w:shd w:fill="FFFFFF" w:val="clear"/>
             <w:tcMar>
               <w:top w:type="dxa" w:w="90"/>
@@ -2437,28 +2469,28 @@
         </w:tc>
         <w:tc>
           <w:tcPr>
-            <w:tcW w:type="dxa" w:w="1526"/>
-            <w:shd w:fill="FFFFFF" w:val="clear"/>
-            <w:tcMar>
-              <w:top w:type="dxa" w:w="90"/>
-              <w:left w:type="dxa" w:w="140"/>
-              <w:bottom w:type="dxa" w:w="90"/>
-              <w:right w:type="dxa" w:w="140"/>
-            </w:tcMar>
-            <w:vAlign w:val="center"/>
-          </w:tcPr>
-          <w:p>
-            <w:pPr>
-              <w:spacing w:after="0" w:line="260"/>
-            </w:pPr>
-            <w:r>
-              <w:rPr>
-                <w:rFonts w:ascii="Calibri" w:cs="Calibri" w:eastAsia="Calibri" w:hAnsi="Calibri"/>
-                <w:color w:val="1F2A37"/>
-                <w:sz w:val="18"/>
-                <w:szCs w:val="18"/>
-              </w:rPr>
-              <w:t xml:space="preserve">4 min</w:t>
+            <w:tcW w:type="dxa" w:w="1141"/>
+            <w:shd w:fill="FFFFFF" w:val="clear"/>
+            <w:tcMar>
+              <w:top w:type="dxa" w:w="90"/>
+              <w:left w:type="dxa" w:w="140"/>
+              <w:bottom w:type="dxa" w:w="90"/>
+              <w:right w:type="dxa" w:w="140"/>
+            </w:tcMar>
+            <w:vAlign w:val="center"/>
+          </w:tcPr>
+          <w:p>
+            <w:pPr>
+              <w:spacing w:after="0" w:line="260"/>
+            </w:pPr>
+            <w:r>
+              <w:rPr>
+                <w:rFonts w:ascii="Calibri" w:cs="Calibri" w:eastAsia="Calibri" w:hAnsi="Calibri"/>
+                <w:color w:val="1F2A37"/>
+                <w:sz w:val="18"/>
+                <w:szCs w:val="18"/>
+              </w:rPr>
+              <w:t xml:space="preserve">2 min</w:t>
             </w:r>
           </w:p>
         </w:tc>
@@ -2469,109 +2501,109 @@
         </w:trPr>
         <w:tc>
           <w:tcPr>
-            <w:tcW w:type="dxa" w:w="1184"/>
-            <w:shd w:fill="F5F5F5" w:val="clear"/>
-            <w:tcMar>
-              <w:top w:type="dxa" w:w="90"/>
-              <w:left w:type="dxa" w:w="140"/>
-              <w:bottom w:type="dxa" w:w="90"/>
-              <w:right w:type="dxa" w:w="140"/>
-            </w:tcMar>
-            <w:vAlign w:val="center"/>
-          </w:tcPr>
-          <w:p>
-            <w:pPr>
-              <w:spacing w:after="0" w:line="260"/>
-            </w:pPr>
-            <w:r>
-              <w:rPr>
-                <w:rFonts w:ascii="Calibri" w:cs="Calibri" w:eastAsia="Calibri" w:hAnsi="Calibri"/>
-                <w:color w:val="1F2A37"/>
-                <w:sz w:val="18"/>
-                <w:szCs w:val="18"/>
-              </w:rPr>
-              <w:t xml:space="preserve">17–18</w:t>
-            </w:r>
-          </w:p>
-        </w:tc>
-        <w:tc>
-          <w:tcPr>
-            <w:tcW w:type="dxa" w:w="4911"/>
-            <w:shd w:fill="F5F5F5" w:val="clear"/>
-            <w:tcMar>
-              <w:top w:type="dxa" w:w="90"/>
-              <w:left w:type="dxa" w:w="140"/>
-              <w:bottom w:type="dxa" w:w="90"/>
-              <w:right w:type="dxa" w:w="140"/>
-            </w:tcMar>
-            <w:vAlign w:val="center"/>
-          </w:tcPr>
-          <w:p>
-            <w:pPr>
-              <w:spacing w:after="0" w:line="260"/>
-            </w:pPr>
-            <w:r>
-              <w:rPr>
-                <w:rFonts w:ascii="Calibri" w:cs="Calibri" w:eastAsia="Calibri" w:hAnsi="Calibri"/>
-                <w:color w:val="1F2A37"/>
-                <w:sz w:val="18"/>
-                <w:szCs w:val="18"/>
-              </w:rPr>
-              <w:t xml:space="preserve">Por que a DF e encerramento</w:t>
-            </w:r>
-          </w:p>
-        </w:tc>
-        <w:tc>
-          <w:tcPr>
-            <w:tcW w:type="dxa" w:w="1729"/>
-            <w:shd w:fill="F5F5F5" w:val="clear"/>
-            <w:tcMar>
-              <w:top w:type="dxa" w:w="90"/>
-              <w:left w:type="dxa" w:w="140"/>
-              <w:bottom w:type="dxa" w:w="90"/>
-              <w:right w:type="dxa" w:w="140"/>
-            </w:tcMar>
-            <w:vAlign w:val="center"/>
-          </w:tcPr>
-          <w:p>
-            <w:pPr>
-              <w:spacing w:after="0" w:line="260"/>
-            </w:pPr>
-            <w:r>
-              <w:rPr>
-                <w:rFonts w:ascii="Calibri" w:cs="Calibri" w:eastAsia="Calibri" w:hAnsi="Calibri"/>
-                <w:color w:val="1F2A37"/>
-                <w:sz w:val="18"/>
-                <w:szCs w:val="18"/>
-              </w:rPr>
-              <w:t xml:space="preserve">Denise</w:t>
-            </w:r>
-          </w:p>
-        </w:tc>
-        <w:tc>
-          <w:tcPr>
-            <w:tcW w:type="dxa" w:w="1526"/>
-            <w:shd w:fill="F5F5F5" w:val="clear"/>
-            <w:tcMar>
-              <w:top w:type="dxa" w:w="90"/>
-              <w:left w:type="dxa" w:w="140"/>
-              <w:bottom w:type="dxa" w:w="90"/>
-              <w:right w:type="dxa" w:w="140"/>
-            </w:tcMar>
-            <w:vAlign w:val="center"/>
-          </w:tcPr>
-          <w:p>
-            <w:pPr>
-              <w:spacing w:after="0" w:line="260"/>
-            </w:pPr>
-            <w:r>
-              <w:rPr>
-                <w:rFonts w:ascii="Calibri" w:cs="Calibri" w:eastAsia="Calibri" w:hAnsi="Calibri"/>
-                <w:color w:val="1F2A37"/>
-                <w:sz w:val="18"/>
-                <w:szCs w:val="18"/>
-              </w:rPr>
-              <w:t xml:space="preserve">2 min</w:t>
+            <w:tcW w:type="dxa" w:w="889"/>
+            <w:shd w:fill="F5F5F5" w:val="clear"/>
+            <w:tcMar>
+              <w:top w:type="dxa" w:w="90"/>
+              <w:left w:type="dxa" w:w="140"/>
+              <w:bottom w:type="dxa" w:w="90"/>
+              <w:right w:type="dxa" w:w="140"/>
+            </w:tcMar>
+            <w:vAlign w:val="center"/>
+          </w:tcPr>
+          <w:p>
+            <w:pPr>
+              <w:spacing w:after="0" w:line="260"/>
+            </w:pPr>
+            <w:r>
+              <w:rPr>
+                <w:rFonts w:ascii="Calibri" w:cs="Calibri" w:eastAsia="Calibri" w:hAnsi="Calibri"/>
+                <w:color w:val="1F2A37"/>
+                <w:sz w:val="18"/>
+                <w:szCs w:val="18"/>
+              </w:rPr>
+              <w:t xml:space="preserve">16–18</w:t>
+            </w:r>
+          </w:p>
+        </w:tc>
+        <w:tc>
+          <w:tcPr>
+            <w:tcW w:type="dxa" w:w="6031"/>
+            <w:shd w:fill="F5F5F5" w:val="clear"/>
+            <w:tcMar>
+              <w:top w:type="dxa" w:w="90"/>
+              <w:left w:type="dxa" w:w="140"/>
+              <w:bottom w:type="dxa" w:w="90"/>
+              <w:right w:type="dxa" w:w="140"/>
+            </w:tcMar>
+            <w:vAlign w:val="center"/>
+          </w:tcPr>
+          <w:p>
+            <w:pPr>
+              <w:spacing w:after="0" w:line="260"/>
+            </w:pPr>
+            <w:r>
+              <w:rPr>
+                <w:rFonts w:ascii="Calibri" w:cs="Calibri" w:eastAsia="Calibri" w:hAnsi="Calibri"/>
+                <w:color w:val="1F2A37"/>
+                <w:sz w:val="18"/>
+                <w:szCs w:val="18"/>
+              </w:rPr>
+              <w:t xml:space="preserve">Como a DF controla: Boletim, rotinas automáticas e relatórios técnicos</w:t>
+            </w:r>
+          </w:p>
+        </w:tc>
+        <w:tc>
+          <w:tcPr>
+            <w:tcW w:type="dxa" w:w="1289"/>
+            <w:shd w:fill="F5F5F5" w:val="clear"/>
+            <w:tcMar>
+              <w:top w:type="dxa" w:w="90"/>
+              <w:left w:type="dxa" w:w="140"/>
+              <w:bottom w:type="dxa" w:w="90"/>
+              <w:right w:type="dxa" w:w="140"/>
+            </w:tcMar>
+            <w:vAlign w:val="center"/>
+          </w:tcPr>
+          <w:p>
+            <w:pPr>
+              <w:spacing w:after="0" w:line="260"/>
+            </w:pPr>
+            <w:r>
+              <w:rPr>
+                <w:rFonts w:ascii="Calibri" w:cs="Calibri" w:eastAsia="Calibri" w:hAnsi="Calibri"/>
+                <w:color w:val="1F2A37"/>
+                <w:sz w:val="18"/>
+                <w:szCs w:val="18"/>
+              </w:rPr>
+              <w:t xml:space="preserve">Caio</w:t>
+            </w:r>
+          </w:p>
+        </w:tc>
+        <w:tc>
+          <w:tcPr>
+            <w:tcW w:type="dxa" w:w="1141"/>
+            <w:shd w:fill="F5F5F5" w:val="clear"/>
+            <w:tcMar>
+              <w:top w:type="dxa" w:w="90"/>
+              <w:left w:type="dxa" w:w="140"/>
+              <w:bottom w:type="dxa" w:w="90"/>
+              <w:right w:type="dxa" w:w="140"/>
+            </w:tcMar>
+            <w:vAlign w:val="center"/>
+          </w:tcPr>
+          <w:p>
+            <w:pPr>
+              <w:spacing w:after="0" w:line="260"/>
+            </w:pPr>
+            <w:r>
+              <w:rPr>
+                <w:rFonts w:ascii="Calibri" w:cs="Calibri" w:eastAsia="Calibri" w:hAnsi="Calibri"/>
+                <w:color w:val="1F2A37"/>
+                <w:sz w:val="18"/>
+                <w:szCs w:val="18"/>
+              </w:rPr>
+              <w:t xml:space="preserve">6 min</w:t>
             </w:r>
           </w:p>
         </w:tc>
@@ -2582,104 +2614,109 @@
         </w:trPr>
         <w:tc>
           <w:tcPr>
-            <w:tcW w:type="dxa" w:w="1184"/>
-            <w:shd w:fill="FFFFFF" w:val="clear"/>
-            <w:tcMar>
-              <w:top w:type="dxa" w:w="90"/>
-              <w:left w:type="dxa" w:w="140"/>
-              <w:bottom w:type="dxa" w:w="90"/>
-              <w:right w:type="dxa" w:w="140"/>
-            </w:tcMar>
-            <w:vAlign w:val="center"/>
-          </w:tcPr>
-          <w:p>
-            <w:pPr>
-              <w:spacing w:after="0" w:line="260"/>
-            </w:pPr>
-            <w:r>
-              <w:rPr>
-                <w:rFonts w:ascii="Calibri" w:cs="Calibri" w:eastAsia="Calibri" w:hAnsi="Calibri"/>
-                <w:color w:val="1F2A37"/>
-                <w:sz w:val="18"/>
-                <w:szCs w:val="18"/>
-              </w:rPr>
-              <w:t xml:space="preserve">—</w:t>
-            </w:r>
-          </w:p>
-        </w:tc>
-        <w:tc>
-          <w:tcPr>
-            <w:tcW w:type="dxa" w:w="4911"/>
-            <w:shd w:fill="FFFFFF" w:val="clear"/>
-            <w:tcMar>
-              <w:top w:type="dxa" w:w="90"/>
-              <w:left w:type="dxa" w:w="140"/>
-              <w:bottom w:type="dxa" w:w="90"/>
-              <w:right w:type="dxa" w:w="140"/>
-            </w:tcMar>
-            <w:vAlign w:val="center"/>
-          </w:tcPr>
-          <w:p>
-            <w:pPr>
-              <w:spacing w:after="0" w:line="260"/>
-            </w:pPr>
-            <w:r>
-              <w:rPr>
-                <w:rFonts w:ascii="Calibri" w:cs="Calibri" w:eastAsia="Calibri" w:hAnsi="Calibri"/>
-                <w:b/>
-                <w:bCs/>
-                <w:color w:val="1F2A37"/>
-                <w:sz w:val="18"/>
-                <w:szCs w:val="18"/>
-              </w:rPr>
-              <w:t xml:space="preserve">Total da exposição</w:t>
-            </w:r>
-          </w:p>
-        </w:tc>
-        <w:tc>
-          <w:tcPr>
-            <w:tcW w:type="dxa" w:w="1729"/>
-            <w:shd w:fill="FFFFFF" w:val="clear"/>
-            <w:tcMar>
-              <w:top w:type="dxa" w:w="90"/>
-              <w:left w:type="dxa" w:w="140"/>
-              <w:bottom w:type="dxa" w:w="90"/>
-              <w:right w:type="dxa" w:w="140"/>
-            </w:tcMar>
-            <w:vAlign w:val="center"/>
-          </w:tcPr>
-          <w:p>
-            <w:pPr>
-              <w:spacing w:after="0" w:line="260"/>
-            </w:pPr>
-          </w:p>
-        </w:tc>
-        <w:tc>
-          <w:tcPr>
-            <w:tcW w:type="dxa" w:w="1526"/>
-            <w:shd w:fill="FFFFFF" w:val="clear"/>
-            <w:tcMar>
-              <w:top w:type="dxa" w:w="90"/>
-              <w:left w:type="dxa" w:w="140"/>
-              <w:bottom w:type="dxa" w:w="90"/>
-              <w:right w:type="dxa" w:w="140"/>
-            </w:tcMar>
-            <w:vAlign w:val="center"/>
-          </w:tcPr>
-          <w:p>
-            <w:pPr>
-              <w:spacing w:after="0" w:line="260"/>
-            </w:pPr>
-            <w:r>
-              <w:rPr>
-                <w:rFonts w:ascii="Calibri" w:cs="Calibri" w:eastAsia="Calibri" w:hAnsi="Calibri"/>
-                <w:b/>
-                <w:bCs/>
-                <w:color w:val="1F2A37"/>
-                <w:sz w:val="18"/>
-                <w:szCs w:val="18"/>
-              </w:rPr>
-              <w:t xml:space="preserve">~43 min</w:t>
+            <w:tcW w:type="dxa" w:w="889"/>
+            <w:shd w:fill="FFFFFF" w:val="clear"/>
+            <w:tcMar>
+              <w:top w:type="dxa" w:w="90"/>
+              <w:left w:type="dxa" w:w="140"/>
+              <w:bottom w:type="dxa" w:w="90"/>
+              <w:right w:type="dxa" w:w="140"/>
+            </w:tcMar>
+            <w:vAlign w:val="center"/>
+          </w:tcPr>
+          <w:p>
+            <w:pPr>
+              <w:spacing w:after="0" w:line="260"/>
+            </w:pPr>
+            <w:r>
+              <w:rPr>
+                <w:rFonts w:ascii="Calibri" w:cs="Calibri" w:eastAsia="Calibri" w:hAnsi="Calibri"/>
+                <w:color w:val="1F2A37"/>
+                <w:sz w:val="18"/>
+                <w:szCs w:val="18"/>
+              </w:rPr>
+              <w:t xml:space="preserve">19</w:t>
+            </w:r>
+          </w:p>
+        </w:tc>
+        <w:tc>
+          <w:tcPr>
+            <w:tcW w:type="dxa" w:w="6031"/>
+            <w:shd w:fill="FFFFFF" w:val="clear"/>
+            <w:tcMar>
+              <w:top w:type="dxa" w:w="90"/>
+              <w:left w:type="dxa" w:w="140"/>
+              <w:bottom w:type="dxa" w:w="90"/>
+              <w:right w:type="dxa" w:w="140"/>
+            </w:tcMar>
+            <w:vAlign w:val="center"/>
+          </w:tcPr>
+          <w:p>
+            <w:pPr>
+              <w:spacing w:after="0" w:line="260"/>
+            </w:pPr>
+            <w:r>
+              <w:rPr>
+                <w:rFonts w:ascii="Calibri" w:cs="Calibri" w:eastAsia="Calibri" w:hAnsi="Calibri"/>
+                <w:color w:val="1F2A37"/>
+                <w:sz w:val="18"/>
+                <w:szCs w:val="18"/>
+              </w:rPr>
+              <w:t xml:space="preserve">Escopo</w:t>
+            </w:r>
+          </w:p>
+        </w:tc>
+        <w:tc>
+          <w:tcPr>
+            <w:tcW w:type="dxa" w:w="1289"/>
+            <w:shd w:fill="FFFFFF" w:val="clear"/>
+            <w:tcMar>
+              <w:top w:type="dxa" w:w="90"/>
+              <w:left w:type="dxa" w:w="140"/>
+              <w:bottom w:type="dxa" w:w="90"/>
+              <w:right w:type="dxa" w:w="140"/>
+            </w:tcMar>
+            <w:vAlign w:val="center"/>
+          </w:tcPr>
+          <w:p>
+            <w:pPr>
+              <w:spacing w:after="0" w:line="260"/>
+            </w:pPr>
+            <w:r>
+              <w:rPr>
+                <w:rFonts w:ascii="Calibri" w:cs="Calibri" w:eastAsia="Calibri" w:hAnsi="Calibri"/>
+                <w:color w:val="1F2A37"/>
+                <w:sz w:val="18"/>
+                <w:szCs w:val="18"/>
+              </w:rPr>
+              <w:t xml:space="preserve">Denise</w:t>
+            </w:r>
+          </w:p>
+        </w:tc>
+        <w:tc>
+          <w:tcPr>
+            <w:tcW w:type="dxa" w:w="1141"/>
+            <w:shd w:fill="FFFFFF" w:val="clear"/>
+            <w:tcMar>
+              <w:top w:type="dxa" w:w="90"/>
+              <w:left w:type="dxa" w:w="140"/>
+              <w:bottom w:type="dxa" w:w="90"/>
+              <w:right w:type="dxa" w:w="140"/>
+            </w:tcMar>
+            <w:vAlign w:val="center"/>
+          </w:tcPr>
+          <w:p>
+            <w:pPr>
+              <w:spacing w:after="0" w:line="260"/>
+            </w:pPr>
+            <w:r>
+              <w:rPr>
+                <w:rFonts w:ascii="Calibri" w:cs="Calibri" w:eastAsia="Calibri" w:hAnsi="Calibri"/>
+                <w:color w:val="1F2A37"/>
+                <w:sz w:val="18"/>
+                <w:szCs w:val="18"/>
+              </w:rPr>
+              <w:t xml:space="preserve">2 min</w:t>
             </w:r>
           </w:p>
         </w:tc>
@@ -2690,8 +2727,121 @@
         </w:trPr>
         <w:tc>
           <w:tcPr>
-            <w:tcW w:type="dxa" w:w="1184"/>
-            <w:shd w:fill="F5F5F5" w:val="clear"/>
+            <w:tcW w:type="dxa" w:w="889"/>
+            <w:shd w:fill="F5F5F5" w:val="clear"/>
+            <w:tcMar>
+              <w:top w:type="dxa" w:w="90"/>
+              <w:left w:type="dxa" w:w="140"/>
+              <w:bottom w:type="dxa" w:w="90"/>
+              <w:right w:type="dxa" w:w="140"/>
+            </w:tcMar>
+            <w:vAlign w:val="center"/>
+          </w:tcPr>
+          <w:p>
+            <w:pPr>
+              <w:spacing w:after="0" w:line="260"/>
+            </w:pPr>
+            <w:r>
+              <w:rPr>
+                <w:rFonts w:ascii="Calibri" w:cs="Calibri" w:eastAsia="Calibri" w:hAnsi="Calibri"/>
+                <w:color w:val="1F2A37"/>
+                <w:sz w:val="18"/>
+                <w:szCs w:val="18"/>
+              </w:rPr>
+              <w:t xml:space="preserve">20–21</w:t>
+            </w:r>
+          </w:p>
+        </w:tc>
+        <w:tc>
+          <w:tcPr>
+            <w:tcW w:type="dxa" w:w="6031"/>
+            <w:shd w:fill="F5F5F5" w:val="clear"/>
+            <w:tcMar>
+              <w:top w:type="dxa" w:w="90"/>
+              <w:left w:type="dxa" w:w="140"/>
+              <w:bottom w:type="dxa" w:w="90"/>
+              <w:right w:type="dxa" w:w="140"/>
+            </w:tcMar>
+            <w:vAlign w:val="center"/>
+          </w:tcPr>
+          <w:p>
+            <w:pPr>
+              <w:spacing w:after="0" w:line="260"/>
+            </w:pPr>
+            <w:r>
+              <w:rPr>
+                <w:rFonts w:ascii="Calibri" w:cs="Calibri" w:eastAsia="Calibri" w:hAnsi="Calibri"/>
+                <w:color w:val="1F2A37"/>
+                <w:sz w:val="18"/>
+                <w:szCs w:val="18"/>
+              </w:rPr>
+              <w:t xml:space="preserve">Por que a DF e encerramento</w:t>
+            </w:r>
+          </w:p>
+        </w:tc>
+        <w:tc>
+          <w:tcPr>
+            <w:tcW w:type="dxa" w:w="1289"/>
+            <w:shd w:fill="F5F5F5" w:val="clear"/>
+            <w:tcMar>
+              <w:top w:type="dxa" w:w="90"/>
+              <w:left w:type="dxa" w:w="140"/>
+              <w:bottom w:type="dxa" w:w="90"/>
+              <w:right w:type="dxa" w:w="140"/>
+            </w:tcMar>
+            <w:vAlign w:val="center"/>
+          </w:tcPr>
+          <w:p>
+            <w:pPr>
+              <w:spacing w:after="0" w:line="260"/>
+            </w:pPr>
+            <w:r>
+              <w:rPr>
+                <w:rFonts w:ascii="Calibri" w:cs="Calibri" w:eastAsia="Calibri" w:hAnsi="Calibri"/>
+                <w:color w:val="1F2A37"/>
+                <w:sz w:val="18"/>
+                <w:szCs w:val="18"/>
+              </w:rPr>
+              <w:t xml:space="preserve">Denise</w:t>
+            </w:r>
+          </w:p>
+        </w:tc>
+        <w:tc>
+          <w:tcPr>
+            <w:tcW w:type="dxa" w:w="1141"/>
+            <w:shd w:fill="F5F5F5" w:val="clear"/>
+            <w:tcMar>
+              <w:top w:type="dxa" w:w="90"/>
+              <w:left w:type="dxa" w:w="140"/>
+              <w:bottom w:type="dxa" w:w="90"/>
+              <w:right w:type="dxa" w:w="140"/>
+            </w:tcMar>
+            <w:vAlign w:val="center"/>
+          </w:tcPr>
+          <w:p>
+            <w:pPr>
+              <w:spacing w:after="0" w:line="260"/>
+            </w:pPr>
+            <w:r>
+              <w:rPr>
+                <w:rFonts w:ascii="Calibri" w:cs="Calibri" w:eastAsia="Calibri" w:hAnsi="Calibri"/>
+                <w:color w:val="1F2A37"/>
+                <w:sz w:val="18"/>
+                <w:szCs w:val="18"/>
+              </w:rPr>
+              <w:t xml:space="preserve">2 min</w:t>
+            </w:r>
+          </w:p>
+        </w:tc>
+      </w:tr>
+      <w:tr>
+        <w:trPr>
+          <w:cantSplit/>
+        </w:trPr>
+        <w:tc>
+          <w:tcPr>
+            <w:tcW w:type="dxa" w:w="889"/>
+            <w:shd w:fill="FFFFFF" w:val="clear"/>
             <w:tcMar>
               <w:top w:type="dxa" w:w="90"/>
               <w:left w:type="dxa" w:w="140"/>
@@ -2717,7 +2867,115 @@
         </w:tc>
         <w:tc>
           <w:tcPr>
-            <w:tcW w:type="dxa" w:w="4911"/>
+            <w:tcW w:type="dxa" w:w="6031"/>
+            <w:shd w:fill="FFFFFF" w:val="clear"/>
+            <w:tcMar>
+              <w:top w:type="dxa" w:w="90"/>
+              <w:left w:type="dxa" w:w="140"/>
+              <w:bottom w:type="dxa" w:w="90"/>
+              <w:right w:type="dxa" w:w="140"/>
+            </w:tcMar>
+            <w:vAlign w:val="center"/>
+          </w:tcPr>
+          <w:p>
+            <w:pPr>
+              <w:spacing w:after="0" w:line="260"/>
+            </w:pPr>
+            <w:r>
+              <w:rPr>
+                <w:rFonts w:ascii="Calibri" w:cs="Calibri" w:eastAsia="Calibri" w:hAnsi="Calibri"/>
+                <w:b/>
+                <w:bCs/>
+                <w:color w:val="1F2A37"/>
+                <w:sz w:val="18"/>
+                <w:szCs w:val="18"/>
+              </w:rPr>
+              <w:t xml:space="preserve">Total da exposição</w:t>
+            </w:r>
+          </w:p>
+        </w:tc>
+        <w:tc>
+          <w:tcPr>
+            <w:tcW w:type="dxa" w:w="1289"/>
+            <w:shd w:fill="FFFFFF" w:val="clear"/>
+            <w:tcMar>
+              <w:top w:type="dxa" w:w="90"/>
+              <w:left w:type="dxa" w:w="140"/>
+              <w:bottom w:type="dxa" w:w="90"/>
+              <w:right w:type="dxa" w:w="140"/>
+            </w:tcMar>
+            <w:vAlign w:val="center"/>
+          </w:tcPr>
+          <w:p>
+            <w:pPr>
+              <w:spacing w:after="0" w:line="260"/>
+            </w:pPr>
+          </w:p>
+        </w:tc>
+        <w:tc>
+          <w:tcPr>
+            <w:tcW w:type="dxa" w:w="1141"/>
+            <w:shd w:fill="FFFFFF" w:val="clear"/>
+            <w:tcMar>
+              <w:top w:type="dxa" w:w="90"/>
+              <w:left w:type="dxa" w:w="140"/>
+              <w:bottom w:type="dxa" w:w="90"/>
+              <w:right w:type="dxa" w:w="140"/>
+            </w:tcMar>
+            <w:vAlign w:val="center"/>
+          </w:tcPr>
+          <w:p>
+            <w:pPr>
+              <w:spacing w:after="0" w:line="260"/>
+            </w:pPr>
+            <w:r>
+              <w:rPr>
+                <w:rFonts w:ascii="Calibri" w:cs="Calibri" w:eastAsia="Calibri" w:hAnsi="Calibri"/>
+                <w:b/>
+                <w:bCs/>
+                <w:color w:val="1F2A37"/>
+                <w:sz w:val="18"/>
+                <w:szCs w:val="18"/>
+              </w:rPr>
+              <w:t xml:space="preserve">~47 min</w:t>
+            </w:r>
+          </w:p>
+        </w:tc>
+      </w:tr>
+      <w:tr>
+        <w:trPr>
+          <w:cantSplit/>
+        </w:trPr>
+        <w:tc>
+          <w:tcPr>
+            <w:tcW w:type="dxa" w:w="889"/>
+            <w:shd w:fill="F5F5F5" w:val="clear"/>
+            <w:tcMar>
+              <w:top w:type="dxa" w:w="90"/>
+              <w:left w:type="dxa" w:w="140"/>
+              <w:bottom w:type="dxa" w:w="90"/>
+              <w:right w:type="dxa" w:w="140"/>
+            </w:tcMar>
+            <w:vAlign w:val="center"/>
+          </w:tcPr>
+          <w:p>
+            <w:pPr>
+              <w:spacing w:after="0" w:line="260"/>
+            </w:pPr>
+            <w:r>
+              <w:rPr>
+                <w:rFonts w:ascii="Calibri" w:cs="Calibri" w:eastAsia="Calibri" w:hAnsi="Calibri"/>
+                <w:color w:val="1F2A37"/>
+                <w:sz w:val="18"/>
+                <w:szCs w:val="18"/>
+              </w:rPr>
+              <w:t xml:space="preserve">—</w:t>
+            </w:r>
+          </w:p>
+        </w:tc>
+        <w:tc>
+          <w:tcPr>
+            <w:tcW w:type="dxa" w:w="6031"/>
             <w:shd w:fill="F5F5F5" w:val="clear"/>
             <w:tcMar>
               <w:top w:type="dxa" w:w="90"/>
@@ -2744,7 +3002,7 @@
         </w:tc>
         <w:tc>
           <w:tcPr>
-            <w:tcW w:type="dxa" w:w="1729"/>
+            <w:tcW w:type="dxa" w:w="1289"/>
             <w:shd w:fill="F5F5F5" w:val="clear"/>
             <w:tcMar>
               <w:top w:type="dxa" w:w="90"/>
@@ -2771,28 +3029,28 @@
         </w:tc>
         <w:tc>
           <w:tcPr>
-            <w:tcW w:type="dxa" w:w="1526"/>
-            <w:shd w:fill="F5F5F5" w:val="clear"/>
-            <w:tcMar>
-              <w:top w:type="dxa" w:w="90"/>
-              <w:left w:type="dxa" w:w="140"/>
-              <w:bottom w:type="dxa" w:w="90"/>
-              <w:right w:type="dxa" w:w="140"/>
-            </w:tcMar>
-            <w:vAlign w:val="center"/>
-          </w:tcPr>
-          <w:p>
-            <w:pPr>
-              <w:spacing w:after="0" w:line="260"/>
-            </w:pPr>
-            <w:r>
-              <w:rPr>
-                <w:rFonts w:ascii="Calibri" w:cs="Calibri" w:eastAsia="Calibri" w:hAnsi="Calibri"/>
-                <w:color w:val="1F2A37"/>
-                <w:sz w:val="18"/>
-                <w:szCs w:val="18"/>
-              </w:rPr>
-              <w:t xml:space="preserve">~70 min</w:t>
+            <w:tcW w:type="dxa" w:w="1141"/>
+            <w:shd w:fill="F5F5F5" w:val="clear"/>
+            <w:tcMar>
+              <w:top w:type="dxa" w:w="90"/>
+              <w:left w:type="dxa" w:w="140"/>
+              <w:bottom w:type="dxa" w:w="90"/>
+              <w:right w:type="dxa" w:w="140"/>
+            </w:tcMar>
+            <w:vAlign w:val="center"/>
+          </w:tcPr>
+          <w:p>
+            <w:pPr>
+              <w:spacing w:after="0" w:line="260"/>
+            </w:pPr>
+            <w:r>
+              <w:rPr>
+                <w:rFonts w:ascii="Calibri" w:cs="Calibri" w:eastAsia="Calibri" w:hAnsi="Calibri"/>
+                <w:color w:val="1F2A37"/>
+                <w:sz w:val="18"/>
+                <w:szCs w:val="18"/>
+              </w:rPr>
+              <w:t xml:space="preserve">~65 min</w:t>
             </w:r>
           </w:p>
         </w:tc>
@@ -2838,8 +3096,8 @@
       </w:tblPr>
       <w:tblGrid>
         <w:gridCol w:w="1475"/>
-        <w:gridCol w:w="5002"/>
-        <w:gridCol w:w="2873"/>
+        <w:gridCol w:w="4909"/>
+        <w:gridCol w:w="2966"/>
       </w:tblGrid>
       <w:tr>
         <w:trPr>
@@ -2877,7 +3135,7 @@
         </w:tc>
         <w:tc>
           <w:tcPr>
-            <w:tcW w:type="dxa" w:w="5002"/>
+            <w:tcW w:type="dxa" w:w="4909"/>
             <w:shd w:fill="2F4162" w:val="clear"/>
             <w:tcMar>
               <w:top w:type="dxa" w:w="90"/>
@@ -2906,7 +3164,7 @@
         </w:tc>
         <w:tc>
           <w:tcPr>
-            <w:tcW w:type="dxa" w:w="2873"/>
+            <w:tcW w:type="dxa" w:w="2966"/>
             <w:shd w:fill="2F4162" w:val="clear"/>
             <w:tcMar>
               <w:top w:type="dxa" w:w="90"/>
@@ -2967,7 +3225,7 @@
         </w:tc>
         <w:tc>
           <w:tcPr>
-            <w:tcW w:type="dxa" w:w="5002"/>
+            <w:tcW w:type="dxa" w:w="4909"/>
             <w:shd w:fill="FFFFFF" w:val="clear"/>
             <w:tcMar>
               <w:top w:type="dxa" w:w="90"/>
@@ -2994,28 +3252,28 @@
         </w:tc>
         <w:tc>
           <w:tcPr>
-            <w:tcW w:type="dxa" w:w="2873"/>
-            <w:shd w:fill="FFFFFF" w:val="clear"/>
-            <w:tcMar>
-              <w:top w:type="dxa" w:w="90"/>
-              <w:left w:type="dxa" w:w="140"/>
-              <w:bottom w:type="dxa" w:w="90"/>
-              <w:right w:type="dxa" w:w="140"/>
-            </w:tcMar>
-            <w:vAlign w:val="center"/>
-          </w:tcPr>
-          <w:p>
-            <w:pPr>
-              <w:spacing w:after="0" w:line="260"/>
-            </w:pPr>
-            <w:r>
-              <w:rPr>
-                <w:rFonts w:ascii="Calibri" w:cs="Calibri" w:eastAsia="Calibri" w:hAnsi="Calibri"/>
-                <w:color w:val="1F2A37"/>
-                <w:sz w:val="18"/>
-                <w:szCs w:val="18"/>
-              </w:rPr>
-              <w:t xml:space="preserve">Slides 11, 13 e 16; carta de aceite já enviada</w:t>
+            <w:tcW w:type="dxa" w:w="2966"/>
+            <w:shd w:fill="FFFFFF" w:val="clear"/>
+            <w:tcMar>
+              <w:top w:type="dxa" w:w="90"/>
+              <w:left w:type="dxa" w:w="140"/>
+              <w:bottom w:type="dxa" w:w="90"/>
+              <w:right w:type="dxa" w:w="140"/>
+            </w:tcMar>
+            <w:vAlign w:val="center"/>
+          </w:tcPr>
+          <w:p>
+            <w:pPr>
+              <w:spacing w:after="0" w:line="260"/>
+            </w:pPr>
+            <w:r>
+              <w:rPr>
+                <w:rFonts w:ascii="Calibri" w:cs="Calibri" w:eastAsia="Calibri" w:hAnsi="Calibri"/>
+                <w:color w:val="1F2A37"/>
+                <w:sz w:val="18"/>
+                <w:szCs w:val="18"/>
+              </w:rPr>
+              <w:t xml:space="preserve">Slides 11, 13 e 19; carta de aceite já enviada</w:t>
             </w:r>
           </w:p>
         </w:tc>
@@ -3053,7 +3311,7 @@
         </w:tc>
         <w:tc>
           <w:tcPr>
-            <w:tcW w:type="dxa" w:w="5002"/>
+            <w:tcW w:type="dxa" w:w="4909"/>
             <w:shd w:fill="F5F5F5" w:val="clear"/>
             <w:tcMar>
               <w:top w:type="dxa" w:w="90"/>
@@ -3080,28 +3338,28 @@
         </w:tc>
         <w:tc>
           <w:tcPr>
-            <w:tcW w:type="dxa" w:w="2873"/>
-            <w:shd w:fill="F5F5F5" w:val="clear"/>
-            <w:tcMar>
-              <w:top w:type="dxa" w:w="90"/>
-              <w:left w:type="dxa" w:w="140"/>
-              <w:bottom w:type="dxa" w:w="90"/>
-              <w:right w:type="dxa" w:w="140"/>
-            </w:tcMar>
-            <w:vAlign w:val="center"/>
-          </w:tcPr>
-          <w:p>
-            <w:pPr>
-              <w:spacing w:after="0" w:line="260"/>
-            </w:pPr>
-            <w:r>
-              <w:rPr>
-                <w:rFonts w:ascii="Calibri" w:cs="Calibri" w:eastAsia="Calibri" w:hAnsi="Calibri"/>
-                <w:color w:val="1F2A37"/>
-                <w:sz w:val="18"/>
-                <w:szCs w:val="18"/>
-              </w:rPr>
-              <w:t xml:space="preserve">Slides 3, 9, 11, 14 e 15</w:t>
+            <w:tcW w:type="dxa" w:w="2966"/>
+            <w:shd w:fill="F5F5F5" w:val="clear"/>
+            <w:tcMar>
+              <w:top w:type="dxa" w:w="90"/>
+              <w:left w:type="dxa" w:w="140"/>
+              <w:bottom w:type="dxa" w:w="90"/>
+              <w:right w:type="dxa" w:w="140"/>
+            </w:tcMar>
+            <w:vAlign w:val="center"/>
+          </w:tcPr>
+          <w:p>
+            <w:pPr>
+              <w:spacing w:after="0" w:line="260"/>
+            </w:pPr>
+            <w:r>
+              <w:rPr>
+                <w:rFonts w:ascii="Calibri" w:cs="Calibri" w:eastAsia="Calibri" w:hAnsi="Calibri"/>
+                <w:color w:val="1F2A37"/>
+                <w:sz w:val="18"/>
+                <w:szCs w:val="18"/>
+              </w:rPr>
+              <w:t xml:space="preserve">Slides 3, 9, 11, 14, 15, 16 e 17</w:t>
             </w:r>
           </w:p>
         </w:tc>
@@ -3139,7 +3397,7 @@
         </w:tc>
         <w:tc>
           <w:tcPr>
-            <w:tcW w:type="dxa" w:w="5002"/>
+            <w:tcW w:type="dxa" w:w="4909"/>
             <w:shd w:fill="FFFFFF" w:val="clear"/>
             <w:tcMar>
               <w:top w:type="dxa" w:w="90"/>
@@ -3166,28 +3424,28 @@
         </w:tc>
         <w:tc>
           <w:tcPr>
-            <w:tcW w:type="dxa" w:w="2873"/>
-            <w:shd w:fill="FFFFFF" w:val="clear"/>
-            <w:tcMar>
-              <w:top w:type="dxa" w:w="90"/>
-              <w:left w:type="dxa" w:w="140"/>
-              <w:bottom w:type="dxa" w:w="90"/>
-              <w:right w:type="dxa" w:w="140"/>
-            </w:tcMar>
-            <w:vAlign w:val="center"/>
-          </w:tcPr>
-          <w:p>
-            <w:pPr>
-              <w:spacing w:after="0" w:line="260"/>
-            </w:pPr>
-            <w:r>
-              <w:rPr>
-                <w:rFonts w:ascii="Calibri" w:cs="Calibri" w:eastAsia="Calibri" w:hAnsi="Calibri"/>
-                <w:color w:val="1F2A37"/>
-                <w:sz w:val="18"/>
-                <w:szCs w:val="18"/>
-              </w:rPr>
-              <w:t xml:space="preserve">Slides 4, 10, 12 e 13</w:t>
+            <w:tcW w:type="dxa" w:w="2966"/>
+            <w:shd w:fill="FFFFFF" w:val="clear"/>
+            <w:tcMar>
+              <w:top w:type="dxa" w:w="90"/>
+              <w:left w:type="dxa" w:w="140"/>
+              <w:bottom w:type="dxa" w:w="90"/>
+              <w:right w:type="dxa" w:w="140"/>
+            </w:tcMar>
+            <w:vAlign w:val="center"/>
+          </w:tcPr>
+          <w:p>
+            <w:pPr>
+              <w:spacing w:after="0" w:line="260"/>
+            </w:pPr>
+            <w:r>
+              <w:rPr>
+                <w:rFonts w:ascii="Calibri" w:cs="Calibri" w:eastAsia="Calibri" w:hAnsi="Calibri"/>
+                <w:color w:val="1F2A37"/>
+                <w:sz w:val="18"/>
+                <w:szCs w:val="18"/>
+              </w:rPr>
+              <w:t xml:space="preserve">Slides 4, 10, 12, 13 e 18</w:t>
             </w:r>
           </w:p>
         </w:tc>
@@ -3495,6 +3753,70 @@
           <w:sz w:val="20"/>
           <w:szCs w:val="20"/>
         </w:rPr>
+        <w:t xml:space="preserve">Slides 16–18 (controles DF):</w:t>
+      </w:r>
+      <w:r>
+        <w:rPr>
+          <w:rFonts w:ascii="Calibri" w:cs="Calibri" w:eastAsia="Calibri" w:hAnsi="Calibri"/>
+          <w:color w:val="1F2A37"/>
+          <w:sz w:val="20"/>
+          <w:szCs w:val="20"/>
+        </w:rPr>
+        <w:t xml:space="preserve"> não citar clientes nem prédios dos relatórios técnicos — o slide diz que é por sigilo. Se pedirem para ver, oferecer uma versão anonimizada após a contratação.</w:t>
+      </w:r>
+    </w:p>
+    <w:p>
+      <w:pPr>
+        <w:pStyle w:val="ListParagraph"/>
+        <w:numPr>
+          <w:ilvl w:val="0"/>
+          <w:numId w:val="1"/>
+        </w:numPr>
+        <w:spacing w:after="110" w:line="290"/>
+        <w:ind w:left="360"/>
+        <w:jc w:val="both"/>
+      </w:pPr>
+      <w:r>
+        <w:rPr>
+          <w:rFonts w:ascii="Calibri" w:cs="Calibri" w:eastAsia="Calibri" w:hAnsi="Calibri"/>
+          <w:b/>
+          <w:bCs/>
+          <w:color w:val="1F2A37"/>
+          <w:sz w:val="20"/>
+          <w:szCs w:val="20"/>
+        </w:rPr>
+        <w:t xml:space="preserve">Slides de apoio ocultos (22 e 23):</w:t>
+      </w:r>
+      <w:r>
+        <w:rPr>
+          <w:rFonts w:ascii="Calibri" w:cs="Calibri" w:eastAsia="Calibri" w:hAnsi="Calibri"/>
+          <w:color w:val="1F2A37"/>
+          <w:sz w:val="20"/>
+          <w:szCs w:val="20"/>
+        </w:rPr>
+        <w:t xml:space="preserve"> no modo de apresentação, digite o número do slide e Enter para mostrá-los.</w:t>
+      </w:r>
+    </w:p>
+    <w:p>
+      <w:pPr>
+        <w:pStyle w:val="ListParagraph"/>
+        <w:numPr>
+          <w:ilvl w:val="0"/>
+          <w:numId w:val="1"/>
+        </w:numPr>
+        <w:spacing w:after="110" w:line="290"/>
+        <w:ind w:left="360"/>
+        <w:jc w:val="both"/>
+      </w:pPr>
+      <w:r>
+        <w:rPr>
+          <w:rFonts w:ascii="Calibri" w:cs="Calibri" w:eastAsia="Calibri" w:hAnsi="Calibri"/>
+          <w:b/>
+          <w:bCs/>
+          <w:color w:val="1F2A37"/>
+          <w:sz w:val="20"/>
+          <w:szCs w:val="20"/>
+        </w:rPr>
         <w:t xml:space="preserve">Pagamento em 90 dias e reajuste anual:</w:t>
       </w:r>
       <w:r>
@@ -3542,8 +3864,8 @@
       </w:tblPr>
       <w:tblGrid>
         <w:gridCol w:w="530"/>
-        <w:gridCol w:w="3897"/>
-        <w:gridCol w:w="4923"/>
+        <w:gridCol w:w="3917"/>
+        <w:gridCol w:w="4903"/>
       </w:tblGrid>
       <w:tr>
         <w:trPr>
@@ -3581,7 +3903,7 @@
         </w:tc>
         <w:tc>
           <w:tcPr>
-            <w:tcW w:type="dxa" w:w="3897"/>
+            <w:tcW w:type="dxa" w:w="3917"/>
             <w:shd w:fill="2F4162" w:val="clear"/>
             <w:tcMar>
               <w:top w:type="dxa" w:w="90"/>
@@ -3610,7 +3932,7 @@
         </w:tc>
         <w:tc>
           <w:tcPr>
-            <w:tcW w:type="dxa" w:w="4923"/>
+            <w:tcW w:type="dxa" w:w="4903"/>
             <w:shd w:fill="2F4162" w:val="clear"/>
             <w:tcMar>
               <w:top w:type="dxa" w:w="90"/>
@@ -3671,7 +3993,7 @@
         </w:tc>
         <w:tc>
           <w:tcPr>
-            <w:tcW w:type="dxa" w:w="3897"/>
+            <w:tcW w:type="dxa" w:w="3917"/>
             <w:shd w:fill="FFFFFF" w:val="clear"/>
             <w:tcMar>
               <w:top w:type="dxa" w:w="90"/>
@@ -3698,7 +4020,7 @@
         </w:tc>
         <w:tc>
           <w:tcPr>
-            <w:tcW w:type="dxa" w:w="4923"/>
+            <w:tcW w:type="dxa" w:w="4903"/>
             <w:shd w:fill="FFFFFF" w:val="clear"/>
             <w:tcMar>
               <w:top w:type="dxa" w:w="90"/>
@@ -3757,7 +4079,7 @@
         </w:tc>
         <w:tc>
           <w:tcPr>
-            <w:tcW w:type="dxa" w:w="3897"/>
+            <w:tcW w:type="dxa" w:w="3917"/>
             <w:shd w:fill="F5F5F5" w:val="clear"/>
             <w:tcMar>
               <w:top w:type="dxa" w:w="90"/>
@@ -3784,7 +4106,7 @@
         </w:tc>
         <w:tc>
           <w:tcPr>
-            <w:tcW w:type="dxa" w:w="4923"/>
+            <w:tcW w:type="dxa" w:w="4903"/>
             <w:shd w:fill="F5F5F5" w:val="clear"/>
             <w:tcMar>
               <w:top w:type="dxa" w:w="90"/>
@@ -3843,7 +4165,7 @@
         </w:tc>
         <w:tc>
           <w:tcPr>
-            <w:tcW w:type="dxa" w:w="3897"/>
+            <w:tcW w:type="dxa" w:w="3917"/>
             <w:shd w:fill="FFFFFF" w:val="clear"/>
             <w:tcMar>
               <w:top w:type="dxa" w:w="90"/>
@@ -3870,7 +4192,7 @@
         </w:tc>
         <w:tc>
           <w:tcPr>
-            <w:tcW w:type="dxa" w:w="4923"/>
+            <w:tcW w:type="dxa" w:w="4903"/>
             <w:shd w:fill="FFFFFF" w:val="clear"/>
             <w:tcMar>
               <w:top w:type="dxa" w:w="90"/>
@@ -3929,7 +4251,7 @@
         </w:tc>
         <w:tc>
           <w:tcPr>
-            <w:tcW w:type="dxa" w:w="3897"/>
+            <w:tcW w:type="dxa" w:w="3917"/>
             <w:shd w:fill="F5F5F5" w:val="clear"/>
             <w:tcMar>
               <w:top w:type="dxa" w:w="90"/>
@@ -3956,7 +4278,7 @@
         </w:tc>
         <w:tc>
           <w:tcPr>
-            <w:tcW w:type="dxa" w:w="4923"/>
+            <w:tcW w:type="dxa" w:w="4903"/>
             <w:shd w:fill="F5F5F5" w:val="clear"/>
             <w:tcMar>
               <w:top w:type="dxa" w:w="90"/>
@@ -4015,7 +4337,7 @@
         </w:tc>
         <w:tc>
           <w:tcPr>
-            <w:tcW w:type="dxa" w:w="3897"/>
+            <w:tcW w:type="dxa" w:w="3917"/>
             <w:shd w:fill="FFFFFF" w:val="clear"/>
             <w:tcMar>
               <w:top w:type="dxa" w:w="90"/>
@@ -4042,7 +4364,7 @@
         </w:tc>
         <w:tc>
           <w:tcPr>
-            <w:tcW w:type="dxa" w:w="4923"/>
+            <w:tcW w:type="dxa" w:w="4903"/>
             <w:shd w:fill="FFFFFF" w:val="clear"/>
             <w:tcMar>
               <w:top w:type="dxa" w:w="90"/>
@@ -4101,7 +4423,7 @@
         </w:tc>
         <w:tc>
           <w:tcPr>
-            <w:tcW w:type="dxa" w:w="3897"/>
+            <w:tcW w:type="dxa" w:w="3917"/>
             <w:shd w:fill="F5F5F5" w:val="clear"/>
             <w:tcMar>
               <w:top w:type="dxa" w:w="90"/>
@@ -4128,7 +4450,7 @@
         </w:tc>
         <w:tc>
           <w:tcPr>
-            <w:tcW w:type="dxa" w:w="4923"/>
+            <w:tcW w:type="dxa" w:w="4903"/>
             <w:shd w:fill="F5F5F5" w:val="clear"/>
             <w:tcMar>
               <w:top w:type="dxa" w:w="90"/>
@@ -4187,7 +4509,7 @@
         </w:tc>
         <w:tc>
           <w:tcPr>
-            <w:tcW w:type="dxa" w:w="3897"/>
+            <w:tcW w:type="dxa" w:w="3917"/>
             <w:shd w:fill="FFFFFF" w:val="clear"/>
             <w:tcMar>
               <w:top w:type="dxa" w:w="90"/>
@@ -4214,7 +4536,7 @@
         </w:tc>
         <w:tc>
           <w:tcPr>
-            <w:tcW w:type="dxa" w:w="4923"/>
+            <w:tcW w:type="dxa" w:w="4903"/>
             <w:shd w:fill="FFFFFF" w:val="clear"/>
             <w:tcMar>
               <w:top w:type="dxa" w:w="90"/>
@@ -4273,7 +4595,7 @@
         </w:tc>
         <w:tc>
           <w:tcPr>
-            <w:tcW w:type="dxa" w:w="3897"/>
+            <w:tcW w:type="dxa" w:w="3917"/>
             <w:shd w:fill="F5F5F5" w:val="clear"/>
             <w:tcMar>
               <w:top w:type="dxa" w:w="90"/>
@@ -4300,7 +4622,7 @@
         </w:tc>
         <w:tc>
           <w:tcPr>
-            <w:tcW w:type="dxa" w:w="4923"/>
+            <w:tcW w:type="dxa" w:w="4903"/>
             <w:shd w:fill="F5F5F5" w:val="clear"/>
             <w:tcMar>
               <w:top w:type="dxa" w:w="90"/>
@@ -4359,7 +4681,7 @@
         </w:tc>
         <w:tc>
           <w:tcPr>
-            <w:tcW w:type="dxa" w:w="3897"/>
+            <w:tcW w:type="dxa" w:w="3917"/>
             <w:shd w:fill="FFFFFF" w:val="clear"/>
             <w:tcMar>
               <w:top w:type="dxa" w:w="90"/>
@@ -4386,7 +4708,7 @@
         </w:tc>
         <w:tc>
           <w:tcPr>
-            <w:tcW w:type="dxa" w:w="4923"/>
+            <w:tcW w:type="dxa" w:w="4903"/>
             <w:shd w:fill="FFFFFF" w:val="clear"/>
             <w:tcMar>
               <w:top w:type="dxa" w:w="90"/>
@@ -4445,7 +4767,7 @@
         </w:tc>
         <w:tc>
           <w:tcPr>
-            <w:tcW w:type="dxa" w:w="3897"/>
+            <w:tcW w:type="dxa" w:w="3917"/>
             <w:shd w:fill="F5F5F5" w:val="clear"/>
             <w:tcMar>
               <w:top w:type="dxa" w:w="90"/>
@@ -4472,7 +4794,7 @@
         </w:tc>
         <w:tc>
           <w:tcPr>
-            <w:tcW w:type="dxa" w:w="4923"/>
+            <w:tcW w:type="dxa" w:w="4903"/>
             <w:shd w:fill="F5F5F5" w:val="clear"/>
             <w:tcMar>
               <w:top w:type="dxa" w:w="90"/>
@@ -4531,7 +4853,7 @@
         </w:tc>
         <w:tc>
           <w:tcPr>
-            <w:tcW w:type="dxa" w:w="3897"/>
+            <w:tcW w:type="dxa" w:w="3917"/>
             <w:shd w:fill="FFFFFF" w:val="clear"/>
             <w:tcMar>
               <w:top w:type="dxa" w:w="90"/>
@@ -4558,7 +4880,7 @@
         </w:tc>
         <w:tc>
           <w:tcPr>
-            <w:tcW w:type="dxa" w:w="4923"/>
+            <w:tcW w:type="dxa" w:w="4903"/>
             <w:shd w:fill="FFFFFF" w:val="clear"/>
             <w:tcMar>
               <w:top w:type="dxa" w:w="90"/>
@@ -4617,7 +4939,7 @@
         </w:tc>
         <w:tc>
           <w:tcPr>
-            <w:tcW w:type="dxa" w:w="3897"/>
+            <w:tcW w:type="dxa" w:w="3917"/>
             <w:shd w:fill="F5F5F5" w:val="clear"/>
             <w:tcMar>
               <w:top w:type="dxa" w:w="90"/>
@@ -4644,7 +4966,7 @@
         </w:tc>
         <w:tc>
           <w:tcPr>
-            <w:tcW w:type="dxa" w:w="4923"/>
+            <w:tcW w:type="dxa" w:w="4903"/>
             <w:shd w:fill="F5F5F5" w:val="clear"/>
             <w:tcMar>
               <w:top w:type="dxa" w:w="90"/>
@@ -4703,7 +5025,7 @@
         </w:tc>
         <w:tc>
           <w:tcPr>
-            <w:tcW w:type="dxa" w:w="3897"/>
+            <w:tcW w:type="dxa" w:w="3917"/>
             <w:shd w:fill="FFFFFF" w:val="clear"/>
             <w:tcMar>
               <w:top w:type="dxa" w:w="90"/>
@@ -4730,7 +5052,7 @@
         </w:tc>
         <w:tc>
           <w:tcPr>
-            <w:tcW w:type="dxa" w:w="4923"/>
+            <w:tcW w:type="dxa" w:w="4903"/>
             <w:shd w:fill="FFFFFF" w:val="clear"/>
             <w:tcMar>
               <w:top w:type="dxa" w:w="90"/>
@@ -4789,7 +5111,7 @@
         </w:tc>
         <w:tc>
           <w:tcPr>
-            <w:tcW w:type="dxa" w:w="3897"/>
+            <w:tcW w:type="dxa" w:w="3917"/>
             <w:shd w:fill="F5F5F5" w:val="clear"/>
             <w:tcMar>
               <w:top w:type="dxa" w:w="90"/>
@@ -4816,28 +5138,28 @@
         </w:tc>
         <w:tc>
           <w:tcPr>
-            <w:tcW w:type="dxa" w:w="4923"/>
-            <w:shd w:fill="F5F5F5" w:val="clear"/>
-            <w:tcMar>
-              <w:top w:type="dxa" w:w="90"/>
-              <w:left w:type="dxa" w:w="140"/>
-              <w:bottom w:type="dxa" w:w="90"/>
-              <w:right w:type="dxa" w:w="140"/>
-            </w:tcMar>
-            <w:vAlign w:val="center"/>
-          </w:tcPr>
-          <w:p>
-            <w:pPr>
-              <w:spacing w:after="0" w:line="260"/>
-            </w:pPr>
-            <w:r>
-              <w:rPr>
-                <w:rFonts w:ascii="Calibri" w:cs="Calibri" w:eastAsia="Calibri" w:hAnsi="Calibri"/>
-                <w:color w:val="1F2A37"/>
-                <w:sz w:val="18"/>
-                <w:szCs w:val="18"/>
-              </w:rPr>
-              <w:t xml:space="preserve">Ata de eleição e procurações, convenção, contratos, 12 meses de prestação de contas, contatos e as alçadas internas (slide de apoio 20).</w:t>
+            <w:tcW w:type="dxa" w:w="4903"/>
+            <w:shd w:fill="F5F5F5" w:val="clear"/>
+            <w:tcMar>
+              <w:top w:type="dxa" w:w="90"/>
+              <w:left w:type="dxa" w:w="140"/>
+              <w:bottom w:type="dxa" w:w="90"/>
+              <w:right w:type="dxa" w:w="140"/>
+            </w:tcMar>
+            <w:vAlign w:val="center"/>
+          </w:tcPr>
+          <w:p>
+            <w:pPr>
+              <w:spacing w:after="0" w:line="260"/>
+            </w:pPr>
+            <w:r>
+              <w:rPr>
+                <w:rFonts w:ascii="Calibri" w:cs="Calibri" w:eastAsia="Calibri" w:hAnsi="Calibri"/>
+                <w:color w:val="1F2A37"/>
+                <w:sz w:val="18"/>
+                <w:szCs w:val="18"/>
+              </w:rPr>
+              <w:t xml:space="preserve">Ata de eleição e procurações, convenção, contratos, 12 meses de prestação de contas, contatos e as alçadas internas (slide de apoio 23, oculto).</w:t>
             </w:r>
           </w:p>
         </w:tc>
@@ -4875,7 +5197,7 @@
         </w:tc>
         <w:tc>
           <w:tcPr>
-            <w:tcW w:type="dxa" w:w="3897"/>
+            <w:tcW w:type="dxa" w:w="3917"/>
             <w:shd w:fill="FFFFFF" w:val="clear"/>
             <w:tcMar>
               <w:top w:type="dxa" w:w="90"/>
@@ -4902,7 +5224,7 @@
         </w:tc>
         <w:tc>
           <w:tcPr>
-            <w:tcW w:type="dxa" w:w="4923"/>
+            <w:tcW w:type="dxa" w:w="4903"/>
             <w:shd w:fill="FFFFFF" w:val="clear"/>
             <w:tcMar>
               <w:top w:type="dxa" w:w="90"/>
@@ -4924,6 +5246,178 @@
                 <w:szCs w:val="18"/>
               </w:rPr>
               <w:t xml:space="preserve">Primeiro relatório executivo em D+30 e, se a Previsão Orçamentária 2027 ainda não estiver aprovada, sua revisão com prioridade.</w:t>
+            </w:r>
+          </w:p>
+        </w:tc>
+      </w:tr>
+      <w:tr>
+        <w:trPr>
+          <w:cantSplit/>
+        </w:trPr>
+        <w:tc>
+          <w:tcPr>
+            <w:tcW w:type="dxa" w:w="530"/>
+            <w:shd w:fill="F5F5F5" w:val="clear"/>
+            <w:tcMar>
+              <w:top w:type="dxa" w:w="90"/>
+              <w:left w:type="dxa" w:w="140"/>
+              <w:bottom w:type="dxa" w:w="90"/>
+              <w:right w:type="dxa" w:w="140"/>
+            </w:tcMar>
+            <w:vAlign w:val="center"/>
+          </w:tcPr>
+          <w:p>
+            <w:pPr>
+              <w:spacing w:after="0" w:line="260"/>
+            </w:pPr>
+            <w:r>
+              <w:rPr>
+                <w:rFonts w:ascii="Calibri" w:cs="Calibri" w:eastAsia="Calibri" w:hAnsi="Calibri"/>
+                <w:color w:val="1F2A37"/>
+                <w:sz w:val="18"/>
+                <w:szCs w:val="18"/>
+              </w:rPr>
+              <w:t xml:space="preserve">16</w:t>
+            </w:r>
+          </w:p>
+        </w:tc>
+        <w:tc>
+          <w:tcPr>
+            <w:tcW w:type="dxa" w:w="3917"/>
+            <w:shd w:fill="F5F5F5" w:val="clear"/>
+            <w:tcMar>
+              <w:top w:type="dxa" w:w="90"/>
+              <w:left w:type="dxa" w:w="140"/>
+              <w:bottom w:type="dxa" w:w="90"/>
+              <w:right w:type="dxa" w:w="140"/>
+            </w:tcMar>
+            <w:vAlign w:val="center"/>
+          </w:tcPr>
+          <w:p>
+            <w:pPr>
+              <w:spacing w:after="0" w:line="260"/>
+            </w:pPr>
+            <w:r>
+              <w:rPr>
+                <w:rFonts w:ascii="Calibri" w:cs="Calibri" w:eastAsia="Calibri" w:hAnsi="Calibri"/>
+                <w:color w:val="1F2A37"/>
+                <w:sz w:val="18"/>
+                <w:szCs w:val="18"/>
+              </w:rPr>
+              <w:t xml:space="preserve">O Einstein vai precisar usar o sistema de vocês?</w:t>
+            </w:r>
+          </w:p>
+        </w:tc>
+        <w:tc>
+          <w:tcPr>
+            <w:tcW w:type="dxa" w:w="4903"/>
+            <w:shd w:fill="F5F5F5" w:val="clear"/>
+            <w:tcMar>
+              <w:top w:type="dxa" w:w="90"/>
+              <w:left w:type="dxa" w:w="140"/>
+              <w:bottom w:type="dxa" w:w="90"/>
+              <w:right w:type="dxa" w:w="140"/>
+            </w:tcMar>
+            <w:vAlign w:val="center"/>
+          </w:tcPr>
+          <w:p>
+            <w:pPr>
+              <w:spacing w:after="0" w:line="260"/>
+            </w:pPr>
+            <w:r>
+              <w:rPr>
+                <w:rFonts w:ascii="Calibri" w:cs="Calibri" w:eastAsia="Calibri" w:hAnsi="Calibri"/>
+                <w:color w:val="1F2A37"/>
+                <w:sz w:val="18"/>
+                <w:szCs w:val="18"/>
+              </w:rPr>
+              <w:t xml:space="preserve">Não. O Boletim e as rotinas são ferramentas da DF; o Einstein recebe os resultados nos relatórios e pareceres, pelos canais que autorizar.</w:t>
+            </w:r>
+          </w:p>
+        </w:tc>
+      </w:tr>
+      <w:tr>
+        <w:trPr>
+          <w:cantSplit/>
+        </w:trPr>
+        <w:tc>
+          <w:tcPr>
+            <w:tcW w:type="dxa" w:w="530"/>
+            <w:shd w:fill="FFFFFF" w:val="clear"/>
+            <w:tcMar>
+              <w:top w:type="dxa" w:w="90"/>
+              <w:left w:type="dxa" w:w="140"/>
+              <w:bottom w:type="dxa" w:w="90"/>
+              <w:right w:type="dxa" w:w="140"/>
+            </w:tcMar>
+            <w:vAlign w:val="center"/>
+          </w:tcPr>
+          <w:p>
+            <w:pPr>
+              <w:spacing w:after="0" w:line="260"/>
+            </w:pPr>
+            <w:r>
+              <w:rPr>
+                <w:rFonts w:ascii="Calibri" w:cs="Calibri" w:eastAsia="Calibri" w:hAnsi="Calibri"/>
+                <w:color w:val="1F2A37"/>
+                <w:sz w:val="18"/>
+                <w:szCs w:val="18"/>
+              </w:rPr>
+              <w:t xml:space="preserve">17</w:t>
+            </w:r>
+          </w:p>
+        </w:tc>
+        <w:tc>
+          <w:tcPr>
+            <w:tcW w:type="dxa" w:w="3917"/>
+            <w:shd w:fill="FFFFFF" w:val="clear"/>
+            <w:tcMar>
+              <w:top w:type="dxa" w:w="90"/>
+              <w:left w:type="dxa" w:w="140"/>
+              <w:bottom w:type="dxa" w:w="90"/>
+              <w:right w:type="dxa" w:w="140"/>
+            </w:tcMar>
+            <w:vAlign w:val="center"/>
+          </w:tcPr>
+          <w:p>
+            <w:pPr>
+              <w:spacing w:after="0" w:line="260"/>
+            </w:pPr>
+            <w:r>
+              <w:rPr>
+                <w:rFonts w:ascii="Calibri" w:cs="Calibri" w:eastAsia="Calibri" w:hAnsi="Calibri"/>
+                <w:color w:val="1F2A37"/>
+                <w:sz w:val="18"/>
+                <w:szCs w:val="18"/>
+              </w:rPr>
+              <w:t xml:space="preserve">Esses sistemas são da DF ou de terceiros?</w:t>
+            </w:r>
+          </w:p>
+        </w:tc>
+        <w:tc>
+          <w:tcPr>
+            <w:tcW w:type="dxa" w:w="4903"/>
+            <w:shd w:fill="FFFFFF" w:val="clear"/>
+            <w:tcMar>
+              <w:top w:type="dxa" w:w="90"/>
+              <w:left w:type="dxa" w:w="140"/>
+              <w:bottom w:type="dxa" w:w="90"/>
+              <w:right w:type="dxa" w:w="140"/>
+            </w:tcMar>
+            <w:vAlign w:val="center"/>
+          </w:tcPr>
+          <w:p>
+            <w:pPr>
+              <w:spacing w:after="0" w:line="260"/>
+            </w:pPr>
+            <w:r>
+              <w:rPr>
+                <w:rFonts w:ascii="Calibri" w:cs="Calibri" w:eastAsia="Calibri" w:hAnsi="Calibri"/>
+                <w:color w:val="1F2A37"/>
+                <w:sz w:val="18"/>
+                <w:szCs w:val="18"/>
+              </w:rPr>
+              <w:t xml:space="preserve">Desenvolvidos pela DF e em operação nos condomínios que administramos.</w:t>
             </w:r>
           </w:p>
         </w:tc>

</xml_diff>

<commit_message>
Retira 'em operação' dos sistemas DF na apresentação e nos relatórios
Co-Authored-By: Claude Opus 5.5 <noreply@anthropic.com>
Claude-Session: https://claude.ai/code/session_01EsMNgjuF6bLvLuQZ87HmRr
</commit_message>
<xml_diff>
--- a/entregas/apresentacao-13-10/DF_Dossie_Interno_Apresentacao_Einstein.docx
+++ b/entregas/apresentacao-13-10/DF_Dossie_Interno_Apresentacao_Einstein.docx
@@ -1088,7 +1088,7 @@
           <w:sz w:val="20"/>
           <w:szCs w:val="20"/>
         </w:rPr>
-        <w:t xml:space="preserve"> Boletim Diário, rotinas automáticas e relatórios técnicos — tudo em operação.</w:t>
+        <w:t xml:space="preserve"> Boletim Diário, rotinas automáticas e relatórios técnicos.</w:t>
       </w:r>
     </w:p>
     <w:p>
@@ -3762,7 +3762,7 @@
           <w:sz w:val="20"/>
           <w:szCs w:val="20"/>
         </w:rPr>
-        <w:t xml:space="preserve"> não citar clientes nem prédios dos relatórios técnicos — o slide diz que é por sigilo. Se pedirem para ver, oferecer uma versão anonimizada após a contratação.</w:t>
+        <w:t xml:space="preserve"> não afirmar há quanto tempo estão em uso nem em quantos condomínios; não citar clientes nem prédios dos relatórios técnicos — o slide diz que é por sigilo. Se pedirem para ver, oferecer uma versão anonimizada após a contratação.</w:t>
       </w:r>
     </w:p>
     <w:p>
@@ -5417,7 +5417,7 @@
                 <w:sz w:val="18"/>
                 <w:szCs w:val="18"/>
               </w:rPr>
-              <w:t xml:space="preserve">Desenvolvidos pela DF e em operação nos condomínios que administramos.</w:t>
+              <w:t xml:space="preserve">Desenvolvidos pela DF.</w:t>
             </w:r>
           </w:p>
         </w:tc>

</xml_diff>

<commit_message>
Troca 'Por que a DF' por três slides: comparativo de modelos, três respostas e ganhos em 90 dias
Co-Authored-By: Claude Opus 5.5 <noreply@anthropic.com>
Claude-Session: https://claude.ai/code/session_01EsMNgjuF6bLvLuQZ87HmRr
</commit_message>
<xml_diff>
--- a/entregas/apresentacao-13-10/DF_Dossie_Interno_Apresentacao_Einstein.docx
+++ b/entregas/apresentacao-13-10/DF_Dossie_Interno_Apresentacao_Einstein.docx
@@ -867,7 +867,7 @@
                 <w:sz w:val="18"/>
                 <w:szCs w:val="18"/>
               </w:rPr>
-              <w:t xml:space="preserve">Apresentação PowerPoint (23 slides: 21 de exposição + 2 de apoio ocultos, que só aparecem se você navegar até eles); relatório executivo para enviar depois</w:t>
+              <w:t xml:space="preserve">Apresentação PowerPoint (25 slides: 23 de exposição + 2 de apoio ocultos, que só aparecem se você navegar até eles); relatório executivo para enviar depois</w:t>
             </w:r>
           </w:p>
         </w:tc>
@@ -1125,10 +1125,10 @@
         </w:tblBorders>
       </w:tblPr>
       <w:tblGrid>
-        <w:gridCol w:w="889"/>
-        <w:gridCol w:w="6031"/>
-        <w:gridCol w:w="1289"/>
-        <w:gridCol w:w="1141"/>
+        <w:gridCol w:w="864"/>
+        <w:gridCol w:w="6140"/>
+        <w:gridCol w:w="1245"/>
+        <w:gridCol w:w="1101"/>
       </w:tblGrid>
       <w:tr>
         <w:trPr>
@@ -1137,7 +1137,7 @@
         </w:trPr>
         <w:tc>
           <w:tcPr>
-            <w:tcW w:type="dxa" w:w="889"/>
+            <w:tcW w:type="dxa" w:w="864"/>
             <w:shd w:fill="2F4162" w:val="clear"/>
             <w:tcMar>
               <w:top w:type="dxa" w:w="90"/>
@@ -1166,7 +1166,7 @@
         </w:tc>
         <w:tc>
           <w:tcPr>
-            <w:tcW w:type="dxa" w:w="6031"/>
+            <w:tcW w:type="dxa" w:w="6140"/>
             <w:shd w:fill="2F4162" w:val="clear"/>
             <w:tcMar>
               <w:top w:type="dxa" w:w="90"/>
@@ -1195,7 +1195,7 @@
         </w:tc>
         <w:tc>
           <w:tcPr>
-            <w:tcW w:type="dxa" w:w="1289"/>
+            <w:tcW w:type="dxa" w:w="1245"/>
             <w:shd w:fill="2F4162" w:val="clear"/>
             <w:tcMar>
               <w:top w:type="dxa" w:w="90"/>
@@ -1224,7 +1224,7 @@
         </w:tc>
         <w:tc>
           <w:tcPr>
-            <w:tcW w:type="dxa" w:w="1141"/>
+            <w:tcW w:type="dxa" w:w="1101"/>
             <w:shd w:fill="2F4162" w:val="clear"/>
             <w:tcMar>
               <w:top w:type="dxa" w:w="90"/>
@@ -1258,7 +1258,7 @@
         </w:trPr>
         <w:tc>
           <w:tcPr>
-            <w:tcW w:type="dxa" w:w="889"/>
+            <w:tcW w:type="dxa" w:w="864"/>
             <w:shd w:fill="FFFFFF" w:val="clear"/>
             <w:tcMar>
               <w:top w:type="dxa" w:w="90"/>
@@ -1285,7 +1285,7 @@
         </w:tc>
         <w:tc>
           <w:tcPr>
-            <w:tcW w:type="dxa" w:w="6031"/>
+            <w:tcW w:type="dxa" w:w="6140"/>
             <w:shd w:fill="FFFFFF" w:val="clear"/>
             <w:tcMar>
               <w:top w:type="dxa" w:w="90"/>
@@ -1312,7 +1312,7 @@
         </w:tc>
         <w:tc>
           <w:tcPr>
-            <w:tcW w:type="dxa" w:w="1289"/>
+            <w:tcW w:type="dxa" w:w="1245"/>
             <w:shd w:fill="FFFFFF" w:val="clear"/>
             <w:tcMar>
               <w:top w:type="dxa" w:w="90"/>
@@ -1339,7 +1339,7 @@
         </w:tc>
         <w:tc>
           <w:tcPr>
-            <w:tcW w:type="dxa" w:w="1141"/>
+            <w:tcW w:type="dxa" w:w="1101"/>
             <w:shd w:fill="FFFFFF" w:val="clear"/>
             <w:tcMar>
               <w:top w:type="dxa" w:w="90"/>
@@ -1371,7 +1371,7 @@
         </w:trPr>
         <w:tc>
           <w:tcPr>
-            <w:tcW w:type="dxa" w:w="889"/>
+            <w:tcW w:type="dxa" w:w="864"/>
             <w:shd w:fill="F5F5F5" w:val="clear"/>
             <w:tcMar>
               <w:top w:type="dxa" w:w="90"/>
@@ -1398,7 +1398,7 @@
         </w:tc>
         <w:tc>
           <w:tcPr>
-            <w:tcW w:type="dxa" w:w="6031"/>
+            <w:tcW w:type="dxa" w:w="6140"/>
             <w:shd w:fill="F5F5F5" w:val="clear"/>
             <w:tcMar>
               <w:top w:type="dxa" w:w="90"/>
@@ -1425,7 +1425,7 @@
         </w:tc>
         <w:tc>
           <w:tcPr>
-            <w:tcW w:type="dxa" w:w="1289"/>
+            <w:tcW w:type="dxa" w:w="1245"/>
             <w:shd w:fill="F5F5F5" w:val="clear"/>
             <w:tcMar>
               <w:top w:type="dxa" w:w="90"/>
@@ -1452,7 +1452,7 @@
         </w:tc>
         <w:tc>
           <w:tcPr>
-            <w:tcW w:type="dxa" w:w="1141"/>
+            <w:tcW w:type="dxa" w:w="1101"/>
             <w:shd w:fill="F5F5F5" w:val="clear"/>
             <w:tcMar>
               <w:top w:type="dxa" w:w="90"/>
@@ -1484,7 +1484,7 @@
         </w:trPr>
         <w:tc>
           <w:tcPr>
-            <w:tcW w:type="dxa" w:w="889"/>
+            <w:tcW w:type="dxa" w:w="864"/>
             <w:shd w:fill="FFFFFF" w:val="clear"/>
             <w:tcMar>
               <w:top w:type="dxa" w:w="90"/>
@@ -1511,7 +1511,7 @@
         </w:tc>
         <w:tc>
           <w:tcPr>
-            <w:tcW w:type="dxa" w:w="6031"/>
+            <w:tcW w:type="dxa" w:w="6140"/>
             <w:shd w:fill="FFFFFF" w:val="clear"/>
             <w:tcMar>
               <w:top w:type="dxa" w:w="90"/>
@@ -1538,7 +1538,7 @@
         </w:tc>
         <w:tc>
           <w:tcPr>
-            <w:tcW w:type="dxa" w:w="1289"/>
+            <w:tcW w:type="dxa" w:w="1245"/>
             <w:shd w:fill="FFFFFF" w:val="clear"/>
             <w:tcMar>
               <w:top w:type="dxa" w:w="90"/>
@@ -1565,7 +1565,7 @@
         </w:tc>
         <w:tc>
           <w:tcPr>
-            <w:tcW w:type="dxa" w:w="1141"/>
+            <w:tcW w:type="dxa" w:w="1101"/>
             <w:shd w:fill="FFFFFF" w:val="clear"/>
             <w:tcMar>
               <w:top w:type="dxa" w:w="90"/>
@@ -1597,7 +1597,7 @@
         </w:trPr>
         <w:tc>
           <w:tcPr>
-            <w:tcW w:type="dxa" w:w="889"/>
+            <w:tcW w:type="dxa" w:w="864"/>
             <w:shd w:fill="F5F5F5" w:val="clear"/>
             <w:tcMar>
               <w:top w:type="dxa" w:w="90"/>
@@ -1624,7 +1624,7 @@
         </w:tc>
         <w:tc>
           <w:tcPr>
-            <w:tcW w:type="dxa" w:w="6031"/>
+            <w:tcW w:type="dxa" w:w="6140"/>
             <w:shd w:fill="F5F5F5" w:val="clear"/>
             <w:tcMar>
               <w:top w:type="dxa" w:w="90"/>
@@ -1651,7 +1651,7 @@
         </w:tc>
         <w:tc>
           <w:tcPr>
-            <w:tcW w:type="dxa" w:w="1289"/>
+            <w:tcW w:type="dxa" w:w="1245"/>
             <w:shd w:fill="F5F5F5" w:val="clear"/>
             <w:tcMar>
               <w:top w:type="dxa" w:w="90"/>
@@ -1678,7 +1678,7 @@
         </w:tc>
         <w:tc>
           <w:tcPr>
-            <w:tcW w:type="dxa" w:w="1141"/>
+            <w:tcW w:type="dxa" w:w="1101"/>
             <w:shd w:fill="F5F5F5" w:val="clear"/>
             <w:tcMar>
               <w:top w:type="dxa" w:w="90"/>
@@ -1710,7 +1710,7 @@
         </w:trPr>
         <w:tc>
           <w:tcPr>
-            <w:tcW w:type="dxa" w:w="889"/>
+            <w:tcW w:type="dxa" w:w="864"/>
             <w:shd w:fill="FFFFFF" w:val="clear"/>
             <w:tcMar>
               <w:top w:type="dxa" w:w="90"/>
@@ -1737,7 +1737,7 @@
         </w:tc>
         <w:tc>
           <w:tcPr>
-            <w:tcW w:type="dxa" w:w="6031"/>
+            <w:tcW w:type="dxa" w:w="6140"/>
             <w:shd w:fill="FFFFFF" w:val="clear"/>
             <w:tcMar>
               <w:top w:type="dxa" w:w="90"/>
@@ -1764,7 +1764,7 @@
         </w:tc>
         <w:tc>
           <w:tcPr>
-            <w:tcW w:type="dxa" w:w="1289"/>
+            <w:tcW w:type="dxa" w:w="1245"/>
             <w:shd w:fill="FFFFFF" w:val="clear"/>
             <w:tcMar>
               <w:top w:type="dxa" w:w="90"/>
@@ -1791,7 +1791,7 @@
         </w:tc>
         <w:tc>
           <w:tcPr>
-            <w:tcW w:type="dxa" w:w="1141"/>
+            <w:tcW w:type="dxa" w:w="1101"/>
             <w:shd w:fill="FFFFFF" w:val="clear"/>
             <w:tcMar>
               <w:top w:type="dxa" w:w="90"/>
@@ -1823,7 +1823,7 @@
         </w:trPr>
         <w:tc>
           <w:tcPr>
-            <w:tcW w:type="dxa" w:w="889"/>
+            <w:tcW w:type="dxa" w:w="864"/>
             <w:shd w:fill="F5F5F5" w:val="clear"/>
             <w:tcMar>
               <w:top w:type="dxa" w:w="90"/>
@@ -1850,7 +1850,7 @@
         </w:tc>
         <w:tc>
           <w:tcPr>
-            <w:tcW w:type="dxa" w:w="6031"/>
+            <w:tcW w:type="dxa" w:w="6140"/>
             <w:shd w:fill="F5F5F5" w:val="clear"/>
             <w:tcMar>
               <w:top w:type="dxa" w:w="90"/>
@@ -1877,7 +1877,7 @@
         </w:tc>
         <w:tc>
           <w:tcPr>
-            <w:tcW w:type="dxa" w:w="1289"/>
+            <w:tcW w:type="dxa" w:w="1245"/>
             <w:shd w:fill="F5F5F5" w:val="clear"/>
             <w:tcMar>
               <w:top w:type="dxa" w:w="90"/>
@@ -1904,7 +1904,7 @@
         </w:tc>
         <w:tc>
           <w:tcPr>
-            <w:tcW w:type="dxa" w:w="1141"/>
+            <w:tcW w:type="dxa" w:w="1101"/>
             <w:shd w:fill="F5F5F5" w:val="clear"/>
             <w:tcMar>
               <w:top w:type="dxa" w:w="90"/>
@@ -1936,7 +1936,7 @@
         </w:trPr>
         <w:tc>
           <w:tcPr>
-            <w:tcW w:type="dxa" w:w="889"/>
+            <w:tcW w:type="dxa" w:w="864"/>
             <w:shd w:fill="FFFFFF" w:val="clear"/>
             <w:tcMar>
               <w:top w:type="dxa" w:w="90"/>
@@ -1963,7 +1963,7 @@
         </w:tc>
         <w:tc>
           <w:tcPr>
-            <w:tcW w:type="dxa" w:w="6031"/>
+            <w:tcW w:type="dxa" w:w="6140"/>
             <w:shd w:fill="FFFFFF" w:val="clear"/>
             <w:tcMar>
               <w:top w:type="dxa" w:w="90"/>
@@ -1990,7 +1990,7 @@
         </w:tc>
         <w:tc>
           <w:tcPr>
-            <w:tcW w:type="dxa" w:w="1289"/>
+            <w:tcW w:type="dxa" w:w="1245"/>
             <w:shd w:fill="FFFFFF" w:val="clear"/>
             <w:tcMar>
               <w:top w:type="dxa" w:w="90"/>
@@ -2017,7 +2017,7 @@
         </w:tc>
         <w:tc>
           <w:tcPr>
-            <w:tcW w:type="dxa" w:w="1141"/>
+            <w:tcW w:type="dxa" w:w="1101"/>
             <w:shd w:fill="FFFFFF" w:val="clear"/>
             <w:tcMar>
               <w:top w:type="dxa" w:w="90"/>
@@ -2049,7 +2049,7 @@
         </w:trPr>
         <w:tc>
           <w:tcPr>
-            <w:tcW w:type="dxa" w:w="889"/>
+            <w:tcW w:type="dxa" w:w="864"/>
             <w:shd w:fill="F5F5F5" w:val="clear"/>
             <w:tcMar>
               <w:top w:type="dxa" w:w="90"/>
@@ -2076,7 +2076,7 @@
         </w:tc>
         <w:tc>
           <w:tcPr>
-            <w:tcW w:type="dxa" w:w="6031"/>
+            <w:tcW w:type="dxa" w:w="6140"/>
             <w:shd w:fill="F5F5F5" w:val="clear"/>
             <w:tcMar>
               <w:top w:type="dxa" w:w="90"/>
@@ -2103,7 +2103,7 @@
         </w:tc>
         <w:tc>
           <w:tcPr>
-            <w:tcW w:type="dxa" w:w="1289"/>
+            <w:tcW w:type="dxa" w:w="1245"/>
             <w:shd w:fill="F5F5F5" w:val="clear"/>
             <w:tcMar>
               <w:top w:type="dxa" w:w="90"/>
@@ -2130,7 +2130,7 @@
         </w:tc>
         <w:tc>
           <w:tcPr>
-            <w:tcW w:type="dxa" w:w="1141"/>
+            <w:tcW w:type="dxa" w:w="1101"/>
             <w:shd w:fill="F5F5F5" w:val="clear"/>
             <w:tcMar>
               <w:top w:type="dxa" w:w="90"/>
@@ -2162,7 +2162,7 @@
         </w:trPr>
         <w:tc>
           <w:tcPr>
-            <w:tcW w:type="dxa" w:w="889"/>
+            <w:tcW w:type="dxa" w:w="864"/>
             <w:shd w:fill="FFFFFF" w:val="clear"/>
             <w:tcMar>
               <w:top w:type="dxa" w:w="90"/>
@@ -2189,7 +2189,7 @@
         </w:tc>
         <w:tc>
           <w:tcPr>
-            <w:tcW w:type="dxa" w:w="6031"/>
+            <w:tcW w:type="dxa" w:w="6140"/>
             <w:shd w:fill="FFFFFF" w:val="clear"/>
             <w:tcMar>
               <w:top w:type="dxa" w:w="90"/>
@@ -2216,7 +2216,7 @@
         </w:tc>
         <w:tc>
           <w:tcPr>
-            <w:tcW w:type="dxa" w:w="1289"/>
+            <w:tcW w:type="dxa" w:w="1245"/>
             <w:shd w:fill="FFFFFF" w:val="clear"/>
             <w:tcMar>
               <w:top w:type="dxa" w:w="90"/>
@@ -2243,7 +2243,7 @@
         </w:tc>
         <w:tc>
           <w:tcPr>
-            <w:tcW w:type="dxa" w:w="1141"/>
+            <w:tcW w:type="dxa" w:w="1101"/>
             <w:shd w:fill="FFFFFF" w:val="clear"/>
             <w:tcMar>
               <w:top w:type="dxa" w:w="90"/>
@@ -2275,7 +2275,7 @@
         </w:trPr>
         <w:tc>
           <w:tcPr>
-            <w:tcW w:type="dxa" w:w="889"/>
+            <w:tcW w:type="dxa" w:w="864"/>
             <w:shd w:fill="F5F5F5" w:val="clear"/>
             <w:tcMar>
               <w:top w:type="dxa" w:w="90"/>
@@ -2302,7 +2302,7 @@
         </w:tc>
         <w:tc>
           <w:tcPr>
-            <w:tcW w:type="dxa" w:w="6031"/>
+            <w:tcW w:type="dxa" w:w="6140"/>
             <w:shd w:fill="F5F5F5" w:val="clear"/>
             <w:tcMar>
               <w:top w:type="dxa" w:w="90"/>
@@ -2329,7 +2329,7 @@
         </w:tc>
         <w:tc>
           <w:tcPr>
-            <w:tcW w:type="dxa" w:w="1289"/>
+            <w:tcW w:type="dxa" w:w="1245"/>
             <w:shd w:fill="F5F5F5" w:val="clear"/>
             <w:tcMar>
               <w:top w:type="dxa" w:w="90"/>
@@ -2356,7 +2356,7 @@
         </w:tc>
         <w:tc>
           <w:tcPr>
-            <w:tcW w:type="dxa" w:w="1141"/>
+            <w:tcW w:type="dxa" w:w="1101"/>
             <w:shd w:fill="F5F5F5" w:val="clear"/>
             <w:tcMar>
               <w:top w:type="dxa" w:w="90"/>
@@ -2388,7 +2388,7 @@
         </w:trPr>
         <w:tc>
           <w:tcPr>
-            <w:tcW w:type="dxa" w:w="889"/>
+            <w:tcW w:type="dxa" w:w="864"/>
             <w:shd w:fill="FFFFFF" w:val="clear"/>
             <w:tcMar>
               <w:top w:type="dxa" w:w="90"/>
@@ -2415,7 +2415,7 @@
         </w:tc>
         <w:tc>
           <w:tcPr>
-            <w:tcW w:type="dxa" w:w="6031"/>
+            <w:tcW w:type="dxa" w:w="6140"/>
             <w:shd w:fill="FFFFFF" w:val="clear"/>
             <w:tcMar>
               <w:top w:type="dxa" w:w="90"/>
@@ -2442,7 +2442,7 @@
         </w:tc>
         <w:tc>
           <w:tcPr>
-            <w:tcW w:type="dxa" w:w="1289"/>
+            <w:tcW w:type="dxa" w:w="1245"/>
             <w:shd w:fill="FFFFFF" w:val="clear"/>
             <w:tcMar>
               <w:top w:type="dxa" w:w="90"/>
@@ -2469,7 +2469,7 @@
         </w:tc>
         <w:tc>
           <w:tcPr>
-            <w:tcW w:type="dxa" w:w="1141"/>
+            <w:tcW w:type="dxa" w:w="1101"/>
             <w:shd w:fill="FFFFFF" w:val="clear"/>
             <w:tcMar>
               <w:top w:type="dxa" w:w="90"/>
@@ -2501,7 +2501,7 @@
         </w:trPr>
         <w:tc>
           <w:tcPr>
-            <w:tcW w:type="dxa" w:w="889"/>
+            <w:tcW w:type="dxa" w:w="864"/>
             <w:shd w:fill="F5F5F5" w:val="clear"/>
             <w:tcMar>
               <w:top w:type="dxa" w:w="90"/>
@@ -2528,7 +2528,7 @@
         </w:tc>
         <w:tc>
           <w:tcPr>
-            <w:tcW w:type="dxa" w:w="6031"/>
+            <w:tcW w:type="dxa" w:w="6140"/>
             <w:shd w:fill="F5F5F5" w:val="clear"/>
             <w:tcMar>
               <w:top w:type="dxa" w:w="90"/>
@@ -2555,7 +2555,7 @@
         </w:tc>
         <w:tc>
           <w:tcPr>
-            <w:tcW w:type="dxa" w:w="1289"/>
+            <w:tcW w:type="dxa" w:w="1245"/>
             <w:shd w:fill="F5F5F5" w:val="clear"/>
             <w:tcMar>
               <w:top w:type="dxa" w:w="90"/>
@@ -2582,7 +2582,7 @@
         </w:tc>
         <w:tc>
           <w:tcPr>
-            <w:tcW w:type="dxa" w:w="1141"/>
+            <w:tcW w:type="dxa" w:w="1101"/>
             <w:shd w:fill="F5F5F5" w:val="clear"/>
             <w:tcMar>
               <w:top w:type="dxa" w:w="90"/>
@@ -2614,7 +2614,7 @@
         </w:trPr>
         <w:tc>
           <w:tcPr>
-            <w:tcW w:type="dxa" w:w="889"/>
+            <w:tcW w:type="dxa" w:w="864"/>
             <w:shd w:fill="FFFFFF" w:val="clear"/>
             <w:tcMar>
               <w:top w:type="dxa" w:w="90"/>
@@ -2641,7 +2641,7 @@
         </w:tc>
         <w:tc>
           <w:tcPr>
-            <w:tcW w:type="dxa" w:w="6031"/>
+            <w:tcW w:type="dxa" w:w="6140"/>
             <w:shd w:fill="FFFFFF" w:val="clear"/>
             <w:tcMar>
               <w:top w:type="dxa" w:w="90"/>
@@ -2668,7 +2668,7 @@
         </w:tc>
         <w:tc>
           <w:tcPr>
-            <w:tcW w:type="dxa" w:w="1289"/>
+            <w:tcW w:type="dxa" w:w="1245"/>
             <w:shd w:fill="FFFFFF" w:val="clear"/>
             <w:tcMar>
               <w:top w:type="dxa" w:w="90"/>
@@ -2695,7 +2695,7 @@
         </w:tc>
         <w:tc>
           <w:tcPr>
-            <w:tcW w:type="dxa" w:w="1141"/>
+            <w:tcW w:type="dxa" w:w="1101"/>
             <w:shd w:fill="FFFFFF" w:val="clear"/>
             <w:tcMar>
               <w:top w:type="dxa" w:w="90"/>
@@ -2727,61 +2727,61 @@
         </w:trPr>
         <w:tc>
           <w:tcPr>
-            <w:tcW w:type="dxa" w:w="889"/>
-            <w:shd w:fill="F5F5F5" w:val="clear"/>
-            <w:tcMar>
-              <w:top w:type="dxa" w:w="90"/>
-              <w:left w:type="dxa" w:w="140"/>
-              <w:bottom w:type="dxa" w:w="90"/>
-              <w:right w:type="dxa" w:w="140"/>
-            </w:tcMar>
-            <w:vAlign w:val="center"/>
-          </w:tcPr>
-          <w:p>
-            <w:pPr>
-              <w:spacing w:after="0" w:line="260"/>
-            </w:pPr>
-            <w:r>
-              <w:rPr>
-                <w:rFonts w:ascii="Calibri" w:cs="Calibri" w:eastAsia="Calibri" w:hAnsi="Calibri"/>
-                <w:color w:val="1F2A37"/>
-                <w:sz w:val="18"/>
-                <w:szCs w:val="18"/>
-              </w:rPr>
-              <w:t xml:space="preserve">20–21</w:t>
-            </w:r>
-          </w:p>
-        </w:tc>
-        <w:tc>
-          <w:tcPr>
-            <w:tcW w:type="dxa" w:w="6031"/>
-            <w:shd w:fill="F5F5F5" w:val="clear"/>
-            <w:tcMar>
-              <w:top w:type="dxa" w:w="90"/>
-              <w:left w:type="dxa" w:w="140"/>
-              <w:bottom w:type="dxa" w:w="90"/>
-              <w:right w:type="dxa" w:w="140"/>
-            </w:tcMar>
-            <w:vAlign w:val="center"/>
-          </w:tcPr>
-          <w:p>
-            <w:pPr>
-              <w:spacing w:after="0" w:line="260"/>
-            </w:pPr>
-            <w:r>
-              <w:rPr>
-                <w:rFonts w:ascii="Calibri" w:cs="Calibri" w:eastAsia="Calibri" w:hAnsi="Calibri"/>
-                <w:color w:val="1F2A37"/>
-                <w:sz w:val="18"/>
-                <w:szCs w:val="18"/>
-              </w:rPr>
-              <w:t xml:space="preserve">Por que a DF e encerramento</w:t>
-            </w:r>
-          </w:p>
-        </w:tc>
-        <w:tc>
-          <w:tcPr>
-            <w:tcW w:type="dxa" w:w="1289"/>
+            <w:tcW w:type="dxa" w:w="864"/>
+            <w:shd w:fill="F5F5F5" w:val="clear"/>
+            <w:tcMar>
+              <w:top w:type="dxa" w:w="90"/>
+              <w:left w:type="dxa" w:w="140"/>
+              <w:bottom w:type="dxa" w:w="90"/>
+              <w:right w:type="dxa" w:w="140"/>
+            </w:tcMar>
+            <w:vAlign w:val="center"/>
+          </w:tcPr>
+          <w:p>
+            <w:pPr>
+              <w:spacing w:after="0" w:line="260"/>
+            </w:pPr>
+            <w:r>
+              <w:rPr>
+                <w:rFonts w:ascii="Calibri" w:cs="Calibri" w:eastAsia="Calibri" w:hAnsi="Calibri"/>
+                <w:color w:val="1F2A37"/>
+                <w:sz w:val="18"/>
+                <w:szCs w:val="18"/>
+              </w:rPr>
+              <w:t xml:space="preserve">20</w:t>
+            </w:r>
+          </w:p>
+        </w:tc>
+        <w:tc>
+          <w:tcPr>
+            <w:tcW w:type="dxa" w:w="6140"/>
+            <w:shd w:fill="F5F5F5" w:val="clear"/>
+            <w:tcMar>
+              <w:top w:type="dxa" w:w="90"/>
+              <w:left w:type="dxa" w:w="140"/>
+              <w:bottom w:type="dxa" w:w="90"/>
+              <w:right w:type="dxa" w:w="140"/>
+            </w:tcMar>
+            <w:vAlign w:val="center"/>
+          </w:tcPr>
+          <w:p>
+            <w:pPr>
+              <w:spacing w:after="0" w:line="260"/>
+            </w:pPr>
+            <w:r>
+              <w:rPr>
+                <w:rFonts w:ascii="Calibri" w:cs="Calibri" w:eastAsia="Calibri" w:hAnsi="Calibri"/>
+                <w:color w:val="1F2A37"/>
+                <w:sz w:val="18"/>
+                <w:szCs w:val="18"/>
+              </w:rPr>
+              <w:t xml:space="preserve">Por que um subsíndico independente (comparativo de modelos)</w:t>
+            </w:r>
+          </w:p>
+        </w:tc>
+        <w:tc>
+          <w:tcPr>
+            <w:tcW w:type="dxa" w:w="1245"/>
             <w:shd w:fill="F5F5F5" w:val="clear"/>
             <w:tcMar>
               <w:top w:type="dxa" w:w="90"/>
@@ -2808,7 +2808,7 @@
         </w:tc>
         <w:tc>
           <w:tcPr>
-            <w:tcW w:type="dxa" w:w="1141"/>
+            <w:tcW w:type="dxa" w:w="1101"/>
             <w:shd w:fill="F5F5F5" w:val="clear"/>
             <w:tcMar>
               <w:top w:type="dxa" w:w="90"/>
@@ -2840,104 +2840,109 @@
         </w:trPr>
         <w:tc>
           <w:tcPr>
-            <w:tcW w:type="dxa" w:w="889"/>
-            <w:shd w:fill="FFFFFF" w:val="clear"/>
-            <w:tcMar>
-              <w:top w:type="dxa" w:w="90"/>
-              <w:left w:type="dxa" w:w="140"/>
-              <w:bottom w:type="dxa" w:w="90"/>
-              <w:right w:type="dxa" w:w="140"/>
-            </w:tcMar>
-            <w:vAlign w:val="center"/>
-          </w:tcPr>
-          <w:p>
-            <w:pPr>
-              <w:spacing w:after="0" w:line="260"/>
-            </w:pPr>
-            <w:r>
-              <w:rPr>
-                <w:rFonts w:ascii="Calibri" w:cs="Calibri" w:eastAsia="Calibri" w:hAnsi="Calibri"/>
-                <w:color w:val="1F2A37"/>
-                <w:sz w:val="18"/>
-                <w:szCs w:val="18"/>
-              </w:rPr>
-              <w:t xml:space="preserve">—</w:t>
-            </w:r>
-          </w:p>
-        </w:tc>
-        <w:tc>
-          <w:tcPr>
-            <w:tcW w:type="dxa" w:w="6031"/>
-            <w:shd w:fill="FFFFFF" w:val="clear"/>
-            <w:tcMar>
-              <w:top w:type="dxa" w:w="90"/>
-              <w:left w:type="dxa" w:w="140"/>
-              <w:bottom w:type="dxa" w:w="90"/>
-              <w:right w:type="dxa" w:w="140"/>
-            </w:tcMar>
-            <w:vAlign w:val="center"/>
-          </w:tcPr>
-          <w:p>
-            <w:pPr>
-              <w:spacing w:after="0" w:line="260"/>
-            </w:pPr>
-            <w:r>
-              <w:rPr>
-                <w:rFonts w:ascii="Calibri" w:cs="Calibri" w:eastAsia="Calibri" w:hAnsi="Calibri"/>
-                <w:b/>
-                <w:bCs/>
-                <w:color w:val="1F2A37"/>
-                <w:sz w:val="18"/>
-                <w:szCs w:val="18"/>
-              </w:rPr>
-              <w:t xml:space="preserve">Total da exposição</w:t>
-            </w:r>
-          </w:p>
-        </w:tc>
-        <w:tc>
-          <w:tcPr>
-            <w:tcW w:type="dxa" w:w="1289"/>
-            <w:shd w:fill="FFFFFF" w:val="clear"/>
-            <w:tcMar>
-              <w:top w:type="dxa" w:w="90"/>
-              <w:left w:type="dxa" w:w="140"/>
-              <w:bottom w:type="dxa" w:w="90"/>
-              <w:right w:type="dxa" w:w="140"/>
-            </w:tcMar>
-            <w:vAlign w:val="center"/>
-          </w:tcPr>
-          <w:p>
-            <w:pPr>
-              <w:spacing w:after="0" w:line="260"/>
-            </w:pPr>
-          </w:p>
-        </w:tc>
-        <w:tc>
-          <w:tcPr>
-            <w:tcW w:type="dxa" w:w="1141"/>
-            <w:shd w:fill="FFFFFF" w:val="clear"/>
-            <w:tcMar>
-              <w:top w:type="dxa" w:w="90"/>
-              <w:left w:type="dxa" w:w="140"/>
-              <w:bottom w:type="dxa" w:w="90"/>
-              <w:right w:type="dxa" w:w="140"/>
-            </w:tcMar>
-            <w:vAlign w:val="center"/>
-          </w:tcPr>
-          <w:p>
-            <w:pPr>
-              <w:spacing w:after="0" w:line="260"/>
-            </w:pPr>
-            <w:r>
-              <w:rPr>
-                <w:rFonts w:ascii="Calibri" w:cs="Calibri" w:eastAsia="Calibri" w:hAnsi="Calibri"/>
-                <w:b/>
-                <w:bCs/>
-                <w:color w:val="1F2A37"/>
-                <w:sz w:val="18"/>
-                <w:szCs w:val="18"/>
-              </w:rPr>
-              <w:t xml:space="preserve">~47 min</w:t>
+            <w:tcW w:type="dxa" w:w="864"/>
+            <w:shd w:fill="FFFFFF" w:val="clear"/>
+            <w:tcMar>
+              <w:top w:type="dxa" w:w="90"/>
+              <w:left w:type="dxa" w:w="140"/>
+              <w:bottom w:type="dxa" w:w="90"/>
+              <w:right w:type="dxa" w:w="140"/>
+            </w:tcMar>
+            <w:vAlign w:val="center"/>
+          </w:tcPr>
+          <w:p>
+            <w:pPr>
+              <w:spacing w:after="0" w:line="260"/>
+            </w:pPr>
+            <w:r>
+              <w:rPr>
+                <w:rFonts w:ascii="Calibri" w:cs="Calibri" w:eastAsia="Calibri" w:hAnsi="Calibri"/>
+                <w:color w:val="1F2A37"/>
+                <w:sz w:val="18"/>
+                <w:szCs w:val="18"/>
+              </w:rPr>
+              <w:t xml:space="preserve">21</w:t>
+            </w:r>
+          </w:p>
+        </w:tc>
+        <w:tc>
+          <w:tcPr>
+            <w:tcW w:type="dxa" w:w="6140"/>
+            <w:shd w:fill="FFFFFF" w:val="clear"/>
+            <w:tcMar>
+              <w:top w:type="dxa" w:w="90"/>
+              <w:left w:type="dxa" w:w="140"/>
+              <w:bottom w:type="dxa" w:w="90"/>
+              <w:right w:type="dxa" w:w="140"/>
+            </w:tcMar>
+            <w:vAlign w:val="center"/>
+          </w:tcPr>
+          <w:p>
+            <w:pPr>
+              <w:spacing w:after="0" w:line="260"/>
+            </w:pPr>
+            <w:r>
+              <w:rPr>
+                <w:rFonts w:ascii="Calibri" w:cs="Calibri" w:eastAsia="Calibri" w:hAnsi="Calibri"/>
+                <w:color w:val="1F2A37"/>
+                <w:sz w:val="18"/>
+                <w:szCs w:val="18"/>
+              </w:rPr>
+              <w:t xml:space="preserve">Três unidades, três respostas — com prova</w:t>
+            </w:r>
+          </w:p>
+        </w:tc>
+        <w:tc>
+          <w:tcPr>
+            <w:tcW w:type="dxa" w:w="1245"/>
+            <w:shd w:fill="FFFFFF" w:val="clear"/>
+            <w:tcMar>
+              <w:top w:type="dxa" w:w="90"/>
+              <w:left w:type="dxa" w:w="140"/>
+              <w:bottom w:type="dxa" w:w="90"/>
+              <w:right w:type="dxa" w:w="140"/>
+            </w:tcMar>
+            <w:vAlign w:val="center"/>
+          </w:tcPr>
+          <w:p>
+            <w:pPr>
+              <w:spacing w:after="0" w:line="260"/>
+            </w:pPr>
+            <w:r>
+              <w:rPr>
+                <w:rFonts w:ascii="Calibri" w:cs="Calibri" w:eastAsia="Calibri" w:hAnsi="Calibri"/>
+                <w:color w:val="1F2A37"/>
+                <w:sz w:val="18"/>
+                <w:szCs w:val="18"/>
+              </w:rPr>
+              <w:t xml:space="preserve">Caio</w:t>
+            </w:r>
+          </w:p>
+        </w:tc>
+        <w:tc>
+          <w:tcPr>
+            <w:tcW w:type="dxa" w:w="1101"/>
+            <w:shd w:fill="FFFFFF" w:val="clear"/>
+            <w:tcMar>
+              <w:top w:type="dxa" w:w="90"/>
+              <w:left w:type="dxa" w:w="140"/>
+              <w:bottom w:type="dxa" w:w="90"/>
+              <w:right w:type="dxa" w:w="140"/>
+            </w:tcMar>
+            <w:vAlign w:val="center"/>
+          </w:tcPr>
+          <w:p>
+            <w:pPr>
+              <w:spacing w:after="0" w:line="260"/>
+            </w:pPr>
+            <w:r>
+              <w:rPr>
+                <w:rFonts w:ascii="Calibri" w:cs="Calibri" w:eastAsia="Calibri" w:hAnsi="Calibri"/>
+                <w:color w:val="1F2A37"/>
+                <w:sz w:val="18"/>
+                <w:szCs w:val="18"/>
+              </w:rPr>
+              <w:t xml:space="preserve">2 min</w:t>
             </w:r>
           </w:p>
         </w:tc>
@@ -2948,7 +2953,233 @@
         </w:trPr>
         <w:tc>
           <w:tcPr>
-            <w:tcW w:type="dxa" w:w="889"/>
+            <w:tcW w:type="dxa" w:w="864"/>
+            <w:shd w:fill="F5F5F5" w:val="clear"/>
+            <w:tcMar>
+              <w:top w:type="dxa" w:w="90"/>
+              <w:left w:type="dxa" w:w="140"/>
+              <w:bottom w:type="dxa" w:w="90"/>
+              <w:right w:type="dxa" w:w="140"/>
+            </w:tcMar>
+            <w:vAlign w:val="center"/>
+          </w:tcPr>
+          <w:p>
+            <w:pPr>
+              <w:spacing w:after="0" w:line="260"/>
+            </w:pPr>
+            <w:r>
+              <w:rPr>
+                <w:rFonts w:ascii="Calibri" w:cs="Calibri" w:eastAsia="Calibri" w:hAnsi="Calibri"/>
+                <w:color w:val="1F2A37"/>
+                <w:sz w:val="18"/>
+                <w:szCs w:val="18"/>
+              </w:rPr>
+              <w:t xml:space="preserve">22</w:t>
+            </w:r>
+          </w:p>
+        </w:tc>
+        <w:tc>
+          <w:tcPr>
+            <w:tcW w:type="dxa" w:w="6140"/>
+            <w:shd w:fill="F5F5F5" w:val="clear"/>
+            <w:tcMar>
+              <w:top w:type="dxa" w:w="90"/>
+              <w:left w:type="dxa" w:w="140"/>
+              <w:bottom w:type="dxa" w:w="90"/>
+              <w:right w:type="dxa" w:w="140"/>
+            </w:tcMar>
+            <w:vAlign w:val="center"/>
+          </w:tcPr>
+          <w:p>
+            <w:pPr>
+              <w:spacing w:after="0" w:line="260"/>
+            </w:pPr>
+            <w:r>
+              <w:rPr>
+                <w:rFonts w:ascii="Calibri" w:cs="Calibri" w:eastAsia="Calibri" w:hAnsi="Calibri"/>
+                <w:color w:val="1F2A37"/>
+                <w:sz w:val="18"/>
+                <w:szCs w:val="18"/>
+              </w:rPr>
+              <w:t xml:space="preserve">O que o Einstein ganha nos primeiros 90 dias</w:t>
+            </w:r>
+          </w:p>
+        </w:tc>
+        <w:tc>
+          <w:tcPr>
+            <w:tcW w:type="dxa" w:w="1245"/>
+            <w:shd w:fill="F5F5F5" w:val="clear"/>
+            <w:tcMar>
+              <w:top w:type="dxa" w:w="90"/>
+              <w:left w:type="dxa" w:w="140"/>
+              <w:bottom w:type="dxa" w:w="90"/>
+              <w:right w:type="dxa" w:w="140"/>
+            </w:tcMar>
+            <w:vAlign w:val="center"/>
+          </w:tcPr>
+          <w:p>
+            <w:pPr>
+              <w:spacing w:after="0" w:line="260"/>
+            </w:pPr>
+            <w:r>
+              <w:rPr>
+                <w:rFonts w:ascii="Calibri" w:cs="Calibri" w:eastAsia="Calibri" w:hAnsi="Calibri"/>
+                <w:color w:val="1F2A37"/>
+                <w:sz w:val="18"/>
+                <w:szCs w:val="18"/>
+              </w:rPr>
+              <w:t xml:space="preserve">Denise</w:t>
+            </w:r>
+          </w:p>
+        </w:tc>
+        <w:tc>
+          <w:tcPr>
+            <w:tcW w:type="dxa" w:w="1101"/>
+            <w:shd w:fill="F5F5F5" w:val="clear"/>
+            <w:tcMar>
+              <w:top w:type="dxa" w:w="90"/>
+              <w:left w:type="dxa" w:w="140"/>
+              <w:bottom w:type="dxa" w:w="90"/>
+              <w:right w:type="dxa" w:w="140"/>
+            </w:tcMar>
+            <w:vAlign w:val="center"/>
+          </w:tcPr>
+          <w:p>
+            <w:pPr>
+              <w:spacing w:after="0" w:line="260"/>
+            </w:pPr>
+            <w:r>
+              <w:rPr>
+                <w:rFonts w:ascii="Calibri" w:cs="Calibri" w:eastAsia="Calibri" w:hAnsi="Calibri"/>
+                <w:color w:val="1F2A37"/>
+                <w:sz w:val="18"/>
+                <w:szCs w:val="18"/>
+              </w:rPr>
+              <w:t xml:space="preserve">2 min</w:t>
+            </w:r>
+          </w:p>
+        </w:tc>
+      </w:tr>
+      <w:tr>
+        <w:trPr>
+          <w:cantSplit/>
+        </w:trPr>
+        <w:tc>
+          <w:tcPr>
+            <w:tcW w:type="dxa" w:w="864"/>
+            <w:shd w:fill="FFFFFF" w:val="clear"/>
+            <w:tcMar>
+              <w:top w:type="dxa" w:w="90"/>
+              <w:left w:type="dxa" w:w="140"/>
+              <w:bottom w:type="dxa" w:w="90"/>
+              <w:right w:type="dxa" w:w="140"/>
+            </w:tcMar>
+            <w:vAlign w:val="center"/>
+          </w:tcPr>
+          <w:p>
+            <w:pPr>
+              <w:spacing w:after="0" w:line="260"/>
+            </w:pPr>
+            <w:r>
+              <w:rPr>
+                <w:rFonts w:ascii="Calibri" w:cs="Calibri" w:eastAsia="Calibri" w:hAnsi="Calibri"/>
+                <w:color w:val="1F2A37"/>
+                <w:sz w:val="18"/>
+                <w:szCs w:val="18"/>
+              </w:rPr>
+              <w:t xml:space="preserve">23</w:t>
+            </w:r>
+          </w:p>
+        </w:tc>
+        <w:tc>
+          <w:tcPr>
+            <w:tcW w:type="dxa" w:w="6140"/>
+            <w:shd w:fill="FFFFFF" w:val="clear"/>
+            <w:tcMar>
+              <w:top w:type="dxa" w:w="90"/>
+              <w:left w:type="dxa" w:w="140"/>
+              <w:bottom w:type="dxa" w:w="90"/>
+              <w:right w:type="dxa" w:w="140"/>
+            </w:tcMar>
+            <w:vAlign w:val="center"/>
+          </w:tcPr>
+          <w:p>
+            <w:pPr>
+              <w:spacing w:after="0" w:line="260"/>
+            </w:pPr>
+            <w:r>
+              <w:rPr>
+                <w:rFonts w:ascii="Calibri" w:cs="Calibri" w:eastAsia="Calibri" w:hAnsi="Calibri"/>
+                <w:color w:val="1F2A37"/>
+                <w:sz w:val="18"/>
+                <w:szCs w:val="18"/>
+              </w:rPr>
+              <w:t xml:space="preserve">Encerramento</w:t>
+            </w:r>
+          </w:p>
+        </w:tc>
+        <w:tc>
+          <w:tcPr>
+            <w:tcW w:type="dxa" w:w="1245"/>
+            <w:shd w:fill="FFFFFF" w:val="clear"/>
+            <w:tcMar>
+              <w:top w:type="dxa" w:w="90"/>
+              <w:left w:type="dxa" w:w="140"/>
+              <w:bottom w:type="dxa" w:w="90"/>
+              <w:right w:type="dxa" w:w="140"/>
+            </w:tcMar>
+            <w:vAlign w:val="center"/>
+          </w:tcPr>
+          <w:p>
+            <w:pPr>
+              <w:spacing w:after="0" w:line="260"/>
+            </w:pPr>
+            <w:r>
+              <w:rPr>
+                <w:rFonts w:ascii="Calibri" w:cs="Calibri" w:eastAsia="Calibri" w:hAnsi="Calibri"/>
+                <w:color w:val="1F2A37"/>
+                <w:sz w:val="18"/>
+                <w:szCs w:val="18"/>
+              </w:rPr>
+              <w:t xml:space="preserve">Denise</w:t>
+            </w:r>
+          </w:p>
+        </w:tc>
+        <w:tc>
+          <w:tcPr>
+            <w:tcW w:type="dxa" w:w="1101"/>
+            <w:shd w:fill="FFFFFF" w:val="clear"/>
+            <w:tcMar>
+              <w:top w:type="dxa" w:w="90"/>
+              <w:left w:type="dxa" w:w="140"/>
+              <w:bottom w:type="dxa" w:w="90"/>
+              <w:right w:type="dxa" w:w="140"/>
+            </w:tcMar>
+            <w:vAlign w:val="center"/>
+          </w:tcPr>
+          <w:p>
+            <w:pPr>
+              <w:spacing w:after="0" w:line="260"/>
+            </w:pPr>
+            <w:r>
+              <w:rPr>
+                <w:rFonts w:ascii="Calibri" w:cs="Calibri" w:eastAsia="Calibri" w:hAnsi="Calibri"/>
+                <w:color w:val="1F2A37"/>
+                <w:sz w:val="18"/>
+                <w:szCs w:val="18"/>
+              </w:rPr>
+              <w:t xml:space="preserve">1 min</w:t>
+            </w:r>
+          </w:p>
+        </w:tc>
+      </w:tr>
+      <w:tr>
+        <w:trPr>
+          <w:cantSplit/>
+        </w:trPr>
+        <w:tc>
+          <w:tcPr>
+            <w:tcW w:type="dxa" w:w="864"/>
             <w:shd w:fill="F5F5F5" w:val="clear"/>
             <w:tcMar>
               <w:top w:type="dxa" w:w="90"/>
@@ -2975,8 +3206,116 @@
         </w:tc>
         <w:tc>
           <w:tcPr>
-            <w:tcW w:type="dxa" w:w="6031"/>
-            <w:shd w:fill="F5F5F5" w:val="clear"/>
+            <w:tcW w:type="dxa" w:w="6140"/>
+            <w:shd w:fill="F5F5F5" w:val="clear"/>
+            <w:tcMar>
+              <w:top w:type="dxa" w:w="90"/>
+              <w:left w:type="dxa" w:w="140"/>
+              <w:bottom w:type="dxa" w:w="90"/>
+              <w:right w:type="dxa" w:w="140"/>
+            </w:tcMar>
+            <w:vAlign w:val="center"/>
+          </w:tcPr>
+          <w:p>
+            <w:pPr>
+              <w:spacing w:after="0" w:line="260"/>
+            </w:pPr>
+            <w:r>
+              <w:rPr>
+                <w:rFonts w:ascii="Calibri" w:cs="Calibri" w:eastAsia="Calibri" w:hAnsi="Calibri"/>
+                <w:b/>
+                <w:bCs/>
+                <w:color w:val="1F2A37"/>
+                <w:sz w:val="18"/>
+                <w:szCs w:val="18"/>
+              </w:rPr>
+              <w:t xml:space="preserve">Total da exposição</w:t>
+            </w:r>
+          </w:p>
+        </w:tc>
+        <w:tc>
+          <w:tcPr>
+            <w:tcW w:type="dxa" w:w="1245"/>
+            <w:shd w:fill="F5F5F5" w:val="clear"/>
+            <w:tcMar>
+              <w:top w:type="dxa" w:w="90"/>
+              <w:left w:type="dxa" w:w="140"/>
+              <w:bottom w:type="dxa" w:w="90"/>
+              <w:right w:type="dxa" w:w="140"/>
+            </w:tcMar>
+            <w:vAlign w:val="center"/>
+          </w:tcPr>
+          <w:p>
+            <w:pPr>
+              <w:spacing w:after="0" w:line="260"/>
+            </w:pPr>
+          </w:p>
+        </w:tc>
+        <w:tc>
+          <w:tcPr>
+            <w:tcW w:type="dxa" w:w="1101"/>
+            <w:shd w:fill="F5F5F5" w:val="clear"/>
+            <w:tcMar>
+              <w:top w:type="dxa" w:w="90"/>
+              <w:left w:type="dxa" w:w="140"/>
+              <w:bottom w:type="dxa" w:w="90"/>
+              <w:right w:type="dxa" w:w="140"/>
+            </w:tcMar>
+            <w:vAlign w:val="center"/>
+          </w:tcPr>
+          <w:p>
+            <w:pPr>
+              <w:spacing w:after="0" w:line="260"/>
+            </w:pPr>
+            <w:r>
+              <w:rPr>
+                <w:rFonts w:ascii="Calibri" w:cs="Calibri" w:eastAsia="Calibri" w:hAnsi="Calibri"/>
+                <w:b/>
+                <w:bCs/>
+                <w:color w:val="1F2A37"/>
+                <w:sz w:val="18"/>
+                <w:szCs w:val="18"/>
+              </w:rPr>
+              <w:t xml:space="preserve">~52 min</w:t>
+            </w:r>
+          </w:p>
+        </w:tc>
+      </w:tr>
+      <w:tr>
+        <w:trPr>
+          <w:cantSplit/>
+        </w:trPr>
+        <w:tc>
+          <w:tcPr>
+            <w:tcW w:type="dxa" w:w="864"/>
+            <w:shd w:fill="FFFFFF" w:val="clear"/>
+            <w:tcMar>
+              <w:top w:type="dxa" w:w="90"/>
+              <w:left w:type="dxa" w:w="140"/>
+              <w:bottom w:type="dxa" w:w="90"/>
+              <w:right w:type="dxa" w:w="140"/>
+            </w:tcMar>
+            <w:vAlign w:val="center"/>
+          </w:tcPr>
+          <w:p>
+            <w:pPr>
+              <w:spacing w:after="0" w:line="260"/>
+            </w:pPr>
+            <w:r>
+              <w:rPr>
+                <w:rFonts w:ascii="Calibri" w:cs="Calibri" w:eastAsia="Calibri" w:hAnsi="Calibri"/>
+                <w:color w:val="1F2A37"/>
+                <w:sz w:val="18"/>
+                <w:szCs w:val="18"/>
+              </w:rPr>
+              <w:t xml:space="preserve">—</w:t>
+            </w:r>
+          </w:p>
+        </w:tc>
+        <w:tc>
+          <w:tcPr>
+            <w:tcW w:type="dxa" w:w="6140"/>
+            <w:shd w:fill="FFFFFF" w:val="clear"/>
             <w:tcMar>
               <w:top w:type="dxa" w:w="90"/>
               <w:left w:type="dxa" w:w="140"/>
@@ -3002,8 +3341,8 @@
         </w:tc>
         <w:tc>
           <w:tcPr>
-            <w:tcW w:type="dxa" w:w="1289"/>
-            <w:shd w:fill="F5F5F5" w:val="clear"/>
+            <w:tcW w:type="dxa" w:w="1245"/>
+            <w:shd w:fill="FFFFFF" w:val="clear"/>
             <w:tcMar>
               <w:top w:type="dxa" w:w="90"/>
               <w:left w:type="dxa" w:w="140"/>
@@ -3029,28 +3368,28 @@
         </w:tc>
         <w:tc>
           <w:tcPr>
-            <w:tcW w:type="dxa" w:w="1141"/>
-            <w:shd w:fill="F5F5F5" w:val="clear"/>
-            <w:tcMar>
-              <w:top w:type="dxa" w:w="90"/>
-              <w:left w:type="dxa" w:w="140"/>
-              <w:bottom w:type="dxa" w:w="90"/>
-              <w:right w:type="dxa" w:w="140"/>
-            </w:tcMar>
-            <w:vAlign w:val="center"/>
-          </w:tcPr>
-          <w:p>
-            <w:pPr>
-              <w:spacing w:after="0" w:line="260"/>
-            </w:pPr>
-            <w:r>
-              <w:rPr>
-                <w:rFonts w:ascii="Calibri" w:cs="Calibri" w:eastAsia="Calibri" w:hAnsi="Calibri"/>
-                <w:color w:val="1F2A37"/>
-                <w:sz w:val="18"/>
-                <w:szCs w:val="18"/>
-              </w:rPr>
-              <w:t xml:space="preserve">~65 min</w:t>
+            <w:tcW w:type="dxa" w:w="1101"/>
+            <w:shd w:fill="FFFFFF" w:val="clear"/>
+            <w:tcMar>
+              <w:top w:type="dxa" w:w="90"/>
+              <w:left w:type="dxa" w:w="140"/>
+              <w:bottom w:type="dxa" w:w="90"/>
+              <w:right w:type="dxa" w:w="140"/>
+            </w:tcMar>
+            <w:vAlign w:val="center"/>
+          </w:tcPr>
+          <w:p>
+            <w:pPr>
+              <w:spacing w:after="0" w:line="260"/>
+            </w:pPr>
+            <w:r>
+              <w:rPr>
+                <w:rFonts w:ascii="Calibri" w:cs="Calibri" w:eastAsia="Calibri" w:hAnsi="Calibri"/>
+                <w:color w:val="1F2A37"/>
+                <w:sz w:val="18"/>
+                <w:szCs w:val="18"/>
+              </w:rPr>
+              <w:t xml:space="preserve">~60 min</w:t>
             </w:r>
           </w:p>
         </w:tc>
@@ -3625,7 +3964,7 @@
           <w:sz w:val="20"/>
           <w:szCs w:val="20"/>
         </w:rPr>
-        <w:t xml:space="preserve">Não citar administradoras pelo nome</w:t>
+        <w:t xml:space="preserve">Slide 20 compara modelos, não empresas.</w:t>
       </w:r>
       <w:r>
         <w:rPr>
@@ -3634,7 +3973,7 @@
           <w:sz w:val="20"/>
           <w:szCs w:val="20"/>
         </w:rPr>
-        <w:t xml:space="preserve"> nem atacar concorrentes. O argumento é estrutural: quem executa não deve fiscalizar a si mesmo.</w:t>
+        <w:t xml:space="preserve"> Tom de explicação, nunca de ataque — não citar nenhum participante da concorrência.</w:t>
       </w:r>
     </w:p>
     <w:p>
@@ -3657,7 +3996,7 @@
           <w:sz w:val="20"/>
           <w:szCs w:val="20"/>
         </w:rPr>
-        <w:t xml:space="preserve">Nome do gerente financeiro: Marco Murino</w:t>
+        <w:t xml:space="preserve">Não citar administradoras pelo nome</w:t>
       </w:r>
       <w:r>
         <w:rPr>
@@ -3666,7 +4005,7 @@
           <w:sz w:val="20"/>
           <w:szCs w:val="20"/>
         </w:rPr>
-        <w:t xml:space="preserve"> (confirmado). As propostas técnicas de 01/10 grafaram "Murilo" — se surgir, corrigir verbalmente; o relatório executivo já está certo.</w:t>
+        <w:t xml:space="preserve"> nem atacar concorrentes. O argumento é estrutural: quem executa não deve fiscalizar a si mesmo.</w:t>
       </w:r>
     </w:p>
     <w:p>
@@ -3689,7 +4028,7 @@
           <w:sz w:val="20"/>
           <w:szCs w:val="20"/>
         </w:rPr>
-        <w:t xml:space="preserve">Cases sem valor em R$.</w:t>
+        <w:t xml:space="preserve">Nome do gerente financeiro: Marco Murino</w:t>
       </w:r>
       <w:r>
         <w:rPr>
@@ -3698,7 +4037,7 @@
           <w:sz w:val="20"/>
           <w:szCs w:val="20"/>
         </w:rPr>
-        <w:t xml:space="preserve"> Se pedirem números, responder qualitativamente e oferecer o contato de referência do cliente.</w:t>
+        <w:t xml:space="preserve"> (confirmado). As propostas técnicas de 01/10 grafaram "Murilo" — se surgir, corrigir verbalmente; o relatório executivo já está certo.</w:t>
       </w:r>
     </w:p>
     <w:p>
@@ -3721,7 +4060,7 @@
           <w:sz w:val="20"/>
           <w:szCs w:val="20"/>
         </w:rPr>
-        <w:t xml:space="preserve">Sírio-Libanês:</w:t>
+        <w:t xml:space="preserve">Cases sem valor em R$.</w:t>
       </w:r>
       <w:r>
         <w:rPr>
@@ -3730,7 +4069,7 @@
           <w:sz w:val="20"/>
           <w:szCs w:val="20"/>
         </w:rPr>
-        <w:t xml:space="preserve"> pode ser citado — a locação é pública.</w:t>
+        <w:t xml:space="preserve"> Se pedirem números, responder qualitativamente e oferecer o contato de referência do cliente.</w:t>
       </w:r>
     </w:p>
     <w:p>
@@ -3753,7 +4092,7 @@
           <w:sz w:val="20"/>
           <w:szCs w:val="20"/>
         </w:rPr>
-        <w:t xml:space="preserve">Slides 16–18 (controles DF):</w:t>
+        <w:t xml:space="preserve">Sírio-Libanês:</w:t>
       </w:r>
       <w:r>
         <w:rPr>
@@ -3762,7 +4101,7 @@
           <w:sz w:val="20"/>
           <w:szCs w:val="20"/>
         </w:rPr>
-        <w:t xml:space="preserve"> não afirmar há quanto tempo estão em uso nem em quantos condomínios; não citar clientes nem prédios dos relatórios técnicos — o slide diz que é por sigilo. Se pedirem para ver, oferecer uma versão anonimizada após a contratação.</w:t>
+        <w:t xml:space="preserve"> pode ser citado — a locação é pública.</w:t>
       </w:r>
     </w:p>
     <w:p>
@@ -3785,7 +4124,39 @@
           <w:sz w:val="20"/>
           <w:szCs w:val="20"/>
         </w:rPr>
-        <w:t xml:space="preserve">Slides de apoio ocultos (22 e 23):</w:t>
+        <w:t xml:space="preserve">Slides 16–18 (controles DF):</w:t>
+      </w:r>
+      <w:r>
+        <w:rPr>
+          <w:rFonts w:ascii="Calibri" w:cs="Calibri" w:eastAsia="Calibri" w:hAnsi="Calibri"/>
+          <w:color w:val="1F2A37"/>
+          <w:sz w:val="20"/>
+          <w:szCs w:val="20"/>
+        </w:rPr>
+        <w:t xml:space="preserve"> não afirmar há quanto tempo estão em uso nem em quantos condomínios; não citar clientes nem prédios dos relatórios técnicos — o slide diz que é por sigilo. Se pedirem para ver, oferecer uma versão anonimizada após a contratação.</w:t>
+      </w:r>
+    </w:p>
+    <w:p>
+      <w:pPr>
+        <w:pStyle w:val="ListParagraph"/>
+        <w:numPr>
+          <w:ilvl w:val="0"/>
+          <w:numId w:val="1"/>
+        </w:numPr>
+        <w:spacing w:after="110" w:line="290"/>
+        <w:ind w:left="360"/>
+        <w:jc w:val="both"/>
+      </w:pPr>
+      <w:r>
+        <w:rPr>
+          <w:rFonts w:ascii="Calibri" w:cs="Calibri" w:eastAsia="Calibri" w:hAnsi="Calibri"/>
+          <w:b/>
+          <w:bCs/>
+          <w:color w:val="1F2A37"/>
+          <w:sz w:val="20"/>
+          <w:szCs w:val="20"/>
+        </w:rPr>
+        <w:t xml:space="preserve">Slides de apoio ocultos (24 e 25):</w:t>
       </w:r>
       <w:r>
         <w:rPr>
@@ -5159,7 +5530,7 @@
                 <w:sz w:val="18"/>
                 <w:szCs w:val="18"/>
               </w:rPr>
-              <w:t xml:space="preserve">Ata de eleição e procurações, convenção, contratos, 12 meses de prestação de contas, contatos e as alçadas internas (slide de apoio 23, oculto).</w:t>
+              <w:t xml:space="preserve">Ata de eleição e procurações, convenção, contratos, 12 meses de prestação de contas, contatos e as alçadas internas (slide de apoio 25, oculto).</w:t>
             </w:r>
           </w:p>
         </w:tc>

</xml_diff>

<commit_message>
Revisa estrutura e texto da apresentação mantendo o design original
SWOT da posição da DF guiou a nova ordem: o problema do Einstein abre a
apresentação e o comparativo de modelos sobe para o slide 5. Títulos
viram afirmações; travessões e construções 'não X, mas Y' saem do texto.
Dossiê e relatório executivo acompanham.

Co-Authored-By: Claude Opus 5.5 <noreply@anthropic.com>
Claude-Session: https://claude.ai/code/session_01EsMNgjuF6bLvLuQZ87HmRr
</commit_message>
<xml_diff>
--- a/entregas/apresentacao-13-10/DF_Dossie_Interno_Apresentacao_Einstein.docx
+++ b/entregas/apresentacao-13-10/DF_Dossie_Interno_Apresentacao_Einstein.docx
@@ -87,7 +87,7 @@
           <w:sz w:val="28"/>
           <w:szCs w:val="28"/>
         </w:rPr>
-        <w:t xml:space="preserve">APRESENTAÇÃO TÉCNICA AO EINSTEIN — 13/10/2026</w:t>
+        <w:t xml:space="preserve">APRESENTAÇÃO TÉCNICA AO EINSTEIN · 13/10/2026</w:t>
       </w:r>
     </w:p>
     <w:p>
@@ -406,7 +406,7 @@
                 <w:sz w:val="19"/>
                 <w:szCs w:val="19"/>
               </w:rPr>
-              <w:t xml:space="preserve">Confidencial — uso exclusivo DF</w:t>
+              <w:t xml:space="preserve">Confidencial · uso exclusivo DF</w:t>
             </w:r>
           </w:p>
         </w:tc>
@@ -572,7 +572,7 @@
                 <w:sz w:val="18"/>
                 <w:szCs w:val="18"/>
               </w:rPr>
-              <w:t xml:space="preserve">Terça, 13/10/2026, 10h às 12h — Microsoft Teams (link no convite da Tami)</w:t>
+              <w:t xml:space="preserve">Terça, 13/10/2026, 10h às 12h, Microsoft Teams (link no convite da Tami)</w:t>
             </w:r>
           </w:p>
         </w:tc>
@@ -896,7 +896,7 @@
           <w:sz w:val="26"/>
           <w:szCs w:val="26"/>
         </w:rPr>
-        <w:t xml:space="preserve">2. As cinco mensagens que precisam ficar</w:t>
+        <w:t xml:space="preserve">2. As seis mensagens que precisam ficar</w:t>
       </w:r>
     </w:p>
     <w:p>
@@ -928,7 +928,7 @@
           <w:sz w:val="20"/>
           <w:szCs w:val="20"/>
         </w:rPr>
-        <w:t xml:space="preserve"> a DF não é administradora — fiscaliza quem executa, em nome do Einstein.</w:t>
+        <w:t xml:space="preserve"> a DF fiscaliza quem executa, em nome do Einstein. Quem executa não fiscaliza a si mesmo.</w:t>
       </w:r>
     </w:p>
     <w:p>
@@ -1125,10 +1125,10 @@
         </w:tblBorders>
       </w:tblPr>
       <w:tblGrid>
-        <w:gridCol w:w="864"/>
-        <w:gridCol w:w="6140"/>
-        <w:gridCol w:w="1245"/>
-        <w:gridCol w:w="1101"/>
+        <w:gridCol w:w="845"/>
+        <w:gridCol w:w="6694"/>
+        <w:gridCol w:w="959"/>
+        <w:gridCol w:w="852"/>
       </w:tblGrid>
       <w:tr>
         <w:trPr>
@@ -1137,7 +1137,7 @@
         </w:trPr>
         <w:tc>
           <w:tcPr>
-            <w:tcW w:type="dxa" w:w="864"/>
+            <w:tcW w:type="dxa" w:w="845"/>
             <w:shd w:fill="2F4162" w:val="clear"/>
             <w:tcMar>
               <w:top w:type="dxa" w:w="90"/>
@@ -1166,7 +1166,7 @@
         </w:tc>
         <w:tc>
           <w:tcPr>
-            <w:tcW w:type="dxa" w:w="6140"/>
+            <w:tcW w:type="dxa" w:w="6694"/>
             <w:shd w:fill="2F4162" w:val="clear"/>
             <w:tcMar>
               <w:top w:type="dxa" w:w="90"/>
@@ -1195,7 +1195,7 @@
         </w:tc>
         <w:tc>
           <w:tcPr>
-            <w:tcW w:type="dxa" w:w="1245"/>
+            <w:tcW w:type="dxa" w:w="959"/>
             <w:shd w:fill="2F4162" w:val="clear"/>
             <w:tcMar>
               <w:top w:type="dxa" w:w="90"/>
@@ -1224,7 +1224,7 @@
         </w:tc>
         <w:tc>
           <w:tcPr>
-            <w:tcW w:type="dxa" w:w="1101"/>
+            <w:tcW w:type="dxa" w:w="852"/>
             <w:shd w:fill="2F4162" w:val="clear"/>
             <w:tcMar>
               <w:top w:type="dxa" w:w="90"/>
@@ -1258,7 +1258,7 @@
         </w:trPr>
         <w:tc>
           <w:tcPr>
-            <w:tcW w:type="dxa" w:w="864"/>
+            <w:tcW w:type="dxa" w:w="845"/>
             <w:shd w:fill="FFFFFF" w:val="clear"/>
             <w:tcMar>
               <w:top w:type="dxa" w:w="90"/>
@@ -1285,7 +1285,7 @@
         </w:tc>
         <w:tc>
           <w:tcPr>
-            <w:tcW w:type="dxa" w:w="6140"/>
+            <w:tcW w:type="dxa" w:w="6694"/>
             <w:shd w:fill="FFFFFF" w:val="clear"/>
             <w:tcMar>
               <w:top w:type="dxa" w:w="90"/>
@@ -1312,7 +1312,7 @@
         </w:tc>
         <w:tc>
           <w:tcPr>
-            <w:tcW w:type="dxa" w:w="1245"/>
+            <w:tcW w:type="dxa" w:w="959"/>
             <w:shd w:fill="FFFFFF" w:val="clear"/>
             <w:tcMar>
               <w:top w:type="dxa" w:w="90"/>
@@ -1339,7 +1339,7 @@
         </w:tc>
         <w:tc>
           <w:tcPr>
-            <w:tcW w:type="dxa" w:w="1101"/>
+            <w:tcW w:type="dxa" w:w="852"/>
             <w:shd w:fill="FFFFFF" w:val="clear"/>
             <w:tcMar>
               <w:top w:type="dxa" w:w="90"/>
@@ -1371,7 +1371,7 @@
         </w:trPr>
         <w:tc>
           <w:tcPr>
-            <w:tcW w:type="dxa" w:w="864"/>
+            <w:tcW w:type="dxa" w:w="845"/>
             <w:shd w:fill="F5F5F5" w:val="clear"/>
             <w:tcMar>
               <w:top w:type="dxa" w:w="90"/>
@@ -1398,7 +1398,7 @@
         </w:tc>
         <w:tc>
           <w:tcPr>
-            <w:tcW w:type="dxa" w:w="6140"/>
+            <w:tcW w:type="dxa" w:w="6694"/>
             <w:shd w:fill="F5F5F5" w:val="clear"/>
             <w:tcMar>
               <w:top w:type="dxa" w:w="90"/>
@@ -1425,7 +1425,7 @@
         </w:tc>
         <w:tc>
           <w:tcPr>
-            <w:tcW w:type="dxa" w:w="1245"/>
+            <w:tcW w:type="dxa" w:w="959"/>
             <w:shd w:fill="F5F5F5" w:val="clear"/>
             <w:tcMar>
               <w:top w:type="dxa" w:w="90"/>
@@ -1452,7 +1452,7 @@
         </w:tc>
         <w:tc>
           <w:tcPr>
-            <w:tcW w:type="dxa" w:w="1101"/>
+            <w:tcW w:type="dxa" w:w="852"/>
             <w:shd w:fill="F5F5F5" w:val="clear"/>
             <w:tcMar>
               <w:top w:type="dxa" w:w="90"/>
@@ -1484,7 +1484,7 @@
         </w:trPr>
         <w:tc>
           <w:tcPr>
-            <w:tcW w:type="dxa" w:w="864"/>
+            <w:tcW w:type="dxa" w:w="845"/>
             <w:shd w:fill="FFFFFF" w:val="clear"/>
             <w:tcMar>
               <w:top w:type="dxa" w:w="90"/>
@@ -1511,34 +1511,34 @@
         </w:tc>
         <w:tc>
           <w:tcPr>
-            <w:tcW w:type="dxa" w:w="6140"/>
-            <w:shd w:fill="FFFFFF" w:val="clear"/>
-            <w:tcMar>
-              <w:top w:type="dxa" w:w="90"/>
-              <w:left w:type="dxa" w:w="140"/>
-              <w:bottom w:type="dxa" w:w="90"/>
-              <w:right w:type="dxa" w:w="140"/>
-            </w:tcMar>
-            <w:vAlign w:val="center"/>
-          </w:tcPr>
-          <w:p>
-            <w:pPr>
-              <w:spacing w:after="0" w:line="260"/>
-            </w:pPr>
-            <w:r>
-              <w:rPr>
-                <w:rFonts w:ascii="Calibri" w:cs="Calibri" w:eastAsia="Calibri" w:hAnsi="Calibri"/>
-                <w:color w:val="1F2A37"/>
-                <w:sz w:val="18"/>
-                <w:szCs w:val="18"/>
-              </w:rPr>
-              <w:t xml:space="preserve">Governança × operação</w:t>
-            </w:r>
-          </w:p>
-        </w:tc>
-        <w:tc>
-          <w:tcPr>
-            <w:tcW w:type="dxa" w:w="1245"/>
+            <w:tcW w:type="dxa" w:w="6694"/>
+            <w:shd w:fill="FFFFFF" w:val="clear"/>
+            <w:tcMar>
+              <w:top w:type="dxa" w:w="90"/>
+              <w:left w:type="dxa" w:w="140"/>
+              <w:bottom w:type="dxa" w:w="90"/>
+              <w:right w:type="dxa" w:w="140"/>
+            </w:tcMar>
+            <w:vAlign w:val="center"/>
+          </w:tcPr>
+          <w:p>
+            <w:pPr>
+              <w:spacing w:after="0" w:line="260"/>
+            </w:pPr>
+            <w:r>
+              <w:rPr>
+                <w:rFonts w:ascii="Calibri" w:cs="Calibri" w:eastAsia="Calibri" w:hAnsi="Calibri"/>
+                <w:color w:val="1F2A37"/>
+                <w:sz w:val="18"/>
+                <w:szCs w:val="18"/>
+              </w:rPr>
+              <w:t xml:space="preserve">O subsíndico fiscaliza, a administradora executa (termina com a pergunta "quem fiscaliza a administradora?")</w:t>
+            </w:r>
+          </w:p>
+        </w:tc>
+        <w:tc>
+          <w:tcPr>
+            <w:tcW w:type="dxa" w:w="959"/>
             <w:shd w:fill="FFFFFF" w:val="clear"/>
             <w:tcMar>
               <w:top w:type="dxa" w:w="90"/>
@@ -1565,28 +1565,28 @@
         </w:tc>
         <w:tc>
           <w:tcPr>
-            <w:tcW w:type="dxa" w:w="1101"/>
-            <w:shd w:fill="FFFFFF" w:val="clear"/>
-            <w:tcMar>
-              <w:top w:type="dxa" w:w="90"/>
-              <w:left w:type="dxa" w:w="140"/>
-              <w:bottom w:type="dxa" w:w="90"/>
-              <w:right w:type="dxa" w:w="140"/>
-            </w:tcMar>
-            <w:vAlign w:val="center"/>
-          </w:tcPr>
-          <w:p>
-            <w:pPr>
-              <w:spacing w:after="0" w:line="260"/>
-            </w:pPr>
-            <w:r>
-              <w:rPr>
-                <w:rFonts w:ascii="Calibri" w:cs="Calibri" w:eastAsia="Calibri" w:hAnsi="Calibri"/>
-                <w:color w:val="1F2A37"/>
-                <w:sz w:val="18"/>
-                <w:szCs w:val="18"/>
-              </w:rPr>
-              <w:t xml:space="preserve">4 min</w:t>
+            <w:tcW w:type="dxa" w:w="852"/>
+            <w:shd w:fill="FFFFFF" w:val="clear"/>
+            <w:tcMar>
+              <w:top w:type="dxa" w:w="90"/>
+              <w:left w:type="dxa" w:w="140"/>
+              <w:bottom w:type="dxa" w:w="90"/>
+              <w:right w:type="dxa" w:w="140"/>
+            </w:tcMar>
+            <w:vAlign w:val="center"/>
+          </w:tcPr>
+          <w:p>
+            <w:pPr>
+              <w:spacing w:after="0" w:line="260"/>
+            </w:pPr>
+            <w:r>
+              <w:rPr>
+                <w:rFonts w:ascii="Calibri" w:cs="Calibri" w:eastAsia="Calibri" w:hAnsi="Calibri"/>
+                <w:color w:val="1F2A37"/>
+                <w:sz w:val="18"/>
+                <w:szCs w:val="18"/>
+              </w:rPr>
+              <w:t xml:space="preserve">3 min</w:t>
             </w:r>
           </w:p>
         </w:tc>
@@ -1597,61 +1597,61 @@
         </w:trPr>
         <w:tc>
           <w:tcPr>
-            <w:tcW w:type="dxa" w:w="864"/>
-            <w:shd w:fill="F5F5F5" w:val="clear"/>
-            <w:tcMar>
-              <w:top w:type="dxa" w:w="90"/>
-              <w:left w:type="dxa" w:w="140"/>
-              <w:bottom w:type="dxa" w:w="90"/>
-              <w:right w:type="dxa" w:w="140"/>
-            </w:tcMar>
-            <w:vAlign w:val="center"/>
-          </w:tcPr>
-          <w:p>
-            <w:pPr>
-              <w:spacing w:after="0" w:line="260"/>
-            </w:pPr>
-            <w:r>
-              <w:rPr>
-                <w:rFonts w:ascii="Calibri" w:cs="Calibri" w:eastAsia="Calibri" w:hAnsi="Calibri"/>
-                <w:color w:val="1F2A37"/>
-                <w:sz w:val="18"/>
-                <w:szCs w:val="18"/>
-              </w:rPr>
-              <w:t xml:space="preserve">5–6</w:t>
-            </w:r>
-          </w:p>
-        </w:tc>
-        <w:tc>
-          <w:tcPr>
-            <w:tcW w:type="dxa" w:w="6140"/>
-            <w:shd w:fill="F5F5F5" w:val="clear"/>
-            <w:tcMar>
-              <w:top w:type="dxa" w:w="90"/>
-              <w:left w:type="dxa" w:w="140"/>
-              <w:bottom w:type="dxa" w:w="90"/>
-              <w:right w:type="dxa" w:w="140"/>
-            </w:tcMar>
-            <w:vAlign w:val="center"/>
-          </w:tcPr>
-          <w:p>
-            <w:pPr>
-              <w:spacing w:after="0" w:line="260"/>
-            </w:pPr>
-            <w:r>
-              <w:rPr>
-                <w:rFonts w:ascii="Calibri" w:cs="Calibri" w:eastAsia="Calibri" w:hAnsi="Calibri"/>
-                <w:color w:val="1F2A37"/>
-                <w:sz w:val="18"/>
-                <w:szCs w:val="18"/>
-              </w:rPr>
-              <w:t xml:space="preserve">DF em números e equipe</w:t>
-            </w:r>
-          </w:p>
-        </w:tc>
-        <w:tc>
-          <w:tcPr>
-            <w:tcW w:type="dxa" w:w="1245"/>
+            <w:tcW w:type="dxa" w:w="845"/>
+            <w:shd w:fill="F5F5F5" w:val="clear"/>
+            <w:tcMar>
+              <w:top w:type="dxa" w:w="90"/>
+              <w:left w:type="dxa" w:w="140"/>
+              <w:bottom w:type="dxa" w:w="90"/>
+              <w:right w:type="dxa" w:w="140"/>
+            </w:tcMar>
+            <w:vAlign w:val="center"/>
+          </w:tcPr>
+          <w:p>
+            <w:pPr>
+              <w:spacing w:after="0" w:line="260"/>
+            </w:pPr>
+            <w:r>
+              <w:rPr>
+                <w:rFonts w:ascii="Calibri" w:cs="Calibri" w:eastAsia="Calibri" w:hAnsi="Calibri"/>
+                <w:color w:val="1F2A37"/>
+                <w:sz w:val="18"/>
+                <w:szCs w:val="18"/>
+              </w:rPr>
+              <w:t xml:space="preserve">5</w:t>
+            </w:r>
+          </w:p>
+        </w:tc>
+        <w:tc>
+          <w:tcPr>
+            <w:tcW w:type="dxa" w:w="6694"/>
+            <w:shd w:fill="F5F5F5" w:val="clear"/>
+            <w:tcMar>
+              <w:top w:type="dxa" w:w="90"/>
+              <w:left w:type="dxa" w:w="140"/>
+              <w:bottom w:type="dxa" w:w="90"/>
+              <w:right w:type="dxa" w:w="140"/>
+            </w:tcMar>
+            <w:vAlign w:val="center"/>
+          </w:tcPr>
+          <w:p>
+            <w:pPr>
+              <w:spacing w:after="0" w:line="260"/>
+            </w:pPr>
+            <w:r>
+              <w:rPr>
+                <w:rFonts w:ascii="Calibri" w:cs="Calibri" w:eastAsia="Calibri" w:hAnsi="Calibri"/>
+                <w:color w:val="1F2A37"/>
+                <w:sz w:val="18"/>
+                <w:szCs w:val="18"/>
+              </w:rPr>
+              <w:t xml:space="preserve">Quem executa não deve fiscalizar a si mesmo (comparativo de modelos, responde a pergunta do slide 4)</w:t>
+            </w:r>
+          </w:p>
+        </w:tc>
+        <w:tc>
+          <w:tcPr>
+            <w:tcW w:type="dxa" w:w="959"/>
             <w:shd w:fill="F5F5F5" w:val="clear"/>
             <w:tcMar>
               <w:top w:type="dxa" w:w="90"/>
@@ -1678,28 +1678,28 @@
         </w:tc>
         <w:tc>
           <w:tcPr>
-            <w:tcW w:type="dxa" w:w="1101"/>
-            <w:shd w:fill="F5F5F5" w:val="clear"/>
-            <w:tcMar>
-              <w:top w:type="dxa" w:w="90"/>
-              <w:left w:type="dxa" w:w="140"/>
-              <w:bottom w:type="dxa" w:w="90"/>
-              <w:right w:type="dxa" w:w="140"/>
-            </w:tcMar>
-            <w:vAlign w:val="center"/>
-          </w:tcPr>
-          <w:p>
-            <w:pPr>
-              <w:spacing w:after="0" w:line="260"/>
-            </w:pPr>
-            <w:r>
-              <w:rPr>
-                <w:rFonts w:ascii="Calibri" w:cs="Calibri" w:eastAsia="Calibri" w:hAnsi="Calibri"/>
-                <w:color w:val="1F2A37"/>
-                <w:sz w:val="18"/>
-                <w:szCs w:val="18"/>
-              </w:rPr>
-              <w:t xml:space="preserve">4 min</w:t>
+            <w:tcW w:type="dxa" w:w="852"/>
+            <w:shd w:fill="F5F5F5" w:val="clear"/>
+            <w:tcMar>
+              <w:top w:type="dxa" w:w="90"/>
+              <w:left w:type="dxa" w:w="140"/>
+              <w:bottom w:type="dxa" w:w="90"/>
+              <w:right w:type="dxa" w:w="140"/>
+            </w:tcMar>
+            <w:vAlign w:val="center"/>
+          </w:tcPr>
+          <w:p>
+            <w:pPr>
+              <w:spacing w:after="0" w:line="260"/>
+            </w:pPr>
+            <w:r>
+              <w:rPr>
+                <w:rFonts w:ascii="Calibri" w:cs="Calibri" w:eastAsia="Calibri" w:hAnsi="Calibri"/>
+                <w:color w:val="1F2A37"/>
+                <w:sz w:val="18"/>
+                <w:szCs w:val="18"/>
+              </w:rPr>
+              <w:t xml:space="preserve">2 min</w:t>
             </w:r>
           </w:p>
         </w:tc>
@@ -1710,109 +1710,109 @@
         </w:trPr>
         <w:tc>
           <w:tcPr>
-            <w:tcW w:type="dxa" w:w="864"/>
-            <w:shd w:fill="FFFFFF" w:val="clear"/>
-            <w:tcMar>
-              <w:top w:type="dxa" w:w="90"/>
-              <w:left w:type="dxa" w:w="140"/>
-              <w:bottom w:type="dxa" w:w="90"/>
-              <w:right w:type="dxa" w:w="140"/>
-            </w:tcMar>
-            <w:vAlign w:val="center"/>
-          </w:tcPr>
-          <w:p>
-            <w:pPr>
-              <w:spacing w:after="0" w:line="260"/>
-            </w:pPr>
-            <w:r>
-              <w:rPr>
-                <w:rFonts w:ascii="Calibri" w:cs="Calibri" w:eastAsia="Calibri" w:hAnsi="Calibri"/>
-                <w:color w:val="1F2A37"/>
-                <w:sz w:val="18"/>
-                <w:szCs w:val="18"/>
-              </w:rPr>
-              <w:t xml:space="preserve">7–8</w:t>
-            </w:r>
-          </w:p>
-        </w:tc>
-        <w:tc>
-          <w:tcPr>
-            <w:tcW w:type="dxa" w:w="6140"/>
-            <w:shd w:fill="FFFFFF" w:val="clear"/>
-            <w:tcMar>
-              <w:top w:type="dxa" w:w="90"/>
-              <w:left w:type="dxa" w:w="140"/>
-              <w:bottom w:type="dxa" w:w="90"/>
-              <w:right w:type="dxa" w:w="140"/>
-            </w:tcMar>
-            <w:vAlign w:val="center"/>
-          </w:tcPr>
-          <w:p>
-            <w:pPr>
-              <w:spacing w:after="0" w:line="260"/>
-            </w:pPr>
-            <w:r>
-              <w:rPr>
-                <w:rFonts w:ascii="Calibri" w:cs="Calibri" w:eastAsia="Calibri" w:hAnsi="Calibri"/>
-                <w:color w:val="1F2A37"/>
-                <w:sz w:val="18"/>
-                <w:szCs w:val="18"/>
-              </w:rPr>
-              <w:t xml:space="preserve">Cases</w:t>
-            </w:r>
-          </w:p>
-        </w:tc>
-        <w:tc>
-          <w:tcPr>
-            <w:tcW w:type="dxa" w:w="1245"/>
-            <w:shd w:fill="FFFFFF" w:val="clear"/>
-            <w:tcMar>
-              <w:top w:type="dxa" w:w="90"/>
-              <w:left w:type="dxa" w:w="140"/>
-              <w:bottom w:type="dxa" w:w="90"/>
-              <w:right w:type="dxa" w:w="140"/>
-            </w:tcMar>
-            <w:vAlign w:val="center"/>
-          </w:tcPr>
-          <w:p>
-            <w:pPr>
-              <w:spacing w:after="0" w:line="260"/>
-            </w:pPr>
-            <w:r>
-              <w:rPr>
-                <w:rFonts w:ascii="Calibri" w:cs="Calibri" w:eastAsia="Calibri" w:hAnsi="Calibri"/>
-                <w:color w:val="1F2A37"/>
-                <w:sz w:val="18"/>
-                <w:szCs w:val="18"/>
-              </w:rPr>
-              <w:t xml:space="preserve">Denise e Caio</w:t>
-            </w:r>
-          </w:p>
-        </w:tc>
-        <w:tc>
-          <w:tcPr>
-            <w:tcW w:type="dxa" w:w="1101"/>
-            <w:shd w:fill="FFFFFF" w:val="clear"/>
-            <w:tcMar>
-              <w:top w:type="dxa" w:w="90"/>
-              <w:left w:type="dxa" w:w="140"/>
-              <w:bottom w:type="dxa" w:w="90"/>
-              <w:right w:type="dxa" w:w="140"/>
-            </w:tcMar>
-            <w:vAlign w:val="center"/>
-          </w:tcPr>
-          <w:p>
-            <w:pPr>
-              <w:spacing w:after="0" w:line="260"/>
-            </w:pPr>
-            <w:r>
-              <w:rPr>
-                <w:rFonts w:ascii="Calibri" w:cs="Calibri" w:eastAsia="Calibri" w:hAnsi="Calibri"/>
-                <w:color w:val="1F2A37"/>
-                <w:sz w:val="18"/>
-                <w:szCs w:val="18"/>
-              </w:rPr>
-              <w:t xml:space="preserve">6 min</w:t>
+            <w:tcW w:type="dxa" w:w="845"/>
+            <w:shd w:fill="FFFFFF" w:val="clear"/>
+            <w:tcMar>
+              <w:top w:type="dxa" w:w="90"/>
+              <w:left w:type="dxa" w:w="140"/>
+              <w:bottom w:type="dxa" w:w="90"/>
+              <w:right w:type="dxa" w:w="140"/>
+            </w:tcMar>
+            <w:vAlign w:val="center"/>
+          </w:tcPr>
+          <w:p>
+            <w:pPr>
+              <w:spacing w:after="0" w:line="260"/>
+            </w:pPr>
+            <w:r>
+              <w:rPr>
+                <w:rFonts w:ascii="Calibri" w:cs="Calibri" w:eastAsia="Calibri" w:hAnsi="Calibri"/>
+                <w:color w:val="1F2A37"/>
+                <w:sz w:val="18"/>
+                <w:szCs w:val="18"/>
+              </w:rPr>
+              <w:t xml:space="preserve">6–7</w:t>
+            </w:r>
+          </w:p>
+        </w:tc>
+        <w:tc>
+          <w:tcPr>
+            <w:tcW w:type="dxa" w:w="6694"/>
+            <w:shd w:fill="FFFFFF" w:val="clear"/>
+            <w:tcMar>
+              <w:top w:type="dxa" w:w="90"/>
+              <w:left w:type="dxa" w:w="140"/>
+              <w:bottom w:type="dxa" w:w="90"/>
+              <w:right w:type="dxa" w:w="140"/>
+            </w:tcMar>
+            <w:vAlign w:val="center"/>
+          </w:tcPr>
+          <w:p>
+            <w:pPr>
+              <w:spacing w:after="0" w:line="260"/>
+            </w:pPr>
+            <w:r>
+              <w:rPr>
+                <w:rFonts w:ascii="Calibri" w:cs="Calibri" w:eastAsia="Calibri" w:hAnsi="Calibri"/>
+                <w:color w:val="1F2A37"/>
+                <w:sz w:val="18"/>
+                <w:szCs w:val="18"/>
+              </w:rPr>
+              <w:t xml:space="preserve">DF em números e equipe</w:t>
+            </w:r>
+          </w:p>
+        </w:tc>
+        <w:tc>
+          <w:tcPr>
+            <w:tcW w:type="dxa" w:w="959"/>
+            <w:shd w:fill="FFFFFF" w:val="clear"/>
+            <w:tcMar>
+              <w:top w:type="dxa" w:w="90"/>
+              <w:left w:type="dxa" w:w="140"/>
+              <w:bottom w:type="dxa" w:w="90"/>
+              <w:right w:type="dxa" w:w="140"/>
+            </w:tcMar>
+            <w:vAlign w:val="center"/>
+          </w:tcPr>
+          <w:p>
+            <w:pPr>
+              <w:spacing w:after="0" w:line="260"/>
+            </w:pPr>
+            <w:r>
+              <w:rPr>
+                <w:rFonts w:ascii="Calibri" w:cs="Calibri" w:eastAsia="Calibri" w:hAnsi="Calibri"/>
+                <w:color w:val="1F2A37"/>
+                <w:sz w:val="18"/>
+                <w:szCs w:val="18"/>
+              </w:rPr>
+              <w:t xml:space="preserve">Denise</w:t>
+            </w:r>
+          </w:p>
+        </w:tc>
+        <w:tc>
+          <w:tcPr>
+            <w:tcW w:type="dxa" w:w="852"/>
+            <w:shd w:fill="FFFFFF" w:val="clear"/>
+            <w:tcMar>
+              <w:top w:type="dxa" w:w="90"/>
+              <w:left w:type="dxa" w:w="140"/>
+              <w:bottom w:type="dxa" w:w="90"/>
+              <w:right w:type="dxa" w:w="140"/>
+            </w:tcMar>
+            <w:vAlign w:val="center"/>
+          </w:tcPr>
+          <w:p>
+            <w:pPr>
+              <w:spacing w:after="0" w:line="260"/>
+            </w:pPr>
+            <w:r>
+              <w:rPr>
+                <w:rFonts w:ascii="Calibri" w:cs="Calibri" w:eastAsia="Calibri" w:hAnsi="Calibri"/>
+                <w:color w:val="1F2A37"/>
+                <w:sz w:val="18"/>
+                <w:szCs w:val="18"/>
+              </w:rPr>
+              <w:t xml:space="preserve">4 min</w:t>
             </w:r>
           </w:p>
         </w:tc>
@@ -1823,109 +1823,109 @@
         </w:trPr>
         <w:tc>
           <w:tcPr>
-            <w:tcW w:type="dxa" w:w="864"/>
-            <w:shd w:fill="F5F5F5" w:val="clear"/>
-            <w:tcMar>
-              <w:top w:type="dxa" w:w="90"/>
-              <w:left w:type="dxa" w:w="140"/>
-              <w:bottom w:type="dxa" w:w="90"/>
-              <w:right w:type="dxa" w:w="140"/>
-            </w:tcMar>
-            <w:vAlign w:val="center"/>
-          </w:tcPr>
-          <w:p>
-            <w:pPr>
-              <w:spacing w:after="0" w:line="260"/>
-            </w:pPr>
-            <w:r>
-              <w:rPr>
-                <w:rFonts w:ascii="Calibri" w:cs="Calibri" w:eastAsia="Calibri" w:hAnsi="Calibri"/>
-                <w:color w:val="1F2A37"/>
-                <w:sz w:val="18"/>
-                <w:szCs w:val="18"/>
-              </w:rPr>
-              <w:t xml:space="preserve">9</w:t>
-            </w:r>
-          </w:p>
-        </w:tc>
-        <w:tc>
-          <w:tcPr>
-            <w:tcW w:type="dxa" w:w="6140"/>
-            <w:shd w:fill="F5F5F5" w:val="clear"/>
-            <w:tcMar>
-              <w:top w:type="dxa" w:w="90"/>
-              <w:left w:type="dxa" w:w="140"/>
-              <w:bottom w:type="dxa" w:w="90"/>
-              <w:right w:type="dxa" w:w="140"/>
-            </w:tcMar>
-            <w:vAlign w:val="center"/>
-          </w:tcPr>
-          <w:p>
-            <w:pPr>
-              <w:spacing w:after="0" w:line="260"/>
-            </w:pPr>
-            <w:r>
-              <w:rPr>
-                <w:rFonts w:ascii="Calibri" w:cs="Calibri" w:eastAsia="Calibri" w:hAnsi="Calibri"/>
-                <w:color w:val="1F2A37"/>
-                <w:sz w:val="18"/>
-                <w:szCs w:val="18"/>
-              </w:rPr>
-              <w:t xml:space="preserve">Metodologia de rateio</w:t>
-            </w:r>
-          </w:p>
-        </w:tc>
-        <w:tc>
-          <w:tcPr>
-            <w:tcW w:type="dxa" w:w="1245"/>
-            <w:shd w:fill="F5F5F5" w:val="clear"/>
-            <w:tcMar>
-              <w:top w:type="dxa" w:w="90"/>
-              <w:left w:type="dxa" w:w="140"/>
-              <w:bottom w:type="dxa" w:w="90"/>
-              <w:right w:type="dxa" w:w="140"/>
-            </w:tcMar>
-            <w:vAlign w:val="center"/>
-          </w:tcPr>
-          <w:p>
-            <w:pPr>
-              <w:spacing w:after="0" w:line="260"/>
-            </w:pPr>
-            <w:r>
-              <w:rPr>
-                <w:rFonts w:ascii="Calibri" w:cs="Calibri" w:eastAsia="Calibri" w:hAnsi="Calibri"/>
-                <w:color w:val="1F2A37"/>
-                <w:sz w:val="18"/>
-                <w:szCs w:val="18"/>
-              </w:rPr>
-              <w:t xml:space="preserve">Caio</w:t>
-            </w:r>
-          </w:p>
-        </w:tc>
-        <w:tc>
-          <w:tcPr>
-            <w:tcW w:type="dxa" w:w="1101"/>
-            <w:shd w:fill="F5F5F5" w:val="clear"/>
-            <w:tcMar>
-              <w:top w:type="dxa" w:w="90"/>
-              <w:left w:type="dxa" w:w="140"/>
-              <w:bottom w:type="dxa" w:w="90"/>
-              <w:right w:type="dxa" w:w="140"/>
-            </w:tcMar>
-            <w:vAlign w:val="center"/>
-          </w:tcPr>
-          <w:p>
-            <w:pPr>
-              <w:spacing w:after="0" w:line="260"/>
-            </w:pPr>
-            <w:r>
-              <w:rPr>
-                <w:rFonts w:ascii="Calibri" w:cs="Calibri" w:eastAsia="Calibri" w:hAnsi="Calibri"/>
-                <w:color w:val="1F2A37"/>
-                <w:sz w:val="18"/>
-                <w:szCs w:val="18"/>
-              </w:rPr>
-              <w:t xml:space="preserve">4 min</w:t>
+            <w:tcW w:type="dxa" w:w="845"/>
+            <w:shd w:fill="F5F5F5" w:val="clear"/>
+            <w:tcMar>
+              <w:top w:type="dxa" w:w="90"/>
+              <w:left w:type="dxa" w:w="140"/>
+              <w:bottom w:type="dxa" w:w="90"/>
+              <w:right w:type="dxa" w:w="140"/>
+            </w:tcMar>
+            <w:vAlign w:val="center"/>
+          </w:tcPr>
+          <w:p>
+            <w:pPr>
+              <w:spacing w:after="0" w:line="260"/>
+            </w:pPr>
+            <w:r>
+              <w:rPr>
+                <w:rFonts w:ascii="Calibri" w:cs="Calibri" w:eastAsia="Calibri" w:hAnsi="Calibri"/>
+                <w:color w:val="1F2A37"/>
+                <w:sz w:val="18"/>
+                <w:szCs w:val="18"/>
+              </w:rPr>
+              <w:t xml:space="preserve">8–9</w:t>
+            </w:r>
+          </w:p>
+        </w:tc>
+        <w:tc>
+          <w:tcPr>
+            <w:tcW w:type="dxa" w:w="6694"/>
+            <w:shd w:fill="F5F5F5" w:val="clear"/>
+            <w:tcMar>
+              <w:top w:type="dxa" w:w="90"/>
+              <w:left w:type="dxa" w:w="140"/>
+              <w:bottom w:type="dxa" w:w="90"/>
+              <w:right w:type="dxa" w:w="140"/>
+            </w:tcMar>
+            <w:vAlign w:val="center"/>
+          </w:tcPr>
+          <w:p>
+            <w:pPr>
+              <w:spacing w:after="0" w:line="260"/>
+            </w:pPr>
+            <w:r>
+              <w:rPr>
+                <w:rFonts w:ascii="Calibri" w:cs="Calibri" w:eastAsia="Calibri" w:hAnsi="Calibri"/>
+                <w:color w:val="1F2A37"/>
+                <w:sz w:val="18"/>
+                <w:szCs w:val="18"/>
+              </w:rPr>
+              <w:t xml:space="preserve">Cases de rateio e O Parque</w:t>
+            </w:r>
+          </w:p>
+        </w:tc>
+        <w:tc>
+          <w:tcPr>
+            <w:tcW w:type="dxa" w:w="959"/>
+            <w:shd w:fill="F5F5F5" w:val="clear"/>
+            <w:tcMar>
+              <w:top w:type="dxa" w:w="90"/>
+              <w:left w:type="dxa" w:w="140"/>
+              <w:bottom w:type="dxa" w:w="90"/>
+              <w:right w:type="dxa" w:w="140"/>
+            </w:tcMar>
+            <w:vAlign w:val="center"/>
+          </w:tcPr>
+          <w:p>
+            <w:pPr>
+              <w:spacing w:after="0" w:line="260"/>
+            </w:pPr>
+            <w:r>
+              <w:rPr>
+                <w:rFonts w:ascii="Calibri" w:cs="Calibri" w:eastAsia="Calibri" w:hAnsi="Calibri"/>
+                <w:color w:val="1F2A37"/>
+                <w:sz w:val="18"/>
+                <w:szCs w:val="18"/>
+              </w:rPr>
+              <w:t xml:space="preserve">Denise e Caio</w:t>
+            </w:r>
+          </w:p>
+        </w:tc>
+        <w:tc>
+          <w:tcPr>
+            <w:tcW w:type="dxa" w:w="852"/>
+            <w:shd w:fill="F5F5F5" w:val="clear"/>
+            <w:tcMar>
+              <w:top w:type="dxa" w:w="90"/>
+              <w:left w:type="dxa" w:w="140"/>
+              <w:bottom w:type="dxa" w:w="90"/>
+              <w:right w:type="dxa" w:w="140"/>
+            </w:tcMar>
+            <w:vAlign w:val="center"/>
+          </w:tcPr>
+          <w:p>
+            <w:pPr>
+              <w:spacing w:after="0" w:line="260"/>
+            </w:pPr>
+            <w:r>
+              <w:rPr>
+                <w:rFonts w:ascii="Calibri" w:cs="Calibri" w:eastAsia="Calibri" w:hAnsi="Calibri"/>
+                <w:color w:val="1F2A37"/>
+                <w:sz w:val="18"/>
+                <w:szCs w:val="18"/>
+              </w:rPr>
+              <w:t xml:space="preserve">6 min</w:t>
             </w:r>
           </w:p>
         </w:tc>
@@ -1936,7 +1936,7 @@
         </w:trPr>
         <w:tc>
           <w:tcPr>
-            <w:tcW w:type="dxa" w:w="864"/>
+            <w:tcW w:type="dxa" w:w="845"/>
             <w:shd w:fill="FFFFFF" w:val="clear"/>
             <w:tcMar>
               <w:top w:type="dxa" w:w="90"/>
@@ -1963,82 +1963,82 @@
         </w:tc>
         <w:tc>
           <w:tcPr>
-            <w:tcW w:type="dxa" w:w="6140"/>
-            <w:shd w:fill="FFFFFF" w:val="clear"/>
-            <w:tcMar>
-              <w:top w:type="dxa" w:w="90"/>
-              <w:left w:type="dxa" w:w="140"/>
-              <w:bottom w:type="dxa" w:w="90"/>
-              <w:right w:type="dxa" w:w="140"/>
-            </w:tcMar>
-            <w:vAlign w:val="center"/>
-          </w:tcPr>
-          <w:p>
-            <w:pPr>
-              <w:spacing w:after="0" w:line="260"/>
-            </w:pPr>
-            <w:r>
-              <w:rPr>
-                <w:rFonts w:ascii="Calibri" w:cs="Calibri" w:eastAsia="Calibri" w:hAnsi="Calibri"/>
-                <w:color w:val="1F2A37"/>
-                <w:sz w:val="18"/>
-                <w:szCs w:val="18"/>
-              </w:rPr>
-              <w:t xml:space="preserve">Presença por unidade</w:t>
-            </w:r>
-          </w:p>
-        </w:tc>
-        <w:tc>
-          <w:tcPr>
-            <w:tcW w:type="dxa" w:w="1245"/>
-            <w:shd w:fill="FFFFFF" w:val="clear"/>
-            <w:tcMar>
-              <w:top w:type="dxa" w:w="90"/>
-              <w:left w:type="dxa" w:w="140"/>
-              <w:bottom w:type="dxa" w:w="90"/>
-              <w:right w:type="dxa" w:w="140"/>
-            </w:tcMar>
-            <w:vAlign w:val="center"/>
-          </w:tcPr>
-          <w:p>
-            <w:pPr>
-              <w:spacing w:after="0" w:line="260"/>
-            </w:pPr>
-            <w:r>
-              <w:rPr>
-                <w:rFonts w:ascii="Calibri" w:cs="Calibri" w:eastAsia="Calibri" w:hAnsi="Calibri"/>
-                <w:color w:val="1F2A37"/>
-                <w:sz w:val="18"/>
-                <w:szCs w:val="18"/>
-              </w:rPr>
-              <w:t xml:space="preserve">Denise</w:t>
-            </w:r>
-          </w:p>
-        </w:tc>
-        <w:tc>
-          <w:tcPr>
-            <w:tcW w:type="dxa" w:w="1101"/>
-            <w:shd w:fill="FFFFFF" w:val="clear"/>
-            <w:tcMar>
-              <w:top w:type="dxa" w:w="90"/>
-              <w:left w:type="dxa" w:w="140"/>
-              <w:bottom w:type="dxa" w:w="90"/>
-              <w:right w:type="dxa" w:w="140"/>
-            </w:tcMar>
-            <w:vAlign w:val="center"/>
-          </w:tcPr>
-          <w:p>
-            <w:pPr>
-              <w:spacing w:after="0" w:line="260"/>
-            </w:pPr>
-            <w:r>
-              <w:rPr>
-                <w:rFonts w:ascii="Calibri" w:cs="Calibri" w:eastAsia="Calibri" w:hAnsi="Calibri"/>
-                <w:color w:val="1F2A37"/>
-                <w:sz w:val="18"/>
-                <w:szCs w:val="18"/>
-              </w:rPr>
-              <w:t xml:space="preserve">2 min</w:t>
+            <w:tcW w:type="dxa" w:w="6694"/>
+            <w:shd w:fill="FFFFFF" w:val="clear"/>
+            <w:tcMar>
+              <w:top w:type="dxa" w:w="90"/>
+              <w:left w:type="dxa" w:w="140"/>
+              <w:bottom w:type="dxa" w:w="90"/>
+              <w:right w:type="dxa" w:w="140"/>
+            </w:tcMar>
+            <w:vAlign w:val="center"/>
+          </w:tcPr>
+          <w:p>
+            <w:pPr>
+              <w:spacing w:after="0" w:line="260"/>
+            </w:pPr>
+            <w:r>
+              <w:rPr>
+                <w:rFonts w:ascii="Calibri" w:cs="Calibri" w:eastAsia="Calibri" w:hAnsi="Calibri"/>
+                <w:color w:val="1F2A37"/>
+                <w:sz w:val="18"/>
+                <w:szCs w:val="18"/>
+              </w:rPr>
+              <w:t xml:space="preserve">Rateio: cada setor paga só o que é seu</w:t>
+            </w:r>
+          </w:p>
+        </w:tc>
+        <w:tc>
+          <w:tcPr>
+            <w:tcW w:type="dxa" w:w="959"/>
+            <w:shd w:fill="FFFFFF" w:val="clear"/>
+            <w:tcMar>
+              <w:top w:type="dxa" w:w="90"/>
+              <w:left w:type="dxa" w:w="140"/>
+              <w:bottom w:type="dxa" w:w="90"/>
+              <w:right w:type="dxa" w:w="140"/>
+            </w:tcMar>
+            <w:vAlign w:val="center"/>
+          </w:tcPr>
+          <w:p>
+            <w:pPr>
+              <w:spacing w:after="0" w:line="260"/>
+            </w:pPr>
+            <w:r>
+              <w:rPr>
+                <w:rFonts w:ascii="Calibri" w:cs="Calibri" w:eastAsia="Calibri" w:hAnsi="Calibri"/>
+                <w:color w:val="1F2A37"/>
+                <w:sz w:val="18"/>
+                <w:szCs w:val="18"/>
+              </w:rPr>
+              <w:t xml:space="preserve">Caio</w:t>
+            </w:r>
+          </w:p>
+        </w:tc>
+        <w:tc>
+          <w:tcPr>
+            <w:tcW w:type="dxa" w:w="852"/>
+            <w:shd w:fill="FFFFFF" w:val="clear"/>
+            <w:tcMar>
+              <w:top w:type="dxa" w:w="90"/>
+              <w:left w:type="dxa" w:w="140"/>
+              <w:bottom w:type="dxa" w:w="90"/>
+              <w:right w:type="dxa" w:w="140"/>
+            </w:tcMar>
+            <w:vAlign w:val="center"/>
+          </w:tcPr>
+          <w:p>
+            <w:pPr>
+              <w:spacing w:after="0" w:line="260"/>
+            </w:pPr>
+            <w:r>
+              <w:rPr>
+                <w:rFonts w:ascii="Calibri" w:cs="Calibri" w:eastAsia="Calibri" w:hAnsi="Calibri"/>
+                <w:color w:val="1F2A37"/>
+                <w:sz w:val="18"/>
+                <w:szCs w:val="18"/>
+              </w:rPr>
+              <w:t xml:space="preserve">4 min</w:t>
             </w:r>
           </w:p>
         </w:tc>
@@ -2049,7 +2049,7 @@
         </w:trPr>
         <w:tc>
           <w:tcPr>
-            <w:tcW w:type="dxa" w:w="864"/>
+            <w:tcW w:type="dxa" w:w="845"/>
             <w:shd w:fill="F5F5F5" w:val="clear"/>
             <w:tcMar>
               <w:top w:type="dxa" w:w="90"/>
@@ -2076,34 +2076,34 @@
         </w:tc>
         <w:tc>
           <w:tcPr>
-            <w:tcW w:type="dxa" w:w="6140"/>
-            <w:shd w:fill="F5F5F5" w:val="clear"/>
-            <w:tcMar>
-              <w:top w:type="dxa" w:w="90"/>
-              <w:left w:type="dxa" w:w="140"/>
-              <w:bottom w:type="dxa" w:w="90"/>
-              <w:right w:type="dxa" w:w="140"/>
-            </w:tcMar>
-            <w:vAlign w:val="center"/>
-          </w:tcPr>
-          <w:p>
-            <w:pPr>
-              <w:spacing w:after="0" w:line="260"/>
-            </w:pPr>
-            <w:r>
-              <w:rPr>
-                <w:rFonts w:ascii="Calibri" w:cs="Calibri" w:eastAsia="Calibri" w:hAnsi="Calibri"/>
-                <w:color w:val="1F2A37"/>
-                <w:sz w:val="18"/>
-                <w:szCs w:val="18"/>
-              </w:rPr>
-              <w:t xml:space="preserve">SLAs</w:t>
-            </w:r>
-          </w:p>
-        </w:tc>
-        <w:tc>
-          <w:tcPr>
-            <w:tcW w:type="dxa" w:w="1245"/>
+            <w:tcW w:type="dxa" w:w="6694"/>
+            <w:shd w:fill="F5F5F5" w:val="clear"/>
+            <w:tcMar>
+              <w:top w:type="dxa" w:w="90"/>
+              <w:left w:type="dxa" w:w="140"/>
+              <w:bottom w:type="dxa" w:w="90"/>
+              <w:right w:type="dxa" w:w="140"/>
+            </w:tcMar>
+            <w:vAlign w:val="center"/>
+          </w:tcPr>
+          <w:p>
+            <w:pPr>
+              <w:spacing w:after="0" w:line="260"/>
+            </w:pPr>
+            <w:r>
+              <w:rPr>
+                <w:rFonts w:ascii="Calibri" w:cs="Calibri" w:eastAsia="Calibri" w:hAnsi="Calibri"/>
+                <w:color w:val="1F2A37"/>
+                <w:sz w:val="18"/>
+                <w:szCs w:val="18"/>
+              </w:rPr>
+              <w:t xml:space="preserve">Presença por unidade</w:t>
+            </w:r>
+          </w:p>
+        </w:tc>
+        <w:tc>
+          <w:tcPr>
+            <w:tcW w:type="dxa" w:w="959"/>
             <w:shd w:fill="F5F5F5" w:val="clear"/>
             <w:tcMar>
               <w:top w:type="dxa" w:w="90"/>
@@ -2130,28 +2130,28 @@
         </w:tc>
         <w:tc>
           <w:tcPr>
-            <w:tcW w:type="dxa" w:w="1101"/>
-            <w:shd w:fill="F5F5F5" w:val="clear"/>
-            <w:tcMar>
-              <w:top w:type="dxa" w:w="90"/>
-              <w:left w:type="dxa" w:w="140"/>
-              <w:bottom w:type="dxa" w:w="90"/>
-              <w:right w:type="dxa" w:w="140"/>
-            </w:tcMar>
-            <w:vAlign w:val="center"/>
-          </w:tcPr>
-          <w:p>
-            <w:pPr>
-              <w:spacing w:after="0" w:line="260"/>
-            </w:pPr>
-            <w:r>
-              <w:rPr>
-                <w:rFonts w:ascii="Calibri" w:cs="Calibri" w:eastAsia="Calibri" w:hAnsi="Calibri"/>
-                <w:color w:val="1F2A37"/>
-                <w:sz w:val="18"/>
-                <w:szCs w:val="18"/>
-              </w:rPr>
-              <w:t xml:space="preserve">3 min</w:t>
+            <w:tcW w:type="dxa" w:w="852"/>
+            <w:shd w:fill="F5F5F5" w:val="clear"/>
+            <w:tcMar>
+              <w:top w:type="dxa" w:w="90"/>
+              <w:left w:type="dxa" w:w="140"/>
+              <w:bottom w:type="dxa" w:w="90"/>
+              <w:right w:type="dxa" w:w="140"/>
+            </w:tcMar>
+            <w:vAlign w:val="center"/>
+          </w:tcPr>
+          <w:p>
+            <w:pPr>
+              <w:spacing w:after="0" w:line="260"/>
+            </w:pPr>
+            <w:r>
+              <w:rPr>
+                <w:rFonts w:ascii="Calibri" w:cs="Calibri" w:eastAsia="Calibri" w:hAnsi="Calibri"/>
+                <w:color w:val="1F2A37"/>
+                <w:sz w:val="18"/>
+                <w:szCs w:val="18"/>
+              </w:rPr>
+              <w:t xml:space="preserve">2 min</w:t>
             </w:r>
           </w:p>
         </w:tc>
@@ -2162,7 +2162,7 @@
         </w:trPr>
         <w:tc>
           <w:tcPr>
-            <w:tcW w:type="dxa" w:w="864"/>
+            <w:tcW w:type="dxa" w:w="845"/>
             <w:shd w:fill="FFFFFF" w:val="clear"/>
             <w:tcMar>
               <w:top w:type="dxa" w:w="90"/>
@@ -2189,34 +2189,34 @@
         </w:tc>
         <w:tc>
           <w:tcPr>
-            <w:tcW w:type="dxa" w:w="6140"/>
-            <w:shd w:fill="FFFFFF" w:val="clear"/>
-            <w:tcMar>
-              <w:top w:type="dxa" w:w="90"/>
-              <w:left w:type="dxa" w:w="140"/>
-              <w:bottom w:type="dxa" w:w="90"/>
-              <w:right w:type="dxa" w:w="140"/>
-            </w:tcMar>
-            <w:vAlign w:val="center"/>
-          </w:tcPr>
-          <w:p>
-            <w:pPr>
-              <w:spacing w:after="0" w:line="260"/>
-            </w:pPr>
-            <w:r>
-              <w:rPr>
-                <w:rFonts w:ascii="Calibri" w:cs="Calibri" w:eastAsia="Calibri" w:hAnsi="Calibri"/>
-                <w:color w:val="1F2A37"/>
-                <w:sz w:val="18"/>
-                <w:szCs w:val="18"/>
-              </w:rPr>
-              <w:t xml:space="preserve">Governança de voto</w:t>
-            </w:r>
-          </w:p>
-        </w:tc>
-        <w:tc>
-          <w:tcPr>
-            <w:tcW w:type="dxa" w:w="1245"/>
+            <w:tcW w:type="dxa" w:w="6694"/>
+            <w:shd w:fill="FFFFFF" w:val="clear"/>
+            <w:tcMar>
+              <w:top w:type="dxa" w:w="90"/>
+              <w:left w:type="dxa" w:w="140"/>
+              <w:bottom w:type="dxa" w:w="90"/>
+              <w:right w:type="dxa" w:w="140"/>
+            </w:tcMar>
+            <w:vAlign w:val="center"/>
+          </w:tcPr>
+          <w:p>
+            <w:pPr>
+              <w:spacing w:after="0" w:line="260"/>
+            </w:pPr>
+            <w:r>
+              <w:rPr>
+                <w:rFonts w:ascii="Calibri" w:cs="Calibri" w:eastAsia="Calibri" w:hAnsi="Calibri"/>
+                <w:color w:val="1F2A37"/>
+                <w:sz w:val="18"/>
+                <w:szCs w:val="18"/>
+              </w:rPr>
+              <w:t xml:space="preserve">SLAs</w:t>
+            </w:r>
+          </w:p>
+        </w:tc>
+        <w:tc>
+          <w:tcPr>
+            <w:tcW w:type="dxa" w:w="959"/>
             <w:shd w:fill="FFFFFF" w:val="clear"/>
             <w:tcMar>
               <w:top w:type="dxa" w:w="90"/>
@@ -2243,7 +2243,7 @@
         </w:tc>
         <w:tc>
           <w:tcPr>
-            <w:tcW w:type="dxa" w:w="1101"/>
+            <w:tcW w:type="dxa" w:w="852"/>
             <w:shd w:fill="FFFFFF" w:val="clear"/>
             <w:tcMar>
               <w:top w:type="dxa" w:w="90"/>
@@ -2275,109 +2275,109 @@
         </w:trPr>
         <w:tc>
           <w:tcPr>
-            <w:tcW w:type="dxa" w:w="864"/>
-            <w:shd w:fill="F5F5F5" w:val="clear"/>
-            <w:tcMar>
-              <w:top w:type="dxa" w:w="90"/>
-              <w:left w:type="dxa" w:w="140"/>
-              <w:bottom w:type="dxa" w:w="90"/>
-              <w:right w:type="dxa" w:w="140"/>
-            </w:tcMar>
-            <w:vAlign w:val="center"/>
-          </w:tcPr>
-          <w:p>
-            <w:pPr>
-              <w:spacing w:after="0" w:line="260"/>
-            </w:pPr>
-            <w:r>
-              <w:rPr>
-                <w:rFonts w:ascii="Calibri" w:cs="Calibri" w:eastAsia="Calibri" w:hAnsi="Calibri"/>
-                <w:color w:val="1F2A37"/>
-                <w:sz w:val="18"/>
-                <w:szCs w:val="18"/>
-              </w:rPr>
-              <w:t xml:space="preserve">13–14</w:t>
-            </w:r>
-          </w:p>
-        </w:tc>
-        <w:tc>
-          <w:tcPr>
-            <w:tcW w:type="dxa" w:w="6140"/>
-            <w:shd w:fill="F5F5F5" w:val="clear"/>
-            <w:tcMar>
-              <w:top w:type="dxa" w:w="90"/>
-              <w:left w:type="dxa" w:w="140"/>
-              <w:bottom w:type="dxa" w:w="90"/>
-              <w:right w:type="dxa" w:w="140"/>
-            </w:tcMar>
-            <w:vAlign w:val="center"/>
-          </w:tcPr>
-          <w:p>
-            <w:pPr>
-              <w:spacing w:after="0" w:line="260"/>
-            </w:pPr>
-            <w:r>
-              <w:rPr>
-                <w:rFonts w:ascii="Calibri" w:cs="Calibri" w:eastAsia="Calibri" w:hAnsi="Calibri"/>
-                <w:color w:val="1F2A37"/>
-                <w:sz w:val="18"/>
-                <w:szCs w:val="18"/>
-              </w:rPr>
-              <w:t xml:space="preserve">Entregáveis e mobilização</w:t>
-            </w:r>
-          </w:p>
-        </w:tc>
-        <w:tc>
-          <w:tcPr>
-            <w:tcW w:type="dxa" w:w="1245"/>
-            <w:shd w:fill="F5F5F5" w:val="clear"/>
-            <w:tcMar>
-              <w:top w:type="dxa" w:w="90"/>
-              <w:left w:type="dxa" w:w="140"/>
-              <w:bottom w:type="dxa" w:w="90"/>
-              <w:right w:type="dxa" w:w="140"/>
-            </w:tcMar>
-            <w:vAlign w:val="center"/>
-          </w:tcPr>
-          <w:p>
-            <w:pPr>
-              <w:spacing w:after="0" w:line="260"/>
-            </w:pPr>
-            <w:r>
-              <w:rPr>
-                <w:rFonts w:ascii="Calibri" w:cs="Calibri" w:eastAsia="Calibri" w:hAnsi="Calibri"/>
-                <w:color w:val="1F2A37"/>
-                <w:sz w:val="18"/>
-                <w:szCs w:val="18"/>
-              </w:rPr>
-              <w:t xml:space="preserve">Caio</w:t>
-            </w:r>
-          </w:p>
-        </w:tc>
-        <w:tc>
-          <w:tcPr>
-            <w:tcW w:type="dxa" w:w="1101"/>
-            <w:shd w:fill="F5F5F5" w:val="clear"/>
-            <w:tcMar>
-              <w:top w:type="dxa" w:w="90"/>
-              <w:left w:type="dxa" w:w="140"/>
-              <w:bottom w:type="dxa" w:w="90"/>
-              <w:right w:type="dxa" w:w="140"/>
-            </w:tcMar>
-            <w:vAlign w:val="center"/>
-          </w:tcPr>
-          <w:p>
-            <w:pPr>
-              <w:spacing w:after="0" w:line="260"/>
-            </w:pPr>
-            <w:r>
-              <w:rPr>
-                <w:rFonts w:ascii="Calibri" w:cs="Calibri" w:eastAsia="Calibri" w:hAnsi="Calibri"/>
-                <w:color w:val="1F2A37"/>
-                <w:sz w:val="18"/>
-                <w:szCs w:val="18"/>
-              </w:rPr>
-              <w:t xml:space="preserve">4 min</w:t>
+            <w:tcW w:type="dxa" w:w="845"/>
+            <w:shd w:fill="F5F5F5" w:val="clear"/>
+            <w:tcMar>
+              <w:top w:type="dxa" w:w="90"/>
+              <w:left w:type="dxa" w:w="140"/>
+              <w:bottom w:type="dxa" w:w="90"/>
+              <w:right w:type="dxa" w:w="140"/>
+            </w:tcMar>
+            <w:vAlign w:val="center"/>
+          </w:tcPr>
+          <w:p>
+            <w:pPr>
+              <w:spacing w:after="0" w:line="260"/>
+            </w:pPr>
+            <w:r>
+              <w:rPr>
+                <w:rFonts w:ascii="Calibri" w:cs="Calibri" w:eastAsia="Calibri" w:hAnsi="Calibri"/>
+                <w:color w:val="1F2A37"/>
+                <w:sz w:val="18"/>
+                <w:szCs w:val="18"/>
+              </w:rPr>
+              <w:t xml:space="preserve">13</w:t>
+            </w:r>
+          </w:p>
+        </w:tc>
+        <w:tc>
+          <w:tcPr>
+            <w:tcW w:type="dxa" w:w="6694"/>
+            <w:shd w:fill="F5F5F5" w:val="clear"/>
+            <w:tcMar>
+              <w:top w:type="dxa" w:w="90"/>
+              <w:left w:type="dxa" w:w="140"/>
+              <w:bottom w:type="dxa" w:w="90"/>
+              <w:right w:type="dxa" w:w="140"/>
+            </w:tcMar>
+            <w:vAlign w:val="center"/>
+          </w:tcPr>
+          <w:p>
+            <w:pPr>
+              <w:spacing w:after="0" w:line="260"/>
+            </w:pPr>
+            <w:r>
+              <w:rPr>
+                <w:rFonts w:ascii="Calibri" w:cs="Calibri" w:eastAsia="Calibri" w:hAnsi="Calibri"/>
+                <w:color w:val="1F2A37"/>
+                <w:sz w:val="18"/>
+                <w:szCs w:val="18"/>
+              </w:rPr>
+              <w:t xml:space="preserve">Nenhum voto sem autorização escrita</w:t>
+            </w:r>
+          </w:p>
+        </w:tc>
+        <w:tc>
+          <w:tcPr>
+            <w:tcW w:type="dxa" w:w="959"/>
+            <w:shd w:fill="F5F5F5" w:val="clear"/>
+            <w:tcMar>
+              <w:top w:type="dxa" w:w="90"/>
+              <w:left w:type="dxa" w:w="140"/>
+              <w:bottom w:type="dxa" w:w="90"/>
+              <w:right w:type="dxa" w:w="140"/>
+            </w:tcMar>
+            <w:vAlign w:val="center"/>
+          </w:tcPr>
+          <w:p>
+            <w:pPr>
+              <w:spacing w:after="0" w:line="260"/>
+            </w:pPr>
+            <w:r>
+              <w:rPr>
+                <w:rFonts w:ascii="Calibri" w:cs="Calibri" w:eastAsia="Calibri" w:hAnsi="Calibri"/>
+                <w:color w:val="1F2A37"/>
+                <w:sz w:val="18"/>
+                <w:szCs w:val="18"/>
+              </w:rPr>
+              <w:t xml:space="preserve">Denise</w:t>
+            </w:r>
+          </w:p>
+        </w:tc>
+        <w:tc>
+          <w:tcPr>
+            <w:tcW w:type="dxa" w:w="852"/>
+            <w:shd w:fill="F5F5F5" w:val="clear"/>
+            <w:tcMar>
+              <w:top w:type="dxa" w:w="90"/>
+              <w:left w:type="dxa" w:w="140"/>
+              <w:bottom w:type="dxa" w:w="90"/>
+              <w:right w:type="dxa" w:w="140"/>
+            </w:tcMar>
+            <w:vAlign w:val="center"/>
+          </w:tcPr>
+          <w:p>
+            <w:pPr>
+              <w:spacing w:after="0" w:line="260"/>
+            </w:pPr>
+            <w:r>
+              <w:rPr>
+                <w:rFonts w:ascii="Calibri" w:cs="Calibri" w:eastAsia="Calibri" w:hAnsi="Calibri"/>
+                <w:color w:val="1F2A37"/>
+                <w:sz w:val="18"/>
+                <w:szCs w:val="18"/>
+              </w:rPr>
+              <w:t xml:space="preserve">3 min</w:t>
             </w:r>
           </w:p>
         </w:tc>
@@ -2388,88 +2388,88 @@
         </w:trPr>
         <w:tc>
           <w:tcPr>
-            <w:tcW w:type="dxa" w:w="864"/>
-            <w:shd w:fill="FFFFFF" w:val="clear"/>
-            <w:tcMar>
-              <w:top w:type="dxa" w:w="90"/>
-              <w:left w:type="dxa" w:w="140"/>
-              <w:bottom w:type="dxa" w:w="90"/>
-              <w:right w:type="dxa" w:w="140"/>
-            </w:tcMar>
-            <w:vAlign w:val="center"/>
-          </w:tcPr>
-          <w:p>
-            <w:pPr>
-              <w:spacing w:after="0" w:line="260"/>
-            </w:pPr>
-            <w:r>
-              <w:rPr>
-                <w:rFonts w:ascii="Calibri" w:cs="Calibri" w:eastAsia="Calibri" w:hAnsi="Calibri"/>
-                <w:color w:val="1F2A37"/>
-                <w:sz w:val="18"/>
-                <w:szCs w:val="18"/>
-              </w:rPr>
-              <w:t xml:space="preserve">15</w:t>
-            </w:r>
-          </w:p>
-        </w:tc>
-        <w:tc>
-          <w:tcPr>
-            <w:tcW w:type="dxa" w:w="6140"/>
-            <w:shd w:fill="FFFFFF" w:val="clear"/>
-            <w:tcMar>
-              <w:top w:type="dxa" w:w="90"/>
-              <w:left w:type="dxa" w:w="140"/>
-              <w:bottom w:type="dxa" w:w="90"/>
-              <w:right w:type="dxa" w:w="140"/>
-            </w:tcMar>
-            <w:vAlign w:val="center"/>
-          </w:tcPr>
-          <w:p>
-            <w:pPr>
-              <w:spacing w:after="0" w:line="260"/>
-            </w:pPr>
-            <w:r>
-              <w:rPr>
-                <w:rFonts w:ascii="Calibri" w:cs="Calibri" w:eastAsia="Calibri" w:hAnsi="Calibri"/>
-                <w:color w:val="1F2A37"/>
-                <w:sz w:val="18"/>
-                <w:szCs w:val="18"/>
-              </w:rPr>
-              <w:t xml:space="preserve">Continuidade</w:t>
-            </w:r>
-          </w:p>
-        </w:tc>
-        <w:tc>
-          <w:tcPr>
-            <w:tcW w:type="dxa" w:w="1245"/>
-            <w:shd w:fill="FFFFFF" w:val="clear"/>
-            <w:tcMar>
-              <w:top w:type="dxa" w:w="90"/>
-              <w:left w:type="dxa" w:w="140"/>
-              <w:bottom w:type="dxa" w:w="90"/>
-              <w:right w:type="dxa" w:w="140"/>
-            </w:tcMar>
-            <w:vAlign w:val="center"/>
-          </w:tcPr>
-          <w:p>
-            <w:pPr>
-              <w:spacing w:after="0" w:line="260"/>
-            </w:pPr>
-            <w:r>
-              <w:rPr>
-                <w:rFonts w:ascii="Calibri" w:cs="Calibri" w:eastAsia="Calibri" w:hAnsi="Calibri"/>
-                <w:color w:val="1F2A37"/>
-                <w:sz w:val="18"/>
-                <w:szCs w:val="18"/>
-              </w:rPr>
-              <w:t xml:space="preserve">Denise</w:t>
-            </w:r>
-          </w:p>
-        </w:tc>
-        <w:tc>
-          <w:tcPr>
-            <w:tcW w:type="dxa" w:w="1101"/>
+            <w:tcW w:type="dxa" w:w="845"/>
+            <w:shd w:fill="FFFFFF" w:val="clear"/>
+            <w:tcMar>
+              <w:top w:type="dxa" w:w="90"/>
+              <w:left w:type="dxa" w:w="140"/>
+              <w:bottom w:type="dxa" w:w="90"/>
+              <w:right w:type="dxa" w:w="140"/>
+            </w:tcMar>
+            <w:vAlign w:val="center"/>
+          </w:tcPr>
+          <w:p>
+            <w:pPr>
+              <w:spacing w:after="0" w:line="260"/>
+            </w:pPr>
+            <w:r>
+              <w:rPr>
+                <w:rFonts w:ascii="Calibri" w:cs="Calibri" w:eastAsia="Calibri" w:hAnsi="Calibri"/>
+                <w:color w:val="1F2A37"/>
+                <w:sz w:val="18"/>
+                <w:szCs w:val="18"/>
+              </w:rPr>
+              <w:t xml:space="preserve">14</w:t>
+            </w:r>
+          </w:p>
+        </w:tc>
+        <w:tc>
+          <w:tcPr>
+            <w:tcW w:type="dxa" w:w="6694"/>
+            <w:shd w:fill="FFFFFF" w:val="clear"/>
+            <w:tcMar>
+              <w:top w:type="dxa" w:w="90"/>
+              <w:left w:type="dxa" w:w="140"/>
+              <w:bottom w:type="dxa" w:w="90"/>
+              <w:right w:type="dxa" w:w="140"/>
+            </w:tcMar>
+            <w:vAlign w:val="center"/>
+          </w:tcPr>
+          <w:p>
+            <w:pPr>
+              <w:spacing w:after="0" w:line="260"/>
+            </w:pPr>
+            <w:r>
+              <w:rPr>
+                <w:rFonts w:ascii="Calibri" w:cs="Calibri" w:eastAsia="Calibri" w:hAnsi="Calibri"/>
+                <w:color w:val="1F2A37"/>
+                <w:sz w:val="18"/>
+                <w:szCs w:val="18"/>
+              </w:rPr>
+              <w:t xml:space="preserve">Entregáveis mensais</w:t>
+            </w:r>
+          </w:p>
+        </w:tc>
+        <w:tc>
+          <w:tcPr>
+            <w:tcW w:type="dxa" w:w="959"/>
+            <w:shd w:fill="FFFFFF" w:val="clear"/>
+            <w:tcMar>
+              <w:top w:type="dxa" w:w="90"/>
+              <w:left w:type="dxa" w:w="140"/>
+              <w:bottom w:type="dxa" w:w="90"/>
+              <w:right w:type="dxa" w:w="140"/>
+            </w:tcMar>
+            <w:vAlign w:val="center"/>
+          </w:tcPr>
+          <w:p>
+            <w:pPr>
+              <w:spacing w:after="0" w:line="260"/>
+            </w:pPr>
+            <w:r>
+              <w:rPr>
+                <w:rFonts w:ascii="Calibri" w:cs="Calibri" w:eastAsia="Calibri" w:hAnsi="Calibri"/>
+                <w:color w:val="1F2A37"/>
+                <w:sz w:val="18"/>
+                <w:szCs w:val="18"/>
+              </w:rPr>
+              <w:t xml:space="preserve">Caio</w:t>
+            </w:r>
+          </w:p>
+        </w:tc>
+        <w:tc>
+          <w:tcPr>
+            <w:tcW w:type="dxa" w:w="852"/>
             <w:shd w:fill="FFFFFF" w:val="clear"/>
             <w:tcMar>
               <w:top w:type="dxa" w:w="90"/>
@@ -2501,61 +2501,61 @@
         </w:trPr>
         <w:tc>
           <w:tcPr>
-            <w:tcW w:type="dxa" w:w="864"/>
-            <w:shd w:fill="F5F5F5" w:val="clear"/>
-            <w:tcMar>
-              <w:top w:type="dxa" w:w="90"/>
-              <w:left w:type="dxa" w:w="140"/>
-              <w:bottom w:type="dxa" w:w="90"/>
-              <w:right w:type="dxa" w:w="140"/>
-            </w:tcMar>
-            <w:vAlign w:val="center"/>
-          </w:tcPr>
-          <w:p>
-            <w:pPr>
-              <w:spacing w:after="0" w:line="260"/>
-            </w:pPr>
-            <w:r>
-              <w:rPr>
-                <w:rFonts w:ascii="Calibri" w:cs="Calibri" w:eastAsia="Calibri" w:hAnsi="Calibri"/>
-                <w:color w:val="1F2A37"/>
-                <w:sz w:val="18"/>
-                <w:szCs w:val="18"/>
-              </w:rPr>
-              <w:t xml:space="preserve">16–18</w:t>
-            </w:r>
-          </w:p>
-        </w:tc>
-        <w:tc>
-          <w:tcPr>
-            <w:tcW w:type="dxa" w:w="6140"/>
-            <w:shd w:fill="F5F5F5" w:val="clear"/>
-            <w:tcMar>
-              <w:top w:type="dxa" w:w="90"/>
-              <w:left w:type="dxa" w:w="140"/>
-              <w:bottom w:type="dxa" w:w="90"/>
-              <w:right w:type="dxa" w:w="140"/>
-            </w:tcMar>
-            <w:vAlign w:val="center"/>
-          </w:tcPr>
-          <w:p>
-            <w:pPr>
-              <w:spacing w:after="0" w:line="260"/>
-            </w:pPr>
-            <w:r>
-              <w:rPr>
-                <w:rFonts w:ascii="Calibri" w:cs="Calibri" w:eastAsia="Calibri" w:hAnsi="Calibri"/>
-                <w:color w:val="1F2A37"/>
-                <w:sz w:val="18"/>
-                <w:szCs w:val="18"/>
-              </w:rPr>
-              <w:t xml:space="preserve">Como a DF controla: Boletim, rotinas automáticas e relatórios técnicos</w:t>
-            </w:r>
-          </w:p>
-        </w:tc>
-        <w:tc>
-          <w:tcPr>
-            <w:tcW w:type="dxa" w:w="1245"/>
+            <w:tcW w:type="dxa" w:w="845"/>
+            <w:shd w:fill="F5F5F5" w:val="clear"/>
+            <w:tcMar>
+              <w:top w:type="dxa" w:w="90"/>
+              <w:left w:type="dxa" w:w="140"/>
+              <w:bottom w:type="dxa" w:w="90"/>
+              <w:right w:type="dxa" w:w="140"/>
+            </w:tcMar>
+            <w:vAlign w:val="center"/>
+          </w:tcPr>
+          <w:p>
+            <w:pPr>
+              <w:spacing w:after="0" w:line="260"/>
+            </w:pPr>
+            <w:r>
+              <w:rPr>
+                <w:rFonts w:ascii="Calibri" w:cs="Calibri" w:eastAsia="Calibri" w:hAnsi="Calibri"/>
+                <w:color w:val="1F2A37"/>
+                <w:sz w:val="18"/>
+                <w:szCs w:val="18"/>
+              </w:rPr>
+              <w:t xml:space="preserve">15–17</w:t>
+            </w:r>
+          </w:p>
+        </w:tc>
+        <w:tc>
+          <w:tcPr>
+            <w:tcW w:type="dxa" w:w="6694"/>
+            <w:shd w:fill="F5F5F5" w:val="clear"/>
+            <w:tcMar>
+              <w:top w:type="dxa" w:w="90"/>
+              <w:left w:type="dxa" w:w="140"/>
+              <w:bottom w:type="dxa" w:w="90"/>
+              <w:right w:type="dxa" w:w="140"/>
+            </w:tcMar>
+            <w:vAlign w:val="center"/>
+          </w:tcPr>
+          <w:p>
+            <w:pPr>
+              <w:spacing w:after="0" w:line="260"/>
+            </w:pPr>
+            <w:r>
+              <w:rPr>
+                <w:rFonts w:ascii="Calibri" w:cs="Calibri" w:eastAsia="Calibri" w:hAnsi="Calibri"/>
+                <w:color w:val="1F2A37"/>
+                <w:sz w:val="18"/>
+                <w:szCs w:val="18"/>
+              </w:rPr>
+              <w:t xml:space="preserve">Boletim Diário, rotinas automáticas e relatórios técnicos</w:t>
+            </w:r>
+          </w:p>
+        </w:tc>
+        <w:tc>
+          <w:tcPr>
+            <w:tcW w:type="dxa" w:w="959"/>
             <w:shd w:fill="F5F5F5" w:val="clear"/>
             <w:tcMar>
               <w:top w:type="dxa" w:w="90"/>
@@ -2582,7 +2582,7 @@
         </w:tc>
         <w:tc>
           <w:tcPr>
-            <w:tcW w:type="dxa" w:w="1101"/>
+            <w:tcW w:type="dxa" w:w="852"/>
             <w:shd w:fill="F5F5F5" w:val="clear"/>
             <w:tcMar>
               <w:top w:type="dxa" w:w="90"/>
@@ -2614,88 +2614,88 @@
         </w:trPr>
         <w:tc>
           <w:tcPr>
-            <w:tcW w:type="dxa" w:w="864"/>
-            <w:shd w:fill="FFFFFF" w:val="clear"/>
-            <w:tcMar>
-              <w:top w:type="dxa" w:w="90"/>
-              <w:left w:type="dxa" w:w="140"/>
-              <w:bottom w:type="dxa" w:w="90"/>
-              <w:right w:type="dxa" w:w="140"/>
-            </w:tcMar>
-            <w:vAlign w:val="center"/>
-          </w:tcPr>
-          <w:p>
-            <w:pPr>
-              <w:spacing w:after="0" w:line="260"/>
-            </w:pPr>
-            <w:r>
-              <w:rPr>
-                <w:rFonts w:ascii="Calibri" w:cs="Calibri" w:eastAsia="Calibri" w:hAnsi="Calibri"/>
-                <w:color w:val="1F2A37"/>
-                <w:sz w:val="18"/>
-                <w:szCs w:val="18"/>
-              </w:rPr>
-              <w:t xml:space="preserve">19</w:t>
-            </w:r>
-          </w:p>
-        </w:tc>
-        <w:tc>
-          <w:tcPr>
-            <w:tcW w:type="dxa" w:w="6140"/>
-            <w:shd w:fill="FFFFFF" w:val="clear"/>
-            <w:tcMar>
-              <w:top w:type="dxa" w:w="90"/>
-              <w:left w:type="dxa" w:w="140"/>
-              <w:bottom w:type="dxa" w:w="90"/>
-              <w:right w:type="dxa" w:w="140"/>
-            </w:tcMar>
-            <w:vAlign w:val="center"/>
-          </w:tcPr>
-          <w:p>
-            <w:pPr>
-              <w:spacing w:after="0" w:line="260"/>
-            </w:pPr>
-            <w:r>
-              <w:rPr>
-                <w:rFonts w:ascii="Calibri" w:cs="Calibri" w:eastAsia="Calibri" w:hAnsi="Calibri"/>
-                <w:color w:val="1F2A37"/>
-                <w:sz w:val="18"/>
-                <w:szCs w:val="18"/>
-              </w:rPr>
-              <w:t xml:space="preserve">Escopo</w:t>
-            </w:r>
-          </w:p>
-        </w:tc>
-        <w:tc>
-          <w:tcPr>
-            <w:tcW w:type="dxa" w:w="1245"/>
-            <w:shd w:fill="FFFFFF" w:val="clear"/>
-            <w:tcMar>
-              <w:top w:type="dxa" w:w="90"/>
-              <w:left w:type="dxa" w:w="140"/>
-              <w:bottom w:type="dxa" w:w="90"/>
-              <w:right w:type="dxa" w:w="140"/>
-            </w:tcMar>
-            <w:vAlign w:val="center"/>
-          </w:tcPr>
-          <w:p>
-            <w:pPr>
-              <w:spacing w:after="0" w:line="260"/>
-            </w:pPr>
-            <w:r>
-              <w:rPr>
-                <w:rFonts w:ascii="Calibri" w:cs="Calibri" w:eastAsia="Calibri" w:hAnsi="Calibri"/>
-                <w:color w:val="1F2A37"/>
-                <w:sz w:val="18"/>
-                <w:szCs w:val="18"/>
-              </w:rPr>
-              <w:t xml:space="preserve">Denise</w:t>
-            </w:r>
-          </w:p>
-        </w:tc>
-        <w:tc>
-          <w:tcPr>
-            <w:tcW w:type="dxa" w:w="1101"/>
+            <w:tcW w:type="dxa" w:w="845"/>
+            <w:shd w:fill="FFFFFF" w:val="clear"/>
+            <w:tcMar>
+              <w:top w:type="dxa" w:w="90"/>
+              <w:left w:type="dxa" w:w="140"/>
+              <w:bottom w:type="dxa" w:w="90"/>
+              <w:right w:type="dxa" w:w="140"/>
+            </w:tcMar>
+            <w:vAlign w:val="center"/>
+          </w:tcPr>
+          <w:p>
+            <w:pPr>
+              <w:spacing w:after="0" w:line="260"/>
+            </w:pPr>
+            <w:r>
+              <w:rPr>
+                <w:rFonts w:ascii="Calibri" w:cs="Calibri" w:eastAsia="Calibri" w:hAnsi="Calibri"/>
+                <w:color w:val="1F2A37"/>
+                <w:sz w:val="18"/>
+                <w:szCs w:val="18"/>
+              </w:rPr>
+              <w:t xml:space="preserve">18</w:t>
+            </w:r>
+          </w:p>
+        </w:tc>
+        <w:tc>
+          <w:tcPr>
+            <w:tcW w:type="dxa" w:w="6694"/>
+            <w:shd w:fill="FFFFFF" w:val="clear"/>
+            <w:tcMar>
+              <w:top w:type="dxa" w:w="90"/>
+              <w:left w:type="dxa" w:w="140"/>
+              <w:bottom w:type="dxa" w:w="90"/>
+              <w:right w:type="dxa" w:w="140"/>
+            </w:tcMar>
+            <w:vAlign w:val="center"/>
+          </w:tcPr>
+          <w:p>
+            <w:pPr>
+              <w:spacing w:after="0" w:line="260"/>
+            </w:pPr>
+            <w:r>
+              <w:rPr>
+                <w:rFonts w:ascii="Calibri" w:cs="Calibri" w:eastAsia="Calibri" w:hAnsi="Calibri"/>
+                <w:color w:val="1F2A37"/>
+                <w:sz w:val="18"/>
+                <w:szCs w:val="18"/>
+              </w:rPr>
+              <w:t xml:space="preserve">Mobilização em 90 dias</w:t>
+            </w:r>
+          </w:p>
+        </w:tc>
+        <w:tc>
+          <w:tcPr>
+            <w:tcW w:type="dxa" w:w="959"/>
+            <w:shd w:fill="FFFFFF" w:val="clear"/>
+            <w:tcMar>
+              <w:top w:type="dxa" w:w="90"/>
+              <w:left w:type="dxa" w:w="140"/>
+              <w:bottom w:type="dxa" w:w="90"/>
+              <w:right w:type="dxa" w:w="140"/>
+            </w:tcMar>
+            <w:vAlign w:val="center"/>
+          </w:tcPr>
+          <w:p>
+            <w:pPr>
+              <w:spacing w:after="0" w:line="260"/>
+            </w:pPr>
+            <w:r>
+              <w:rPr>
+                <w:rFonts w:ascii="Calibri" w:cs="Calibri" w:eastAsia="Calibri" w:hAnsi="Calibri"/>
+                <w:color w:val="1F2A37"/>
+                <w:sz w:val="18"/>
+                <w:szCs w:val="18"/>
+              </w:rPr>
+              <w:t xml:space="preserve">Caio</w:t>
+            </w:r>
+          </w:p>
+        </w:tc>
+        <w:tc>
+          <w:tcPr>
+            <w:tcW w:type="dxa" w:w="852"/>
             <w:shd w:fill="FFFFFF" w:val="clear"/>
             <w:tcMar>
               <w:top w:type="dxa" w:w="90"/>
@@ -2727,61 +2727,61 @@
         </w:trPr>
         <w:tc>
           <w:tcPr>
-            <w:tcW w:type="dxa" w:w="864"/>
-            <w:shd w:fill="F5F5F5" w:val="clear"/>
-            <w:tcMar>
-              <w:top w:type="dxa" w:w="90"/>
-              <w:left w:type="dxa" w:w="140"/>
-              <w:bottom w:type="dxa" w:w="90"/>
-              <w:right w:type="dxa" w:w="140"/>
-            </w:tcMar>
-            <w:vAlign w:val="center"/>
-          </w:tcPr>
-          <w:p>
-            <w:pPr>
-              <w:spacing w:after="0" w:line="260"/>
-            </w:pPr>
-            <w:r>
-              <w:rPr>
-                <w:rFonts w:ascii="Calibri" w:cs="Calibri" w:eastAsia="Calibri" w:hAnsi="Calibri"/>
-                <w:color w:val="1F2A37"/>
-                <w:sz w:val="18"/>
-                <w:szCs w:val="18"/>
-              </w:rPr>
-              <w:t xml:space="preserve">20</w:t>
-            </w:r>
-          </w:p>
-        </w:tc>
-        <w:tc>
-          <w:tcPr>
-            <w:tcW w:type="dxa" w:w="6140"/>
-            <w:shd w:fill="F5F5F5" w:val="clear"/>
-            <w:tcMar>
-              <w:top w:type="dxa" w:w="90"/>
-              <w:left w:type="dxa" w:w="140"/>
-              <w:bottom w:type="dxa" w:w="90"/>
-              <w:right w:type="dxa" w:w="140"/>
-            </w:tcMar>
-            <w:vAlign w:val="center"/>
-          </w:tcPr>
-          <w:p>
-            <w:pPr>
-              <w:spacing w:after="0" w:line="260"/>
-            </w:pPr>
-            <w:r>
-              <w:rPr>
-                <w:rFonts w:ascii="Calibri" w:cs="Calibri" w:eastAsia="Calibri" w:hAnsi="Calibri"/>
-                <w:color w:val="1F2A37"/>
-                <w:sz w:val="18"/>
-                <w:szCs w:val="18"/>
-              </w:rPr>
-              <w:t xml:space="preserve">Por que um subsíndico independente (comparativo de modelos)</w:t>
-            </w:r>
-          </w:p>
-        </w:tc>
-        <w:tc>
-          <w:tcPr>
-            <w:tcW w:type="dxa" w:w="1245"/>
+            <w:tcW w:type="dxa" w:w="845"/>
+            <w:shd w:fill="F5F5F5" w:val="clear"/>
+            <w:tcMar>
+              <w:top w:type="dxa" w:w="90"/>
+              <w:left w:type="dxa" w:w="140"/>
+              <w:bottom w:type="dxa" w:w="90"/>
+              <w:right w:type="dxa" w:w="140"/>
+            </w:tcMar>
+            <w:vAlign w:val="center"/>
+          </w:tcPr>
+          <w:p>
+            <w:pPr>
+              <w:spacing w:after="0" w:line="260"/>
+            </w:pPr>
+            <w:r>
+              <w:rPr>
+                <w:rFonts w:ascii="Calibri" w:cs="Calibri" w:eastAsia="Calibri" w:hAnsi="Calibri"/>
+                <w:color w:val="1F2A37"/>
+                <w:sz w:val="18"/>
+                <w:szCs w:val="18"/>
+              </w:rPr>
+              <w:t xml:space="preserve">19</w:t>
+            </w:r>
+          </w:p>
+        </w:tc>
+        <w:tc>
+          <w:tcPr>
+            <w:tcW w:type="dxa" w:w="6694"/>
+            <w:shd w:fill="F5F5F5" w:val="clear"/>
+            <w:tcMar>
+              <w:top w:type="dxa" w:w="90"/>
+              <w:left w:type="dxa" w:w="140"/>
+              <w:bottom w:type="dxa" w:w="90"/>
+              <w:right w:type="dxa" w:w="140"/>
+            </w:tcMar>
+            <w:vAlign w:val="center"/>
+          </w:tcPr>
+          <w:p>
+            <w:pPr>
+              <w:spacing w:after="0" w:line="260"/>
+            </w:pPr>
+            <w:r>
+              <w:rPr>
+                <w:rFonts w:ascii="Calibri" w:cs="Calibri" w:eastAsia="Calibri" w:hAnsi="Calibri"/>
+                <w:color w:val="1F2A37"/>
+                <w:sz w:val="18"/>
+                <w:szCs w:val="18"/>
+              </w:rPr>
+              <w:t xml:space="preserve">Continuidade, sigilo e independência</w:t>
+            </w:r>
+          </w:p>
+        </w:tc>
+        <w:tc>
+          <w:tcPr>
+            <w:tcW w:type="dxa" w:w="959"/>
             <w:shd w:fill="F5F5F5" w:val="clear"/>
             <w:tcMar>
               <w:top w:type="dxa" w:w="90"/>
@@ -2808,7 +2808,7 @@
         </w:tc>
         <w:tc>
           <w:tcPr>
-            <w:tcW w:type="dxa" w:w="1101"/>
+            <w:tcW w:type="dxa" w:w="852"/>
             <w:shd w:fill="F5F5F5" w:val="clear"/>
             <w:tcMar>
               <w:top w:type="dxa" w:w="90"/>
@@ -2840,88 +2840,88 @@
         </w:trPr>
         <w:tc>
           <w:tcPr>
-            <w:tcW w:type="dxa" w:w="864"/>
-            <w:shd w:fill="FFFFFF" w:val="clear"/>
-            <w:tcMar>
-              <w:top w:type="dxa" w:w="90"/>
-              <w:left w:type="dxa" w:w="140"/>
-              <w:bottom w:type="dxa" w:w="90"/>
-              <w:right w:type="dxa" w:w="140"/>
-            </w:tcMar>
-            <w:vAlign w:val="center"/>
-          </w:tcPr>
-          <w:p>
-            <w:pPr>
-              <w:spacing w:after="0" w:line="260"/>
-            </w:pPr>
-            <w:r>
-              <w:rPr>
-                <w:rFonts w:ascii="Calibri" w:cs="Calibri" w:eastAsia="Calibri" w:hAnsi="Calibri"/>
-                <w:color w:val="1F2A37"/>
-                <w:sz w:val="18"/>
-                <w:szCs w:val="18"/>
-              </w:rPr>
-              <w:t xml:space="preserve">21</w:t>
-            </w:r>
-          </w:p>
-        </w:tc>
-        <w:tc>
-          <w:tcPr>
-            <w:tcW w:type="dxa" w:w="6140"/>
-            <w:shd w:fill="FFFFFF" w:val="clear"/>
-            <w:tcMar>
-              <w:top w:type="dxa" w:w="90"/>
-              <w:left w:type="dxa" w:w="140"/>
-              <w:bottom w:type="dxa" w:w="90"/>
-              <w:right w:type="dxa" w:w="140"/>
-            </w:tcMar>
-            <w:vAlign w:val="center"/>
-          </w:tcPr>
-          <w:p>
-            <w:pPr>
-              <w:spacing w:after="0" w:line="260"/>
-            </w:pPr>
-            <w:r>
-              <w:rPr>
-                <w:rFonts w:ascii="Calibri" w:cs="Calibri" w:eastAsia="Calibri" w:hAnsi="Calibri"/>
-                <w:color w:val="1F2A37"/>
-                <w:sz w:val="18"/>
-                <w:szCs w:val="18"/>
-              </w:rPr>
-              <w:t xml:space="preserve">Três unidades, três respostas — com prova</w:t>
-            </w:r>
-          </w:p>
-        </w:tc>
-        <w:tc>
-          <w:tcPr>
-            <w:tcW w:type="dxa" w:w="1245"/>
-            <w:shd w:fill="FFFFFF" w:val="clear"/>
-            <w:tcMar>
-              <w:top w:type="dxa" w:w="90"/>
-              <w:left w:type="dxa" w:w="140"/>
-              <w:bottom w:type="dxa" w:w="90"/>
-              <w:right w:type="dxa" w:w="140"/>
-            </w:tcMar>
-            <w:vAlign w:val="center"/>
-          </w:tcPr>
-          <w:p>
-            <w:pPr>
-              <w:spacing w:after="0" w:line="260"/>
-            </w:pPr>
-            <w:r>
-              <w:rPr>
-                <w:rFonts w:ascii="Calibri" w:cs="Calibri" w:eastAsia="Calibri" w:hAnsi="Calibri"/>
-                <w:color w:val="1F2A37"/>
-                <w:sz w:val="18"/>
-                <w:szCs w:val="18"/>
-              </w:rPr>
-              <w:t xml:space="preserve">Caio</w:t>
-            </w:r>
-          </w:p>
-        </w:tc>
-        <w:tc>
-          <w:tcPr>
-            <w:tcW w:type="dxa" w:w="1101"/>
+            <w:tcW w:type="dxa" w:w="845"/>
+            <w:shd w:fill="FFFFFF" w:val="clear"/>
+            <w:tcMar>
+              <w:top w:type="dxa" w:w="90"/>
+              <w:left w:type="dxa" w:w="140"/>
+              <w:bottom w:type="dxa" w:w="90"/>
+              <w:right w:type="dxa" w:w="140"/>
+            </w:tcMar>
+            <w:vAlign w:val="center"/>
+          </w:tcPr>
+          <w:p>
+            <w:pPr>
+              <w:spacing w:after="0" w:line="260"/>
+            </w:pPr>
+            <w:r>
+              <w:rPr>
+                <w:rFonts w:ascii="Calibri" w:cs="Calibri" w:eastAsia="Calibri" w:hAnsi="Calibri"/>
+                <w:color w:val="1F2A37"/>
+                <w:sz w:val="18"/>
+                <w:szCs w:val="18"/>
+              </w:rPr>
+              <w:t xml:space="preserve">20</w:t>
+            </w:r>
+          </w:p>
+        </w:tc>
+        <w:tc>
+          <w:tcPr>
+            <w:tcW w:type="dxa" w:w="6694"/>
+            <w:shd w:fill="FFFFFF" w:val="clear"/>
+            <w:tcMar>
+              <w:top w:type="dxa" w:w="90"/>
+              <w:left w:type="dxa" w:w="140"/>
+              <w:bottom w:type="dxa" w:w="90"/>
+              <w:right w:type="dxa" w:w="140"/>
+            </w:tcMar>
+            <w:vAlign w:val="center"/>
+          </w:tcPr>
+          <w:p>
+            <w:pPr>
+              <w:spacing w:after="0" w:line="260"/>
+            </w:pPr>
+            <w:r>
+              <w:rPr>
+                <w:rFonts w:ascii="Calibri" w:cs="Calibri" w:eastAsia="Calibri" w:hAnsi="Calibri"/>
+                <w:color w:val="1F2A37"/>
+                <w:sz w:val="18"/>
+                <w:szCs w:val="18"/>
+              </w:rPr>
+              <w:t xml:space="preserve">Escopo</w:t>
+            </w:r>
+          </w:p>
+        </w:tc>
+        <w:tc>
+          <w:tcPr>
+            <w:tcW w:type="dxa" w:w="959"/>
+            <w:shd w:fill="FFFFFF" w:val="clear"/>
+            <w:tcMar>
+              <w:top w:type="dxa" w:w="90"/>
+              <w:left w:type="dxa" w:w="140"/>
+              <w:bottom w:type="dxa" w:w="90"/>
+              <w:right w:type="dxa" w:w="140"/>
+            </w:tcMar>
+            <w:vAlign w:val="center"/>
+          </w:tcPr>
+          <w:p>
+            <w:pPr>
+              <w:spacing w:after="0" w:line="260"/>
+            </w:pPr>
+            <w:r>
+              <w:rPr>
+                <w:rFonts w:ascii="Calibri" w:cs="Calibri" w:eastAsia="Calibri" w:hAnsi="Calibri"/>
+                <w:color w:val="1F2A37"/>
+                <w:sz w:val="18"/>
+                <w:szCs w:val="18"/>
+              </w:rPr>
+              <w:t xml:space="preserve">Denise</w:t>
+            </w:r>
+          </w:p>
+        </w:tc>
+        <w:tc>
+          <w:tcPr>
+            <w:tcW w:type="dxa" w:w="852"/>
             <w:shd w:fill="FFFFFF" w:val="clear"/>
             <w:tcMar>
               <w:top w:type="dxa" w:w="90"/>
@@ -2953,88 +2953,88 @@
         </w:trPr>
         <w:tc>
           <w:tcPr>
-            <w:tcW w:type="dxa" w:w="864"/>
-            <w:shd w:fill="F5F5F5" w:val="clear"/>
-            <w:tcMar>
-              <w:top w:type="dxa" w:w="90"/>
-              <w:left w:type="dxa" w:w="140"/>
-              <w:bottom w:type="dxa" w:w="90"/>
-              <w:right w:type="dxa" w:w="140"/>
-            </w:tcMar>
-            <w:vAlign w:val="center"/>
-          </w:tcPr>
-          <w:p>
-            <w:pPr>
-              <w:spacing w:after="0" w:line="260"/>
-            </w:pPr>
-            <w:r>
-              <w:rPr>
-                <w:rFonts w:ascii="Calibri" w:cs="Calibri" w:eastAsia="Calibri" w:hAnsi="Calibri"/>
-                <w:color w:val="1F2A37"/>
-                <w:sz w:val="18"/>
-                <w:szCs w:val="18"/>
-              </w:rPr>
-              <w:t xml:space="preserve">22</w:t>
-            </w:r>
-          </w:p>
-        </w:tc>
-        <w:tc>
-          <w:tcPr>
-            <w:tcW w:type="dxa" w:w="6140"/>
-            <w:shd w:fill="F5F5F5" w:val="clear"/>
-            <w:tcMar>
-              <w:top w:type="dxa" w:w="90"/>
-              <w:left w:type="dxa" w:w="140"/>
-              <w:bottom w:type="dxa" w:w="90"/>
-              <w:right w:type="dxa" w:w="140"/>
-            </w:tcMar>
-            <w:vAlign w:val="center"/>
-          </w:tcPr>
-          <w:p>
-            <w:pPr>
-              <w:spacing w:after="0" w:line="260"/>
-            </w:pPr>
-            <w:r>
-              <w:rPr>
-                <w:rFonts w:ascii="Calibri" w:cs="Calibri" w:eastAsia="Calibri" w:hAnsi="Calibri"/>
-                <w:color w:val="1F2A37"/>
-                <w:sz w:val="18"/>
-                <w:szCs w:val="18"/>
-              </w:rPr>
-              <w:t xml:space="preserve">O que o Einstein ganha nos primeiros 90 dias</w:t>
-            </w:r>
-          </w:p>
-        </w:tc>
-        <w:tc>
-          <w:tcPr>
-            <w:tcW w:type="dxa" w:w="1245"/>
-            <w:shd w:fill="F5F5F5" w:val="clear"/>
-            <w:tcMar>
-              <w:top w:type="dxa" w:w="90"/>
-              <w:left w:type="dxa" w:w="140"/>
-              <w:bottom w:type="dxa" w:w="90"/>
-              <w:right w:type="dxa" w:w="140"/>
-            </w:tcMar>
-            <w:vAlign w:val="center"/>
-          </w:tcPr>
-          <w:p>
-            <w:pPr>
-              <w:spacing w:after="0" w:line="260"/>
-            </w:pPr>
-            <w:r>
-              <w:rPr>
-                <w:rFonts w:ascii="Calibri" w:cs="Calibri" w:eastAsia="Calibri" w:hAnsi="Calibri"/>
-                <w:color w:val="1F2A37"/>
-                <w:sz w:val="18"/>
-                <w:szCs w:val="18"/>
-              </w:rPr>
-              <w:t xml:space="preserve">Denise</w:t>
-            </w:r>
-          </w:p>
-        </w:tc>
-        <w:tc>
-          <w:tcPr>
-            <w:tcW w:type="dxa" w:w="1101"/>
+            <w:tcW w:type="dxa" w:w="845"/>
+            <w:shd w:fill="F5F5F5" w:val="clear"/>
+            <w:tcMar>
+              <w:top w:type="dxa" w:w="90"/>
+              <w:left w:type="dxa" w:w="140"/>
+              <w:bottom w:type="dxa" w:w="90"/>
+              <w:right w:type="dxa" w:w="140"/>
+            </w:tcMar>
+            <w:vAlign w:val="center"/>
+          </w:tcPr>
+          <w:p>
+            <w:pPr>
+              <w:spacing w:after="0" w:line="260"/>
+            </w:pPr>
+            <w:r>
+              <w:rPr>
+                <w:rFonts w:ascii="Calibri" w:cs="Calibri" w:eastAsia="Calibri" w:hAnsi="Calibri"/>
+                <w:color w:val="1F2A37"/>
+                <w:sz w:val="18"/>
+                <w:szCs w:val="18"/>
+              </w:rPr>
+              <w:t xml:space="preserve">21</w:t>
+            </w:r>
+          </w:p>
+        </w:tc>
+        <w:tc>
+          <w:tcPr>
+            <w:tcW w:type="dxa" w:w="6694"/>
+            <w:shd w:fill="F5F5F5" w:val="clear"/>
+            <w:tcMar>
+              <w:top w:type="dxa" w:w="90"/>
+              <w:left w:type="dxa" w:w="140"/>
+              <w:bottom w:type="dxa" w:w="90"/>
+              <w:right w:type="dxa" w:w="140"/>
+            </w:tcMar>
+            <w:vAlign w:val="center"/>
+          </w:tcPr>
+          <w:p>
+            <w:pPr>
+              <w:spacing w:after="0" w:line="260"/>
+            </w:pPr>
+            <w:r>
+              <w:rPr>
+                <w:rFonts w:ascii="Calibri" w:cs="Calibri" w:eastAsia="Calibri" w:hAnsi="Calibri"/>
+                <w:color w:val="1F2A37"/>
+                <w:sz w:val="18"/>
+                <w:szCs w:val="18"/>
+              </w:rPr>
+              <w:t xml:space="preserve">Três unidades, três respostas, cada uma com prova</w:t>
+            </w:r>
+          </w:p>
+        </w:tc>
+        <w:tc>
+          <w:tcPr>
+            <w:tcW w:type="dxa" w:w="959"/>
+            <w:shd w:fill="F5F5F5" w:val="clear"/>
+            <w:tcMar>
+              <w:top w:type="dxa" w:w="90"/>
+              <w:left w:type="dxa" w:w="140"/>
+              <w:bottom w:type="dxa" w:w="90"/>
+              <w:right w:type="dxa" w:w="140"/>
+            </w:tcMar>
+            <w:vAlign w:val="center"/>
+          </w:tcPr>
+          <w:p>
+            <w:pPr>
+              <w:spacing w:after="0" w:line="260"/>
+            </w:pPr>
+            <w:r>
+              <w:rPr>
+                <w:rFonts w:ascii="Calibri" w:cs="Calibri" w:eastAsia="Calibri" w:hAnsi="Calibri"/>
+                <w:color w:val="1F2A37"/>
+                <w:sz w:val="18"/>
+                <w:szCs w:val="18"/>
+              </w:rPr>
+              <w:t xml:space="preserve">Caio</w:t>
+            </w:r>
+          </w:p>
+        </w:tc>
+        <w:tc>
+          <w:tcPr>
+            <w:tcW w:type="dxa" w:w="852"/>
             <w:shd w:fill="F5F5F5" w:val="clear"/>
             <w:tcMar>
               <w:top w:type="dxa" w:w="90"/>
@@ -3066,61 +3066,61 @@
         </w:trPr>
         <w:tc>
           <w:tcPr>
-            <w:tcW w:type="dxa" w:w="864"/>
-            <w:shd w:fill="FFFFFF" w:val="clear"/>
-            <w:tcMar>
-              <w:top w:type="dxa" w:w="90"/>
-              <w:left w:type="dxa" w:w="140"/>
-              <w:bottom w:type="dxa" w:w="90"/>
-              <w:right w:type="dxa" w:w="140"/>
-            </w:tcMar>
-            <w:vAlign w:val="center"/>
-          </w:tcPr>
-          <w:p>
-            <w:pPr>
-              <w:spacing w:after="0" w:line="260"/>
-            </w:pPr>
-            <w:r>
-              <w:rPr>
-                <w:rFonts w:ascii="Calibri" w:cs="Calibri" w:eastAsia="Calibri" w:hAnsi="Calibri"/>
-                <w:color w:val="1F2A37"/>
-                <w:sz w:val="18"/>
-                <w:szCs w:val="18"/>
-              </w:rPr>
-              <w:t xml:space="preserve">23</w:t>
-            </w:r>
-          </w:p>
-        </w:tc>
-        <w:tc>
-          <w:tcPr>
-            <w:tcW w:type="dxa" w:w="6140"/>
-            <w:shd w:fill="FFFFFF" w:val="clear"/>
-            <w:tcMar>
-              <w:top w:type="dxa" w:w="90"/>
-              <w:left w:type="dxa" w:w="140"/>
-              <w:bottom w:type="dxa" w:w="90"/>
-              <w:right w:type="dxa" w:w="140"/>
-            </w:tcMar>
-            <w:vAlign w:val="center"/>
-          </w:tcPr>
-          <w:p>
-            <w:pPr>
-              <w:spacing w:after="0" w:line="260"/>
-            </w:pPr>
-            <w:r>
-              <w:rPr>
-                <w:rFonts w:ascii="Calibri" w:cs="Calibri" w:eastAsia="Calibri" w:hAnsi="Calibri"/>
-                <w:color w:val="1F2A37"/>
-                <w:sz w:val="18"/>
-                <w:szCs w:val="18"/>
-              </w:rPr>
-              <w:t xml:space="preserve">Encerramento</w:t>
-            </w:r>
-          </w:p>
-        </w:tc>
-        <w:tc>
-          <w:tcPr>
-            <w:tcW w:type="dxa" w:w="1245"/>
+            <w:tcW w:type="dxa" w:w="845"/>
+            <w:shd w:fill="FFFFFF" w:val="clear"/>
+            <w:tcMar>
+              <w:top w:type="dxa" w:w="90"/>
+              <w:left w:type="dxa" w:w="140"/>
+              <w:bottom w:type="dxa" w:w="90"/>
+              <w:right w:type="dxa" w:w="140"/>
+            </w:tcMar>
+            <w:vAlign w:val="center"/>
+          </w:tcPr>
+          <w:p>
+            <w:pPr>
+              <w:spacing w:after="0" w:line="260"/>
+            </w:pPr>
+            <w:r>
+              <w:rPr>
+                <w:rFonts w:ascii="Calibri" w:cs="Calibri" w:eastAsia="Calibri" w:hAnsi="Calibri"/>
+                <w:color w:val="1F2A37"/>
+                <w:sz w:val="18"/>
+                <w:szCs w:val="18"/>
+              </w:rPr>
+              <w:t xml:space="preserve">22</w:t>
+            </w:r>
+          </w:p>
+        </w:tc>
+        <w:tc>
+          <w:tcPr>
+            <w:tcW w:type="dxa" w:w="6694"/>
+            <w:shd w:fill="FFFFFF" w:val="clear"/>
+            <w:tcMar>
+              <w:top w:type="dxa" w:w="90"/>
+              <w:left w:type="dxa" w:w="140"/>
+              <w:bottom w:type="dxa" w:w="90"/>
+              <w:right w:type="dxa" w:w="140"/>
+            </w:tcMar>
+            <w:vAlign w:val="center"/>
+          </w:tcPr>
+          <w:p>
+            <w:pPr>
+              <w:spacing w:after="0" w:line="260"/>
+            </w:pPr>
+            <w:r>
+              <w:rPr>
+                <w:rFonts w:ascii="Calibri" w:cs="Calibri" w:eastAsia="Calibri" w:hAnsi="Calibri"/>
+                <w:color w:val="1F2A37"/>
+                <w:sz w:val="18"/>
+                <w:szCs w:val="18"/>
+              </w:rPr>
+              <w:t xml:space="preserve">O que o Einstein ganha nos primeiros 90 dias</w:t>
+            </w:r>
+          </w:p>
+        </w:tc>
+        <w:tc>
+          <w:tcPr>
+            <w:tcW w:type="dxa" w:w="959"/>
             <w:shd w:fill="FFFFFF" w:val="clear"/>
             <w:tcMar>
               <w:top w:type="dxa" w:w="90"/>
@@ -3147,28 +3147,28 @@
         </w:tc>
         <w:tc>
           <w:tcPr>
-            <w:tcW w:type="dxa" w:w="1101"/>
-            <w:shd w:fill="FFFFFF" w:val="clear"/>
-            <w:tcMar>
-              <w:top w:type="dxa" w:w="90"/>
-              <w:left w:type="dxa" w:w="140"/>
-              <w:bottom w:type="dxa" w:w="90"/>
-              <w:right w:type="dxa" w:w="140"/>
-            </w:tcMar>
-            <w:vAlign w:val="center"/>
-          </w:tcPr>
-          <w:p>
-            <w:pPr>
-              <w:spacing w:after="0" w:line="260"/>
-            </w:pPr>
-            <w:r>
-              <w:rPr>
-                <w:rFonts w:ascii="Calibri" w:cs="Calibri" w:eastAsia="Calibri" w:hAnsi="Calibri"/>
-                <w:color w:val="1F2A37"/>
-                <w:sz w:val="18"/>
-                <w:szCs w:val="18"/>
-              </w:rPr>
-              <w:t xml:space="preserve">1 min</w:t>
+            <w:tcW w:type="dxa" w:w="852"/>
+            <w:shd w:fill="FFFFFF" w:val="clear"/>
+            <w:tcMar>
+              <w:top w:type="dxa" w:w="90"/>
+              <w:left w:type="dxa" w:w="140"/>
+              <w:bottom w:type="dxa" w:w="90"/>
+              <w:right w:type="dxa" w:w="140"/>
+            </w:tcMar>
+            <w:vAlign w:val="center"/>
+          </w:tcPr>
+          <w:p>
+            <w:pPr>
+              <w:spacing w:after="0" w:line="260"/>
+            </w:pPr>
+            <w:r>
+              <w:rPr>
+                <w:rFonts w:ascii="Calibri" w:cs="Calibri" w:eastAsia="Calibri" w:hAnsi="Calibri"/>
+                <w:color w:val="1F2A37"/>
+                <w:sz w:val="18"/>
+                <w:szCs w:val="18"/>
+              </w:rPr>
+              <w:t xml:space="preserve">2 min</w:t>
             </w:r>
           </w:p>
         </w:tc>
@@ -3179,104 +3179,109 @@
         </w:trPr>
         <w:tc>
           <w:tcPr>
-            <w:tcW w:type="dxa" w:w="864"/>
-            <w:shd w:fill="F5F5F5" w:val="clear"/>
-            <w:tcMar>
-              <w:top w:type="dxa" w:w="90"/>
-              <w:left w:type="dxa" w:w="140"/>
-              <w:bottom w:type="dxa" w:w="90"/>
-              <w:right w:type="dxa" w:w="140"/>
-            </w:tcMar>
-            <w:vAlign w:val="center"/>
-          </w:tcPr>
-          <w:p>
-            <w:pPr>
-              <w:spacing w:after="0" w:line="260"/>
-            </w:pPr>
-            <w:r>
-              <w:rPr>
-                <w:rFonts w:ascii="Calibri" w:cs="Calibri" w:eastAsia="Calibri" w:hAnsi="Calibri"/>
-                <w:color w:val="1F2A37"/>
-                <w:sz w:val="18"/>
-                <w:szCs w:val="18"/>
-              </w:rPr>
-              <w:t xml:space="preserve">—</w:t>
-            </w:r>
-          </w:p>
-        </w:tc>
-        <w:tc>
-          <w:tcPr>
-            <w:tcW w:type="dxa" w:w="6140"/>
-            <w:shd w:fill="F5F5F5" w:val="clear"/>
-            <w:tcMar>
-              <w:top w:type="dxa" w:w="90"/>
-              <w:left w:type="dxa" w:w="140"/>
-              <w:bottom w:type="dxa" w:w="90"/>
-              <w:right w:type="dxa" w:w="140"/>
-            </w:tcMar>
-            <w:vAlign w:val="center"/>
-          </w:tcPr>
-          <w:p>
-            <w:pPr>
-              <w:spacing w:after="0" w:line="260"/>
-            </w:pPr>
-            <w:r>
-              <w:rPr>
-                <w:rFonts w:ascii="Calibri" w:cs="Calibri" w:eastAsia="Calibri" w:hAnsi="Calibri"/>
-                <w:b/>
-                <w:bCs/>
-                <w:color w:val="1F2A37"/>
-                <w:sz w:val="18"/>
-                <w:szCs w:val="18"/>
-              </w:rPr>
-              <w:t xml:space="preserve">Total da exposição</w:t>
-            </w:r>
-          </w:p>
-        </w:tc>
-        <w:tc>
-          <w:tcPr>
-            <w:tcW w:type="dxa" w:w="1245"/>
-            <w:shd w:fill="F5F5F5" w:val="clear"/>
-            <w:tcMar>
-              <w:top w:type="dxa" w:w="90"/>
-              <w:left w:type="dxa" w:w="140"/>
-              <w:bottom w:type="dxa" w:w="90"/>
-              <w:right w:type="dxa" w:w="140"/>
-            </w:tcMar>
-            <w:vAlign w:val="center"/>
-          </w:tcPr>
-          <w:p>
-            <w:pPr>
-              <w:spacing w:after="0" w:line="260"/>
-            </w:pPr>
-          </w:p>
-        </w:tc>
-        <w:tc>
-          <w:tcPr>
-            <w:tcW w:type="dxa" w:w="1101"/>
-            <w:shd w:fill="F5F5F5" w:val="clear"/>
-            <w:tcMar>
-              <w:top w:type="dxa" w:w="90"/>
-              <w:left w:type="dxa" w:w="140"/>
-              <w:bottom w:type="dxa" w:w="90"/>
-              <w:right w:type="dxa" w:w="140"/>
-            </w:tcMar>
-            <w:vAlign w:val="center"/>
-          </w:tcPr>
-          <w:p>
-            <w:pPr>
-              <w:spacing w:after="0" w:line="260"/>
-            </w:pPr>
-            <w:r>
-              <w:rPr>
-                <w:rFonts w:ascii="Calibri" w:cs="Calibri" w:eastAsia="Calibri" w:hAnsi="Calibri"/>
-                <w:b/>
-                <w:bCs/>
-                <w:color w:val="1F2A37"/>
-                <w:sz w:val="18"/>
-                <w:szCs w:val="18"/>
-              </w:rPr>
-              <w:t xml:space="preserve">~52 min</w:t>
+            <w:tcW w:type="dxa" w:w="845"/>
+            <w:shd w:fill="F5F5F5" w:val="clear"/>
+            <w:tcMar>
+              <w:top w:type="dxa" w:w="90"/>
+              <w:left w:type="dxa" w:w="140"/>
+              <w:bottom w:type="dxa" w:w="90"/>
+              <w:right w:type="dxa" w:w="140"/>
+            </w:tcMar>
+            <w:vAlign w:val="center"/>
+          </w:tcPr>
+          <w:p>
+            <w:pPr>
+              <w:spacing w:after="0" w:line="260"/>
+            </w:pPr>
+            <w:r>
+              <w:rPr>
+                <w:rFonts w:ascii="Calibri" w:cs="Calibri" w:eastAsia="Calibri" w:hAnsi="Calibri"/>
+                <w:color w:val="1F2A37"/>
+                <w:sz w:val="18"/>
+                <w:szCs w:val="18"/>
+              </w:rPr>
+              <w:t xml:space="preserve">23</w:t>
+            </w:r>
+          </w:p>
+        </w:tc>
+        <w:tc>
+          <w:tcPr>
+            <w:tcW w:type="dxa" w:w="6694"/>
+            <w:shd w:fill="F5F5F5" w:val="clear"/>
+            <w:tcMar>
+              <w:top w:type="dxa" w:w="90"/>
+              <w:left w:type="dxa" w:w="140"/>
+              <w:bottom w:type="dxa" w:w="90"/>
+              <w:right w:type="dxa" w:w="140"/>
+            </w:tcMar>
+            <w:vAlign w:val="center"/>
+          </w:tcPr>
+          <w:p>
+            <w:pPr>
+              <w:spacing w:after="0" w:line="260"/>
+            </w:pPr>
+            <w:r>
+              <w:rPr>
+                <w:rFonts w:ascii="Calibri" w:cs="Calibri" w:eastAsia="Calibri" w:hAnsi="Calibri"/>
+                <w:color w:val="1F2A37"/>
+                <w:sz w:val="18"/>
+                <w:szCs w:val="18"/>
+              </w:rPr>
+              <w:t xml:space="preserve">Encerramento</w:t>
+            </w:r>
+          </w:p>
+        </w:tc>
+        <w:tc>
+          <w:tcPr>
+            <w:tcW w:type="dxa" w:w="959"/>
+            <w:shd w:fill="F5F5F5" w:val="clear"/>
+            <w:tcMar>
+              <w:top w:type="dxa" w:w="90"/>
+              <w:left w:type="dxa" w:w="140"/>
+              <w:bottom w:type="dxa" w:w="90"/>
+              <w:right w:type="dxa" w:w="140"/>
+            </w:tcMar>
+            <w:vAlign w:val="center"/>
+          </w:tcPr>
+          <w:p>
+            <w:pPr>
+              <w:spacing w:after="0" w:line="260"/>
+            </w:pPr>
+            <w:r>
+              <w:rPr>
+                <w:rFonts w:ascii="Calibri" w:cs="Calibri" w:eastAsia="Calibri" w:hAnsi="Calibri"/>
+                <w:color w:val="1F2A37"/>
+                <w:sz w:val="18"/>
+                <w:szCs w:val="18"/>
+              </w:rPr>
+              <w:t xml:space="preserve">Denise</w:t>
+            </w:r>
+          </w:p>
+        </w:tc>
+        <w:tc>
+          <w:tcPr>
+            <w:tcW w:type="dxa" w:w="852"/>
+            <w:shd w:fill="F5F5F5" w:val="clear"/>
+            <w:tcMar>
+              <w:top w:type="dxa" w:w="90"/>
+              <w:left w:type="dxa" w:w="140"/>
+              <w:bottom w:type="dxa" w:w="90"/>
+              <w:right w:type="dxa" w:w="140"/>
+            </w:tcMar>
+            <w:vAlign w:val="center"/>
+          </w:tcPr>
+          <w:p>
+            <w:pPr>
+              <w:spacing w:after="0" w:line="260"/>
+            </w:pPr>
+            <w:r>
+              <w:rPr>
+                <w:rFonts w:ascii="Calibri" w:cs="Calibri" w:eastAsia="Calibri" w:hAnsi="Calibri"/>
+                <w:color w:val="1F2A37"/>
+                <w:sz w:val="18"/>
+                <w:szCs w:val="18"/>
+              </w:rPr>
+              <w:t xml:space="preserve">1 min</w:t>
             </w:r>
           </w:p>
         </w:tc>
@@ -3287,35 +3292,125 @@
         </w:trPr>
         <w:tc>
           <w:tcPr>
-            <w:tcW w:type="dxa" w:w="864"/>
-            <w:shd w:fill="FFFFFF" w:val="clear"/>
-            <w:tcMar>
-              <w:top w:type="dxa" w:w="90"/>
-              <w:left w:type="dxa" w:w="140"/>
-              <w:bottom w:type="dxa" w:w="90"/>
-              <w:right w:type="dxa" w:w="140"/>
-            </w:tcMar>
-            <w:vAlign w:val="center"/>
-          </w:tcPr>
-          <w:p>
-            <w:pPr>
-              <w:spacing w:after="0" w:line="260"/>
-            </w:pPr>
-            <w:r>
-              <w:rPr>
-                <w:rFonts w:ascii="Calibri" w:cs="Calibri" w:eastAsia="Calibri" w:hAnsi="Calibri"/>
-                <w:color w:val="1F2A37"/>
-                <w:sz w:val="18"/>
-                <w:szCs w:val="18"/>
-              </w:rPr>
-              <w:t xml:space="preserve">—</w:t>
-            </w:r>
-          </w:p>
-        </w:tc>
-        <w:tc>
-          <w:tcPr>
-            <w:tcW w:type="dxa" w:w="6140"/>
-            <w:shd w:fill="FFFFFF" w:val="clear"/>
+            <w:tcW w:type="dxa" w:w="845"/>
+            <w:shd w:fill="FFFFFF" w:val="clear"/>
+            <w:tcMar>
+              <w:top w:type="dxa" w:w="90"/>
+              <w:left w:type="dxa" w:w="140"/>
+              <w:bottom w:type="dxa" w:w="90"/>
+              <w:right w:type="dxa" w:w="140"/>
+            </w:tcMar>
+            <w:vAlign w:val="center"/>
+          </w:tcPr>
+          <w:p>
+            <w:pPr>
+              <w:spacing w:after="0" w:line="260"/>
+            </w:pPr>
+          </w:p>
+        </w:tc>
+        <w:tc>
+          <w:tcPr>
+            <w:tcW w:type="dxa" w:w="6694"/>
+            <w:shd w:fill="FFFFFF" w:val="clear"/>
+            <w:tcMar>
+              <w:top w:type="dxa" w:w="90"/>
+              <w:left w:type="dxa" w:w="140"/>
+              <w:bottom w:type="dxa" w:w="90"/>
+              <w:right w:type="dxa" w:w="140"/>
+            </w:tcMar>
+            <w:vAlign w:val="center"/>
+          </w:tcPr>
+          <w:p>
+            <w:pPr>
+              <w:spacing w:after="0" w:line="260"/>
+            </w:pPr>
+            <w:r>
+              <w:rPr>
+                <w:rFonts w:ascii="Calibri" w:cs="Calibri" w:eastAsia="Calibri" w:hAnsi="Calibri"/>
+                <w:b/>
+                <w:bCs/>
+                <w:color w:val="1F2A37"/>
+                <w:sz w:val="18"/>
+                <w:szCs w:val="18"/>
+              </w:rPr>
+              <w:t xml:space="preserve">Total da exposição</w:t>
+            </w:r>
+          </w:p>
+        </w:tc>
+        <w:tc>
+          <w:tcPr>
+            <w:tcW w:type="dxa" w:w="959"/>
+            <w:shd w:fill="FFFFFF" w:val="clear"/>
+            <w:tcMar>
+              <w:top w:type="dxa" w:w="90"/>
+              <w:left w:type="dxa" w:w="140"/>
+              <w:bottom w:type="dxa" w:w="90"/>
+              <w:right w:type="dxa" w:w="140"/>
+            </w:tcMar>
+            <w:vAlign w:val="center"/>
+          </w:tcPr>
+          <w:p>
+            <w:pPr>
+              <w:spacing w:after="0" w:line="260"/>
+            </w:pPr>
+          </w:p>
+        </w:tc>
+        <w:tc>
+          <w:tcPr>
+            <w:tcW w:type="dxa" w:w="852"/>
+            <w:shd w:fill="FFFFFF" w:val="clear"/>
+            <w:tcMar>
+              <w:top w:type="dxa" w:w="90"/>
+              <w:left w:type="dxa" w:w="140"/>
+              <w:bottom w:type="dxa" w:w="90"/>
+              <w:right w:type="dxa" w:w="140"/>
+            </w:tcMar>
+            <w:vAlign w:val="center"/>
+          </w:tcPr>
+          <w:p>
+            <w:pPr>
+              <w:spacing w:after="0" w:line="260"/>
+            </w:pPr>
+            <w:r>
+              <w:rPr>
+                <w:rFonts w:ascii="Calibri" w:cs="Calibri" w:eastAsia="Calibri" w:hAnsi="Calibri"/>
+                <w:b/>
+                <w:bCs/>
+                <w:color w:val="1F2A37"/>
+                <w:sz w:val="18"/>
+                <w:szCs w:val="18"/>
+              </w:rPr>
+              <w:t xml:space="preserve">~50 min</w:t>
+            </w:r>
+          </w:p>
+        </w:tc>
+      </w:tr>
+      <w:tr>
+        <w:trPr>
+          <w:cantSplit/>
+        </w:trPr>
+        <w:tc>
+          <w:tcPr>
+            <w:tcW w:type="dxa" w:w="845"/>
+            <w:shd w:fill="F5F5F5" w:val="clear"/>
+            <w:tcMar>
+              <w:top w:type="dxa" w:w="90"/>
+              <w:left w:type="dxa" w:w="140"/>
+              <w:bottom w:type="dxa" w:w="90"/>
+              <w:right w:type="dxa" w:w="140"/>
+            </w:tcMar>
+            <w:vAlign w:val="center"/>
+          </w:tcPr>
+          <w:p>
+            <w:pPr>
+              <w:spacing w:after="0" w:line="260"/>
+            </w:pPr>
+          </w:p>
+        </w:tc>
+        <w:tc>
+          <w:tcPr>
+            <w:tcW w:type="dxa" w:w="6694"/>
+            <w:shd w:fill="F5F5F5" w:val="clear"/>
             <w:tcMar>
               <w:top w:type="dxa" w:w="90"/>
               <w:left w:type="dxa" w:w="140"/>
@@ -3341,8 +3436,8 @@
         </w:tc>
         <w:tc>
           <w:tcPr>
-            <w:tcW w:type="dxa" w:w="1245"/>
-            <w:shd w:fill="FFFFFF" w:val="clear"/>
+            <w:tcW w:type="dxa" w:w="959"/>
+            <w:shd w:fill="F5F5F5" w:val="clear"/>
             <w:tcMar>
               <w:top w:type="dxa" w:w="90"/>
               <w:left w:type="dxa" w:w="140"/>
@@ -3368,8 +3463,8 @@
         </w:tc>
         <w:tc>
           <w:tcPr>
-            <w:tcW w:type="dxa" w:w="1101"/>
-            <w:shd w:fill="FFFFFF" w:val="clear"/>
+            <w:tcW w:type="dxa" w:w="852"/>
+            <w:shd w:fill="F5F5F5" w:val="clear"/>
             <w:tcMar>
               <w:top w:type="dxa" w:w="90"/>
               <w:left w:type="dxa" w:w="140"/>
@@ -3390,6 +3485,416 @@
                 <w:szCs w:val="18"/>
               </w:rPr>
               <w:t xml:space="preserve">~60 min</w:t>
+            </w:r>
+          </w:p>
+        </w:tc>
+      </w:tr>
+    </w:tbl>
+    <w:p>
+      <w:pPr>
+        <w:spacing w:after="120"/>
+      </w:pPr>
+    </w:p>
+    <w:p>
+      <w:pPr>
+        <w:spacing w:after="150" w:line="300"/>
+        <w:jc w:val="both"/>
+      </w:pPr>
+      <w:r>
+        <w:rPr>
+          <w:rFonts w:ascii="Calibri" w:cs="Calibri" w:eastAsia="Calibri" w:hAnsi="Calibri"/>
+          <w:color w:val="1F2A37"/>
+          <w:sz w:val="21"/>
+          <w:szCs w:val="21"/>
+        </w:rPr>
+        <w:t xml:space="preserve">A lógica da ordem: o problema do Einstein (3 a 5), quem resolve (6 a 9), como (10 a 13), como entregamos e controlamos (14 a 19) e o resultado (20 a 22). Os títulos dos slides são afirmações: lidos em sequência, contam a proposta inteira.</w:t>
+      </w:r>
+    </w:p>
+    <w:p>
+      <w:pPr>
+        <w:pStyle w:val="Heading1"/>
+        <w:keepNext/>
+        <w:pBdr>
+          <w:bottom w:val="single" w:color="2F4162" w:sz="8" w:space="4"/>
+        </w:pBdr>
+        <w:spacing w:after="180" w:before="380"/>
+      </w:pPr>
+      <w:r>
+        <w:rPr>
+          <w:rFonts w:ascii="Calibri" w:cs="Calibri" w:eastAsia="Calibri" w:hAnsi="Calibri"/>
+          <w:b/>
+          <w:bCs/>
+          <w:color w:val="2F4162"/>
+          <w:sz w:val="26"/>
+          <w:szCs w:val="26"/>
+        </w:rPr>
+        <w:t xml:space="preserve">4. O que cada área quer ouvir</w:t>
+      </w:r>
+    </w:p>
+    <w:tbl>
+      <w:tblPr>
+        <w:tblW w:type="dxa" w:w="9350"/>
+        <w:tblBorders>
+          <w:top w:val="single" w:color="C9CDD3" w:sz="4"/>
+          <w:left w:val="single" w:color="C9CDD3" w:sz="4"/>
+          <w:bottom w:val="single" w:color="C9CDD3" w:sz="4"/>
+          <w:right w:val="single" w:color="C9CDD3" w:sz="4"/>
+          <w:insideH w:val="single" w:color="C9CDD3" w:sz="4"/>
+          <w:insideV w:val="single" w:color="C9CDD3" w:sz="4"/>
+        </w:tblBorders>
+      </w:tblPr>
+      <w:tblGrid>
+        <w:gridCol w:w="1475"/>
+        <w:gridCol w:w="4902"/>
+        <w:gridCol w:w="2973"/>
+      </w:tblGrid>
+      <w:tr>
+        <w:trPr>
+          <w:cantSplit/>
+          <w:tblHeader/>
+        </w:trPr>
+        <w:tc>
+          <w:tcPr>
+            <w:tcW w:type="dxa" w:w="1475"/>
+            <w:shd w:fill="2F4162" w:val="clear"/>
+            <w:tcMar>
+              <w:top w:type="dxa" w:w="90"/>
+              <w:left w:type="dxa" w:w="140"/>
+              <w:bottom w:type="dxa" w:w="90"/>
+              <w:right w:type="dxa" w:w="140"/>
+            </w:tcMar>
+            <w:vAlign w:val="center"/>
+          </w:tcPr>
+          <w:p>
+            <w:pPr>
+              <w:spacing w:after="0"/>
+            </w:pPr>
+            <w:r>
+              <w:rPr>
+                <w:rFonts w:ascii="Calibri" w:cs="Calibri" w:eastAsia="Calibri" w:hAnsi="Calibri"/>
+                <w:b/>
+                <w:bCs/>
+                <w:color w:val="FFFFFF"/>
+                <w:sz w:val="17"/>
+                <w:szCs w:val="17"/>
+              </w:rPr>
+              <w:t xml:space="preserve">Área (presumida)</w:t>
+            </w:r>
+          </w:p>
+        </w:tc>
+        <w:tc>
+          <w:tcPr>
+            <w:tcW w:type="dxa" w:w="4902"/>
+            <w:shd w:fill="2F4162" w:val="clear"/>
+            <w:tcMar>
+              <w:top w:type="dxa" w:w="90"/>
+              <w:left w:type="dxa" w:w="140"/>
+              <w:bottom w:type="dxa" w:w="90"/>
+              <w:right w:type="dxa" w:w="140"/>
+            </w:tcMar>
+            <w:vAlign w:val="center"/>
+          </w:tcPr>
+          <w:p>
+            <w:pPr>
+              <w:spacing w:after="0"/>
+            </w:pPr>
+            <w:r>
+              <w:rPr>
+                <w:rFonts w:ascii="Calibri" w:cs="Calibri" w:eastAsia="Calibri" w:hAnsi="Calibri"/>
+                <w:b/>
+                <w:bCs/>
+                <w:color w:val="FFFFFF"/>
+                <w:sz w:val="17"/>
+                <w:szCs w:val="17"/>
+              </w:rPr>
+              <w:t xml:space="preserve">Preocupação provável</w:t>
+            </w:r>
+          </w:p>
+        </w:tc>
+        <w:tc>
+          <w:tcPr>
+            <w:tcW w:type="dxa" w:w="2973"/>
+            <w:shd w:fill="2F4162" w:val="clear"/>
+            <w:tcMar>
+              <w:top w:type="dxa" w:w="90"/>
+              <w:left w:type="dxa" w:w="140"/>
+              <w:bottom w:type="dxa" w:w="90"/>
+              <w:right w:type="dxa" w:w="140"/>
+            </w:tcMar>
+            <w:vAlign w:val="center"/>
+          </w:tcPr>
+          <w:p>
+            <w:pPr>
+              <w:spacing w:after="0"/>
+            </w:pPr>
+            <w:r>
+              <w:rPr>
+                <w:rFonts w:ascii="Calibri" w:cs="Calibri" w:eastAsia="Calibri" w:hAnsi="Calibri"/>
+                <w:b/>
+                <w:bCs/>
+                <w:color w:val="FFFFFF"/>
+                <w:sz w:val="17"/>
+                <w:szCs w:val="17"/>
+              </w:rPr>
+              <w:t xml:space="preserve">Onde respondemos</w:t>
+            </w:r>
+          </w:p>
+        </w:tc>
+      </w:tr>
+      <w:tr>
+        <w:trPr>
+          <w:cantSplit/>
+        </w:trPr>
+        <w:tc>
+          <w:tcPr>
+            <w:tcW w:type="dxa" w:w="1475"/>
+            <w:shd w:fill="FFFFFF" w:val="clear"/>
+            <w:tcMar>
+              <w:top w:type="dxa" w:w="90"/>
+              <w:left w:type="dxa" w:w="140"/>
+              <w:bottom w:type="dxa" w:w="90"/>
+              <w:right w:type="dxa" w:w="140"/>
+            </w:tcMar>
+            <w:vAlign w:val="center"/>
+          </w:tcPr>
+          <w:p>
+            <w:pPr>
+              <w:spacing w:after="0" w:line="260"/>
+            </w:pPr>
+            <w:r>
+              <w:rPr>
+                <w:rFonts w:ascii="Calibri" w:cs="Calibri" w:eastAsia="Calibri" w:hAnsi="Calibri"/>
+                <w:color w:val="1F2A37"/>
+                <w:sz w:val="18"/>
+                <w:szCs w:val="18"/>
+              </w:rPr>
+              <w:t xml:space="preserve">Compras</w:t>
+            </w:r>
+          </w:p>
+        </w:tc>
+        <w:tc>
+          <w:tcPr>
+            <w:tcW w:type="dxa" w:w="4902"/>
+            <w:shd w:fill="FFFFFF" w:val="clear"/>
+            <w:tcMar>
+              <w:top w:type="dxa" w:w="90"/>
+              <w:left w:type="dxa" w:w="140"/>
+              <w:bottom w:type="dxa" w:w="90"/>
+              <w:right w:type="dxa" w:w="140"/>
+            </w:tcMar>
+            <w:vAlign w:val="center"/>
+          </w:tcPr>
+          <w:p>
+            <w:pPr>
+              <w:spacing w:after="0" w:line="260"/>
+            </w:pPr>
+            <w:r>
+              <w:rPr>
+                <w:rFonts w:ascii="Calibri" w:cs="Calibri" w:eastAsia="Calibri" w:hAnsi="Calibri"/>
+                <w:color w:val="1F2A37"/>
+                <w:sz w:val="18"/>
+                <w:szCs w:val="18"/>
+              </w:rPr>
+              <w:t xml:space="preserve">Equalização entre proponentes; premissas claras; nada fora da mensalidade; aceite integral da minuta e dos entregáveis</w:t>
+            </w:r>
+          </w:p>
+        </w:tc>
+        <w:tc>
+          <w:tcPr>
+            <w:tcW w:type="dxa" w:w="2973"/>
+            <w:shd w:fill="FFFFFF" w:val="clear"/>
+            <w:tcMar>
+              <w:top w:type="dxa" w:w="90"/>
+              <w:left w:type="dxa" w:w="140"/>
+              <w:bottom w:type="dxa" w:w="90"/>
+              <w:right w:type="dxa" w:w="140"/>
+            </w:tcMar>
+            <w:vAlign w:val="center"/>
+          </w:tcPr>
+          <w:p>
+            <w:pPr>
+              <w:spacing w:after="0" w:line="260"/>
+            </w:pPr>
+            <w:r>
+              <w:rPr>
+                <w:rFonts w:ascii="Calibri" w:cs="Calibri" w:eastAsia="Calibri" w:hAnsi="Calibri"/>
+                <w:color w:val="1F2A37"/>
+                <w:sz w:val="18"/>
+                <w:szCs w:val="18"/>
+              </w:rPr>
+              <w:t xml:space="preserve">Slides 12, 14 e 20; carta de aceite já enviada</w:t>
+            </w:r>
+          </w:p>
+        </w:tc>
+      </w:tr>
+      <w:tr>
+        <w:trPr>
+          <w:cantSplit/>
+        </w:trPr>
+        <w:tc>
+          <w:tcPr>
+            <w:tcW w:type="dxa" w:w="1475"/>
+            <w:shd w:fill="F5F5F5" w:val="clear"/>
+            <w:tcMar>
+              <w:top w:type="dxa" w:w="90"/>
+              <w:left w:type="dxa" w:w="140"/>
+              <w:bottom w:type="dxa" w:w="90"/>
+              <w:right w:type="dxa" w:w="140"/>
+            </w:tcMar>
+            <w:vAlign w:val="center"/>
+          </w:tcPr>
+          <w:p>
+            <w:pPr>
+              <w:spacing w:after="0" w:line="260"/>
+            </w:pPr>
+            <w:r>
+              <w:rPr>
+                <w:rFonts w:ascii="Calibri" w:cs="Calibri" w:eastAsia="Calibri" w:hAnsi="Calibri"/>
+                <w:color w:val="1F2A37"/>
+                <w:sz w:val="18"/>
+                <w:szCs w:val="18"/>
+              </w:rPr>
+              <w:t xml:space="preserve">Facilities</w:t>
+            </w:r>
+          </w:p>
+        </w:tc>
+        <w:tc>
+          <w:tcPr>
+            <w:tcW w:type="dxa" w:w="4902"/>
+            <w:shd w:fill="F5F5F5" w:val="clear"/>
+            <w:tcMar>
+              <w:top w:type="dxa" w:w="90"/>
+              <w:left w:type="dxa" w:w="140"/>
+              <w:bottom w:type="dxa" w:w="90"/>
+              <w:right w:type="dxa" w:w="140"/>
+            </w:tcMar>
+            <w:vAlign w:val="center"/>
+          </w:tcPr>
+          <w:p>
+            <w:pPr>
+              <w:spacing w:after="0" w:line="260"/>
+            </w:pPr>
+            <w:r>
+              <w:rPr>
+                <w:rFonts w:ascii="Calibri" w:cs="Calibri" w:eastAsia="Calibri" w:hAnsi="Calibri"/>
+                <w:color w:val="1F2A37"/>
+                <w:sz w:val="18"/>
+                <w:szCs w:val="18"/>
+              </w:rPr>
+              <w:t xml:space="preserve">Resposta a crise 24x7; sistemas críticos; interface com a administradora; implantação de Pinheiros</w:t>
+            </w:r>
+          </w:p>
+        </w:tc>
+        <w:tc>
+          <w:tcPr>
+            <w:tcW w:type="dxa" w:w="2973"/>
+            <w:shd w:fill="F5F5F5" w:val="clear"/>
+            <w:tcMar>
+              <w:top w:type="dxa" w:w="90"/>
+              <w:left w:type="dxa" w:w="140"/>
+              <w:bottom w:type="dxa" w:w="90"/>
+              <w:right w:type="dxa" w:w="140"/>
+            </w:tcMar>
+            <w:vAlign w:val="center"/>
+          </w:tcPr>
+          <w:p>
+            <w:pPr>
+              <w:spacing w:after="0" w:line="260"/>
+            </w:pPr>
+            <w:r>
+              <w:rPr>
+                <w:rFonts w:ascii="Calibri" w:cs="Calibri" w:eastAsia="Calibri" w:hAnsi="Calibri"/>
+                <w:color w:val="1F2A37"/>
+                <w:sz w:val="18"/>
+                <w:szCs w:val="18"/>
+              </w:rPr>
+              <w:t xml:space="preserve">Slides 3, 10, 12, 15, 16, 18 e 19</w:t>
+            </w:r>
+          </w:p>
+        </w:tc>
+      </w:tr>
+      <w:tr>
+        <w:trPr>
+          <w:cantSplit/>
+        </w:trPr>
+        <w:tc>
+          <w:tcPr>
+            <w:tcW w:type="dxa" w:w="1475"/>
+            <w:shd w:fill="FFFFFF" w:val="clear"/>
+            <w:tcMar>
+              <w:top w:type="dxa" w:w="90"/>
+              <w:left w:type="dxa" w:w="140"/>
+              <w:bottom w:type="dxa" w:w="90"/>
+              <w:right w:type="dxa" w:w="140"/>
+            </w:tcMar>
+            <w:vAlign w:val="center"/>
+          </w:tcPr>
+          <w:p>
+            <w:pPr>
+              <w:spacing w:after="0" w:line="260"/>
+            </w:pPr>
+            <w:r>
+              <w:rPr>
+                <w:rFonts w:ascii="Calibri" w:cs="Calibri" w:eastAsia="Calibri" w:hAnsi="Calibri"/>
+                <w:color w:val="1F2A37"/>
+                <w:sz w:val="18"/>
+                <w:szCs w:val="18"/>
+              </w:rPr>
+              <w:t xml:space="preserve">Operações</w:t>
+            </w:r>
+          </w:p>
+        </w:tc>
+        <w:tc>
+          <w:tcPr>
+            <w:tcW w:type="dxa" w:w="4902"/>
+            <w:shd w:fill="FFFFFF" w:val="clear"/>
+            <w:tcMar>
+              <w:top w:type="dxa" w:w="90"/>
+              <w:left w:type="dxa" w:w="140"/>
+              <w:bottom w:type="dxa" w:w="90"/>
+              <w:right w:type="dxa" w:w="140"/>
+            </w:tcMar>
+            <w:vAlign w:val="center"/>
+          </w:tcPr>
+          <w:p>
+            <w:pPr>
+              <w:spacing w:after="0" w:line="260"/>
+            </w:pPr>
+            <w:r>
+              <w:rPr>
+                <w:rFonts w:ascii="Calibri" w:cs="Calibri" w:eastAsia="Calibri" w:hAnsi="Calibri"/>
+                <w:color w:val="1F2A37"/>
+                <w:sz w:val="18"/>
+                <w:szCs w:val="18"/>
+              </w:rPr>
+              <w:t xml:space="preserve">Rotina com as unidades; quem faz o quê; assembleias; relatórios</w:t>
+            </w:r>
+          </w:p>
+        </w:tc>
+        <w:tc>
+          <w:tcPr>
+            <w:tcW w:type="dxa" w:w="2973"/>
+            <w:shd w:fill="FFFFFF" w:val="clear"/>
+            <w:tcMar>
+              <w:top w:type="dxa" w:w="90"/>
+              <w:left w:type="dxa" w:w="140"/>
+              <w:bottom w:type="dxa" w:w="90"/>
+              <w:right w:type="dxa" w:w="140"/>
+            </w:tcMar>
+            <w:vAlign w:val="center"/>
+          </w:tcPr>
+          <w:p>
+            <w:pPr>
+              <w:spacing w:after="0" w:line="260"/>
+            </w:pPr>
+            <w:r>
+              <w:rPr>
+                <w:rFonts w:ascii="Calibri" w:cs="Calibri" w:eastAsia="Calibri" w:hAnsi="Calibri"/>
+                <w:color w:val="1F2A37"/>
+                <w:sz w:val="18"/>
+                <w:szCs w:val="18"/>
+              </w:rPr>
+              <w:t xml:space="preserve">Slides 4, 11, 13, 14 e 17</w:t>
             </w:r>
           </w:p>
         </w:tc>
@@ -3418,401 +3923,6 @@
           <w:sz w:val="26"/>
           <w:szCs w:val="26"/>
         </w:rPr>
-        <w:t xml:space="preserve">4. O que cada área quer ouvir</w:t>
-      </w:r>
-    </w:p>
-    <w:tbl>
-      <w:tblPr>
-        <w:tblW w:type="dxa" w:w="9350"/>
-        <w:tblBorders>
-          <w:top w:val="single" w:color="C9CDD3" w:sz="4"/>
-          <w:left w:val="single" w:color="C9CDD3" w:sz="4"/>
-          <w:bottom w:val="single" w:color="C9CDD3" w:sz="4"/>
-          <w:right w:val="single" w:color="C9CDD3" w:sz="4"/>
-          <w:insideH w:val="single" w:color="C9CDD3" w:sz="4"/>
-          <w:insideV w:val="single" w:color="C9CDD3" w:sz="4"/>
-        </w:tblBorders>
-      </w:tblPr>
-      <w:tblGrid>
-        <w:gridCol w:w="1475"/>
-        <w:gridCol w:w="4909"/>
-        <w:gridCol w:w="2966"/>
-      </w:tblGrid>
-      <w:tr>
-        <w:trPr>
-          <w:cantSplit/>
-          <w:tblHeader/>
-        </w:trPr>
-        <w:tc>
-          <w:tcPr>
-            <w:tcW w:type="dxa" w:w="1475"/>
-            <w:shd w:fill="2F4162" w:val="clear"/>
-            <w:tcMar>
-              <w:top w:type="dxa" w:w="90"/>
-              <w:left w:type="dxa" w:w="140"/>
-              <w:bottom w:type="dxa" w:w="90"/>
-              <w:right w:type="dxa" w:w="140"/>
-            </w:tcMar>
-            <w:vAlign w:val="center"/>
-          </w:tcPr>
-          <w:p>
-            <w:pPr>
-              <w:spacing w:after="0"/>
-            </w:pPr>
-            <w:r>
-              <w:rPr>
-                <w:rFonts w:ascii="Calibri" w:cs="Calibri" w:eastAsia="Calibri" w:hAnsi="Calibri"/>
-                <w:b/>
-                <w:bCs/>
-                <w:color w:val="FFFFFF"/>
-                <w:sz w:val="17"/>
-                <w:szCs w:val="17"/>
-              </w:rPr>
-              <w:t xml:space="preserve">Área (presumida)</w:t>
-            </w:r>
-          </w:p>
-        </w:tc>
-        <w:tc>
-          <w:tcPr>
-            <w:tcW w:type="dxa" w:w="4909"/>
-            <w:shd w:fill="2F4162" w:val="clear"/>
-            <w:tcMar>
-              <w:top w:type="dxa" w:w="90"/>
-              <w:left w:type="dxa" w:w="140"/>
-              <w:bottom w:type="dxa" w:w="90"/>
-              <w:right w:type="dxa" w:w="140"/>
-            </w:tcMar>
-            <w:vAlign w:val="center"/>
-          </w:tcPr>
-          <w:p>
-            <w:pPr>
-              <w:spacing w:after="0"/>
-            </w:pPr>
-            <w:r>
-              <w:rPr>
-                <w:rFonts w:ascii="Calibri" w:cs="Calibri" w:eastAsia="Calibri" w:hAnsi="Calibri"/>
-                <w:b/>
-                <w:bCs/>
-                <w:color w:val="FFFFFF"/>
-                <w:sz w:val="17"/>
-                <w:szCs w:val="17"/>
-              </w:rPr>
-              <w:t xml:space="preserve">Preocupação provável</w:t>
-            </w:r>
-          </w:p>
-        </w:tc>
-        <w:tc>
-          <w:tcPr>
-            <w:tcW w:type="dxa" w:w="2966"/>
-            <w:shd w:fill="2F4162" w:val="clear"/>
-            <w:tcMar>
-              <w:top w:type="dxa" w:w="90"/>
-              <w:left w:type="dxa" w:w="140"/>
-              <w:bottom w:type="dxa" w:w="90"/>
-              <w:right w:type="dxa" w:w="140"/>
-            </w:tcMar>
-            <w:vAlign w:val="center"/>
-          </w:tcPr>
-          <w:p>
-            <w:pPr>
-              <w:spacing w:after="0"/>
-            </w:pPr>
-            <w:r>
-              <w:rPr>
-                <w:rFonts w:ascii="Calibri" w:cs="Calibri" w:eastAsia="Calibri" w:hAnsi="Calibri"/>
-                <w:b/>
-                <w:bCs/>
-                <w:color w:val="FFFFFF"/>
-                <w:sz w:val="17"/>
-                <w:szCs w:val="17"/>
-              </w:rPr>
-              <w:t xml:space="preserve">Onde respondemos</w:t>
-            </w:r>
-          </w:p>
-        </w:tc>
-      </w:tr>
-      <w:tr>
-        <w:trPr>
-          <w:cantSplit/>
-        </w:trPr>
-        <w:tc>
-          <w:tcPr>
-            <w:tcW w:type="dxa" w:w="1475"/>
-            <w:shd w:fill="FFFFFF" w:val="clear"/>
-            <w:tcMar>
-              <w:top w:type="dxa" w:w="90"/>
-              <w:left w:type="dxa" w:w="140"/>
-              <w:bottom w:type="dxa" w:w="90"/>
-              <w:right w:type="dxa" w:w="140"/>
-            </w:tcMar>
-            <w:vAlign w:val="center"/>
-          </w:tcPr>
-          <w:p>
-            <w:pPr>
-              <w:spacing w:after="0" w:line="260"/>
-            </w:pPr>
-            <w:r>
-              <w:rPr>
-                <w:rFonts w:ascii="Calibri" w:cs="Calibri" w:eastAsia="Calibri" w:hAnsi="Calibri"/>
-                <w:color w:val="1F2A37"/>
-                <w:sz w:val="18"/>
-                <w:szCs w:val="18"/>
-              </w:rPr>
-              <w:t xml:space="preserve">Compras</w:t>
-            </w:r>
-          </w:p>
-        </w:tc>
-        <w:tc>
-          <w:tcPr>
-            <w:tcW w:type="dxa" w:w="4909"/>
-            <w:shd w:fill="FFFFFF" w:val="clear"/>
-            <w:tcMar>
-              <w:top w:type="dxa" w:w="90"/>
-              <w:left w:type="dxa" w:w="140"/>
-              <w:bottom w:type="dxa" w:w="90"/>
-              <w:right w:type="dxa" w:w="140"/>
-            </w:tcMar>
-            <w:vAlign w:val="center"/>
-          </w:tcPr>
-          <w:p>
-            <w:pPr>
-              <w:spacing w:after="0" w:line="260"/>
-            </w:pPr>
-            <w:r>
-              <w:rPr>
-                <w:rFonts w:ascii="Calibri" w:cs="Calibri" w:eastAsia="Calibri" w:hAnsi="Calibri"/>
-                <w:color w:val="1F2A37"/>
-                <w:sz w:val="18"/>
-                <w:szCs w:val="18"/>
-              </w:rPr>
-              <w:t xml:space="preserve">Equalização entre proponentes; premissas claras; nada fora da mensalidade; aceite integral da minuta e dos entregáveis</w:t>
-            </w:r>
-          </w:p>
-        </w:tc>
-        <w:tc>
-          <w:tcPr>
-            <w:tcW w:type="dxa" w:w="2966"/>
-            <w:shd w:fill="FFFFFF" w:val="clear"/>
-            <w:tcMar>
-              <w:top w:type="dxa" w:w="90"/>
-              <w:left w:type="dxa" w:w="140"/>
-              <w:bottom w:type="dxa" w:w="90"/>
-              <w:right w:type="dxa" w:w="140"/>
-            </w:tcMar>
-            <w:vAlign w:val="center"/>
-          </w:tcPr>
-          <w:p>
-            <w:pPr>
-              <w:spacing w:after="0" w:line="260"/>
-            </w:pPr>
-            <w:r>
-              <w:rPr>
-                <w:rFonts w:ascii="Calibri" w:cs="Calibri" w:eastAsia="Calibri" w:hAnsi="Calibri"/>
-                <w:color w:val="1F2A37"/>
-                <w:sz w:val="18"/>
-                <w:szCs w:val="18"/>
-              </w:rPr>
-              <w:t xml:space="preserve">Slides 11, 13 e 19; carta de aceite já enviada</w:t>
-            </w:r>
-          </w:p>
-        </w:tc>
-      </w:tr>
-      <w:tr>
-        <w:trPr>
-          <w:cantSplit/>
-        </w:trPr>
-        <w:tc>
-          <w:tcPr>
-            <w:tcW w:type="dxa" w:w="1475"/>
-            <w:shd w:fill="F5F5F5" w:val="clear"/>
-            <w:tcMar>
-              <w:top w:type="dxa" w:w="90"/>
-              <w:left w:type="dxa" w:w="140"/>
-              <w:bottom w:type="dxa" w:w="90"/>
-              <w:right w:type="dxa" w:w="140"/>
-            </w:tcMar>
-            <w:vAlign w:val="center"/>
-          </w:tcPr>
-          <w:p>
-            <w:pPr>
-              <w:spacing w:after="0" w:line="260"/>
-            </w:pPr>
-            <w:r>
-              <w:rPr>
-                <w:rFonts w:ascii="Calibri" w:cs="Calibri" w:eastAsia="Calibri" w:hAnsi="Calibri"/>
-                <w:color w:val="1F2A37"/>
-                <w:sz w:val="18"/>
-                <w:szCs w:val="18"/>
-              </w:rPr>
-              <w:t xml:space="preserve">Facilities</w:t>
-            </w:r>
-          </w:p>
-        </w:tc>
-        <w:tc>
-          <w:tcPr>
-            <w:tcW w:type="dxa" w:w="4909"/>
-            <w:shd w:fill="F5F5F5" w:val="clear"/>
-            <w:tcMar>
-              <w:top w:type="dxa" w:w="90"/>
-              <w:left w:type="dxa" w:w="140"/>
-              <w:bottom w:type="dxa" w:w="90"/>
-              <w:right w:type="dxa" w:w="140"/>
-            </w:tcMar>
-            <w:vAlign w:val="center"/>
-          </w:tcPr>
-          <w:p>
-            <w:pPr>
-              <w:spacing w:after="0" w:line="260"/>
-            </w:pPr>
-            <w:r>
-              <w:rPr>
-                <w:rFonts w:ascii="Calibri" w:cs="Calibri" w:eastAsia="Calibri" w:hAnsi="Calibri"/>
-                <w:color w:val="1F2A37"/>
-                <w:sz w:val="18"/>
-                <w:szCs w:val="18"/>
-              </w:rPr>
-              <w:t xml:space="preserve">Resposta a crise 24x7; sistemas críticos; interface com a administradora; implantação de Pinheiros</w:t>
-            </w:r>
-          </w:p>
-        </w:tc>
-        <w:tc>
-          <w:tcPr>
-            <w:tcW w:type="dxa" w:w="2966"/>
-            <w:shd w:fill="F5F5F5" w:val="clear"/>
-            <w:tcMar>
-              <w:top w:type="dxa" w:w="90"/>
-              <w:left w:type="dxa" w:w="140"/>
-              <w:bottom w:type="dxa" w:w="90"/>
-              <w:right w:type="dxa" w:w="140"/>
-            </w:tcMar>
-            <w:vAlign w:val="center"/>
-          </w:tcPr>
-          <w:p>
-            <w:pPr>
-              <w:spacing w:after="0" w:line="260"/>
-            </w:pPr>
-            <w:r>
-              <w:rPr>
-                <w:rFonts w:ascii="Calibri" w:cs="Calibri" w:eastAsia="Calibri" w:hAnsi="Calibri"/>
-                <w:color w:val="1F2A37"/>
-                <w:sz w:val="18"/>
-                <w:szCs w:val="18"/>
-              </w:rPr>
-              <w:t xml:space="preserve">Slides 3, 9, 11, 14, 15, 16 e 17</w:t>
-            </w:r>
-          </w:p>
-        </w:tc>
-      </w:tr>
-      <w:tr>
-        <w:trPr>
-          <w:cantSplit/>
-        </w:trPr>
-        <w:tc>
-          <w:tcPr>
-            <w:tcW w:type="dxa" w:w="1475"/>
-            <w:shd w:fill="FFFFFF" w:val="clear"/>
-            <w:tcMar>
-              <w:top w:type="dxa" w:w="90"/>
-              <w:left w:type="dxa" w:w="140"/>
-              <w:bottom w:type="dxa" w:w="90"/>
-              <w:right w:type="dxa" w:w="140"/>
-            </w:tcMar>
-            <w:vAlign w:val="center"/>
-          </w:tcPr>
-          <w:p>
-            <w:pPr>
-              <w:spacing w:after="0" w:line="260"/>
-            </w:pPr>
-            <w:r>
-              <w:rPr>
-                <w:rFonts w:ascii="Calibri" w:cs="Calibri" w:eastAsia="Calibri" w:hAnsi="Calibri"/>
-                <w:color w:val="1F2A37"/>
-                <w:sz w:val="18"/>
-                <w:szCs w:val="18"/>
-              </w:rPr>
-              <w:t xml:space="preserve">Operações</w:t>
-            </w:r>
-          </w:p>
-        </w:tc>
-        <w:tc>
-          <w:tcPr>
-            <w:tcW w:type="dxa" w:w="4909"/>
-            <w:shd w:fill="FFFFFF" w:val="clear"/>
-            <w:tcMar>
-              <w:top w:type="dxa" w:w="90"/>
-              <w:left w:type="dxa" w:w="140"/>
-              <w:bottom w:type="dxa" w:w="90"/>
-              <w:right w:type="dxa" w:w="140"/>
-            </w:tcMar>
-            <w:vAlign w:val="center"/>
-          </w:tcPr>
-          <w:p>
-            <w:pPr>
-              <w:spacing w:after="0" w:line="260"/>
-            </w:pPr>
-            <w:r>
-              <w:rPr>
-                <w:rFonts w:ascii="Calibri" w:cs="Calibri" w:eastAsia="Calibri" w:hAnsi="Calibri"/>
-                <w:color w:val="1F2A37"/>
-                <w:sz w:val="18"/>
-                <w:szCs w:val="18"/>
-              </w:rPr>
-              <w:t xml:space="preserve">Rotina com as unidades; quem faz o quê; assembleias; relatórios</w:t>
-            </w:r>
-          </w:p>
-        </w:tc>
-        <w:tc>
-          <w:tcPr>
-            <w:tcW w:type="dxa" w:w="2966"/>
-            <w:shd w:fill="FFFFFF" w:val="clear"/>
-            <w:tcMar>
-              <w:top w:type="dxa" w:w="90"/>
-              <w:left w:type="dxa" w:w="140"/>
-              <w:bottom w:type="dxa" w:w="90"/>
-              <w:right w:type="dxa" w:w="140"/>
-            </w:tcMar>
-            <w:vAlign w:val="center"/>
-          </w:tcPr>
-          <w:p>
-            <w:pPr>
-              <w:spacing w:after="0" w:line="260"/>
-            </w:pPr>
-            <w:r>
-              <w:rPr>
-                <w:rFonts w:ascii="Calibri" w:cs="Calibri" w:eastAsia="Calibri" w:hAnsi="Calibri"/>
-                <w:color w:val="1F2A37"/>
-                <w:sz w:val="18"/>
-                <w:szCs w:val="18"/>
-              </w:rPr>
-              <w:t xml:space="preserve">Slides 4, 10, 12, 13 e 18</w:t>
-            </w:r>
-          </w:p>
-        </w:tc>
-      </w:tr>
-    </w:tbl>
-    <w:p>
-      <w:pPr>
-        <w:spacing w:after="120"/>
-      </w:pPr>
-    </w:p>
-    <w:p>
-      <w:pPr>
-        <w:pStyle w:val="Heading1"/>
-        <w:keepNext/>
-        <w:pBdr>
-          <w:bottom w:val="single" w:color="2F4162" w:sz="8" w:space="4"/>
-        </w:pBdr>
-        <w:spacing w:after="180" w:before="380"/>
-      </w:pPr>
-      <w:r>
-        <w:rPr>
-          <w:rFonts w:ascii="Calibri" w:cs="Calibri" w:eastAsia="Calibri" w:hAnsi="Calibri"/>
-          <w:b/>
-          <w:bCs/>
-          <w:color w:val="2F4162"/>
-          <w:sz w:val="26"/>
-          <w:szCs w:val="26"/>
-        </w:rPr>
         <w:t xml:space="preserve">5. Pontos de atenção</w:t>
       </w:r>
     </w:p>
@@ -3964,7 +4074,7 @@
           <w:sz w:val="20"/>
           <w:szCs w:val="20"/>
         </w:rPr>
-        <w:t xml:space="preserve">Slide 20 compara modelos, não empresas.</w:t>
+        <w:t xml:space="preserve">O slide 5 compara modelos de atuação.</w:t>
       </w:r>
       <w:r>
         <w:rPr>
@@ -3973,7 +4083,7 @@
           <w:sz w:val="20"/>
           <w:szCs w:val="20"/>
         </w:rPr>
-        <w:t xml:space="preserve"> Tom de explicação, nunca de ataque — não citar nenhum participante da concorrência.</w:t>
+        <w:t xml:space="preserve"> Tom de explicação. Não citar nenhum participante da concorrência.</w:t>
       </w:r>
     </w:p>
     <w:p>
@@ -4037,7 +4147,7 @@
           <w:sz w:val="20"/>
           <w:szCs w:val="20"/>
         </w:rPr>
-        <w:t xml:space="preserve"> (confirmado). As propostas técnicas de 01/10 grafaram "Murilo" — se surgir, corrigir verbalmente; o relatório executivo já está certo.</w:t>
+        <w:t xml:space="preserve"> (confirmado). As propostas técnicas de 01/10 grafaram "Murilo". Se surgir, corrigir verbalmente; o relatório executivo já está certo.</w:t>
       </w:r>
     </w:p>
     <w:p>
@@ -4101,7 +4211,7 @@
           <w:sz w:val="20"/>
           <w:szCs w:val="20"/>
         </w:rPr>
-        <w:t xml:space="preserve"> pode ser citado — a locação é pública.</w:t>
+        <w:t xml:space="preserve"> pode ser citado, porque a locação é pública.</w:t>
       </w:r>
     </w:p>
     <w:p>
@@ -4124,7 +4234,7 @@
           <w:sz w:val="20"/>
           <w:szCs w:val="20"/>
         </w:rPr>
-        <w:t xml:space="preserve">Slides 16–18 (controles DF):</w:t>
+        <w:t xml:space="preserve">Slides 15 a 17 (controles DF):</w:t>
       </w:r>
       <w:r>
         <w:rPr>
@@ -4133,7 +4243,7 @@
           <w:sz w:val="20"/>
           <w:szCs w:val="20"/>
         </w:rPr>
-        <w:t xml:space="preserve"> não afirmar há quanto tempo estão em uso nem em quantos condomínios; não citar clientes nem prédios dos relatórios técnicos — o slide diz que é por sigilo. Se pedirem para ver, oferecer uma versão anonimizada após a contratação.</w:t>
+        <w:t xml:space="preserve"> não afirmar há quanto tempo estão em uso nem em quantos condomínios. Não citar clientes nem prédios dos relatórios técnicos: o slide diz que é por sigilo. Se pedirem para ver, oferecer uma versão anonimizada após a contratação.</w:t>
       </w:r>
     </w:p>
     <w:p>
@@ -4412,7 +4522,7 @@
                 <w:sz w:val="18"/>
                 <w:szCs w:val="18"/>
               </w:rPr>
-              <w:t xml:space="preserve">A administradora executa (operação, financeiro, equipes). A DF representa o Einstein e fiscaliza quem executa. Se a mesma empresa fizer as duas coisas, ninguém fiscaliza a administradora.</w:t>
+              <w:t xml:space="preserve">A administradora executa (operação, financeiro, equipes). A DF representa o Einstein e fiscaliza quem executa. Se a mesma empresa fizer as duas coisas, ninguém fiscaliza a administradora (slide 5).</w:t>
             </w:r>
           </w:p>
         </w:tc>
@@ -4670,7 +4780,7 @@
                 <w:sz w:val="18"/>
                 <w:szCs w:val="18"/>
               </w:rPr>
-              <w:t xml:space="preserve">Plantão telefônico: Denise → Amanda → Caio → prepostos. Resposta em até 30 min, plano de ação em até 4 h, presença em até 6 h.</w:t>
+              <w:t xml:space="preserve">Plantão telefônico: Denise, Amanda, Caio e prepostos, nessa ordem. Resposta em até 30 min, plano de ação em até 4 h, presença em até 6 h.</w:t>
             </w:r>
           </w:p>
         </w:tc>
@@ -4756,7 +4866,7 @@
                 <w:sz w:val="18"/>
                 <w:szCs w:val="18"/>
               </w:rPr>
-              <w:t xml:space="preserve">Dois substitutos qualificados e todo o histórico no repositório corporativo (OneDrive) — a substituição é imediata, sem perda de informação.</w:t>
+              <w:t xml:space="preserve">Dois substitutos qualificados e todo o histórico no repositório corporativo (OneDrive). A substituição é imediata, sem perda de informação.</w:t>
             </w:r>
           </w:p>
         </w:tc>
@@ -4928,7 +5038,7 @@
                 <w:sz w:val="18"/>
                 <w:szCs w:val="18"/>
               </w:rPr>
-              <w:t xml:space="preserve">Não — é papel da administradora. A DF revisa, valida e cobra correções.</w:t>
+              <w:t xml:space="preserve">Não. É papel da administradora; a DF revisa, valida e cobra correções.</w:t>
             </w:r>
           </w:p>
         </w:tc>
@@ -5014,7 +5124,7 @@
                 <w:sz w:val="18"/>
                 <w:szCs w:val="18"/>
               </w:rPr>
-              <w:t xml:space="preserve">Só laudos e perícias de terceiros, escritórios externos e contencioso, auditoria independente, custas cartoriais e viagens fora da Grande SP — sempre com autorização prévia e orçamento à parte.</w:t>
+              <w:t xml:space="preserve">Só laudos e perícias de terceiros, escritórios externos e contencioso, auditoria independente, custas cartoriais e viagens fora da Grande SP. Sempre com autorização prévia e orçamento à parte.</w:t>
             </w:r>
           </w:p>
         </w:tc>
@@ -5186,7 +5296,7 @@
                 <w:sz w:val="18"/>
                 <w:szCs w:val="18"/>
               </w:rPr>
-              <w:t xml:space="preserve">Hoje, no O Parque, gerimos a implantação de um complexo multiuso com a torre do Hospital Sírio-Libanês — com os sistemas críticos que a operação hospitalar exige.</w:t>
+              <w:t xml:space="preserve">Hoje, no O Parque, gerimos a implantação de um complexo multiuso com a torre do Hospital Sírio-Libanês e os sistemas críticos que a operação hospitalar exige (slide 9).</w:t>
             </w:r>
           </w:p>
         </w:tc>
@@ -5272,7 +5382,7 @@
                 <w:sz w:val="18"/>
                 <w:szCs w:val="18"/>
               </w:rPr>
-              <w:t xml:space="preserve">Nenhum vínculo com condomínios, administradoras, proprietários ou gestores das unidades — declaração assinada já entregue. Fornecedores serão verificados na mobilização.</w:t>
+              <w:t xml:space="preserve">Nenhum vínculo com condomínios, administradoras, proprietários ou gestores das unidades. A declaração assinada já foi entregue. Fornecedores serão verificados na mobilização.</w:t>
             </w:r>
           </w:p>
         </w:tc>
@@ -6124,7 +6234,7 @@
         <w:sz w:val="15"/>
         <w:szCs w:val="15"/>
       </w:rPr>
-      <w:t xml:space="preserve">  ·  Dossiê interno — uso exclusivo DF  —  Confidencial  ·  www.dfsindicos.com.br</w:t>
+      <w:t xml:space="preserve">  ·  Dossiê interno · uso exclusivo DF  —  Confidencial  ·  www.dfsindicos.com.br</w:t>
     </w:r>
     <w:r>
       <w:rPr>

</xml_diff>